<commit_message>
v39: final review of the thesis manuscript
- Tables 8, A1 and A2 list breadth before filing year, as in Table 9
- Section 6.3 notes that CPC revisions and reclassification can affect time trends
- Full review: abstracts, intro, theory, data, results, discussion and conclusion
  (logic, structure, terminology, spacing); appendix text matches the main text
- Reference list sorts ignoring diacritics; Applied Materials and Song et al. entries tidied

Co-Authored-By: Claude Opus 5.5 <noreply@anthropic.com>
Claude-Session: https://claude.ai/code/session_01SvckvZxt3hAXTDPnm8YPEC
</commit_message>
<xml_diff>
--- a/journal/manuscript_v39_ko.docx
+++ b/journal/manuscript_v39_ko.docx
@@ -70,7 +70,7 @@
         <w:pStyle w:val="FirstParagraph"/>
       </w:pPr>
       <w:r>
-        <w:t xml:space="preserve">웨이퍼 위에 소자를 만드는 전공정과 그 웨이퍼를 잘라 조립하는 후공정은 반도체 제조에서 오래 분리되어 온 두 영역이었다. 그러나 최근 주목받는 하이브리드 본딩은 후공정에 속하는 접합 기술임에도, 표면 평탄화와 표면 처리 같은 전공정의 제조공정 기술이 뒷받침되어야 요구 성능을 확보할 수 있다. 이 논문은 두 공정의 기술이 실제로 한 특허 안에 함께 담기는지, 그리고 그 융합이 시간이 지나면서 어떤 양태로 전개되었는지를 유럽특허청 PATSTAT의 하이브리드 본딩 관련 특허출원 928건으로 살핀다. 출원마다 부여된 CPC 기호에 접합·인터커넥트 분류(H01L24)만 있으면 접합 단독형, 제조공정 기술 분류(H01L21)만 있으면 공정 단독형, 둘이 함께 있으면 통합형으로 나누었고, 두 클래스의 공동분류를 공정 간 융합의 대리측정치로 썼다. 통합형은 전체의 45.8%로 가장 많았고, 패키징 단계 공정을 제조공정에서 제외한 좁은 정의에서도 37.2%였다.</w:t>
+        <w:t xml:space="preserve">웨이퍼 위에 소자를 만드는 전공정과 그 웨이퍼를 잘라 조립하는 후공정은 반도체 제조에서 오래 분리되어 온 두 영역이었다. 그러나 최근 주목받는 하이브리드 본딩은 후공정에 속하는 접합 기술임에도, 표면 평탄화와 표면 처리 같은 전공정의 제조공정 기술이 뒷받침되어야 요구 성능을 확보할 수 있다. 본 연구는 두 공정의 기술이 실제로 한 특허 안에 함께 담기는지, 그리고 그 융합이 시간이 지나면서 어떤 양태로 전개되었는지를 유럽특허청 PATSTAT의 하이브리드 본딩 관련 특허출원 928건으로 살핀다. 출원마다 부여된 CPC 기호에 접합·인터커넥트 분류(H01L24)만 있으면 접합 단독형, 제조공정 기술 분류(H01L21)만 있으면 공정 단독형, 둘이 함께 있으면 통합형으로 나누었고, 두 클래스의 공동분류를 공정 간 융합의 대리측정치로 썼다. 통합형은 전체의 45.8%로 가장 많았고, 패키징 단계 공정을 제조공정에서 제외한 좁은 정의에서도 37.2%였다.</w:t>
       </w:r>
     </w:p>
     <w:p>
@@ -78,7 +78,7 @@
         <w:pStyle w:val="BodyText"/>
       </w:pPr>
       <w:r>
-        <w:t xml:space="preserve">융합의 전개는 세 국면으로 나타났다. 2014년 이전의 형성기에는 공정 단독형이 43.6%로 가장 많았고, 2015–2019년의 확산기에는 통합형이 62.2%로 정점에 이르렀으며, 2020–2024년의 재편기에는 통합형이 44.3%로 낮아지고 접합 단독형이 늘었다. 회귀분석에서 세부 기술을 더 다양하게 포함한 출원일수록 통합형일 가능성이 높았고(상대위험비 1.40), 이 연관은 세 국면 모두에서 유지되었다. 최근 출원일수록 공정 단독형으로 분류될 상대적 가능성은 낮아져 융합의 무게중심이 접합 쪽으로 옮겨 갔다.</w:t>
+        <w:t xml:space="preserve">융합의 전개는 세 국면으로 나타났다. 2014년 이전의 형성기에는 공정 단독형이 43.6%로 가장 많았고, 2015–2019년의 확산기에는 통합형이 62.2%로 정점에 이르렀으며, 2020–2024년의 재편기에는 통합형이 44.3%로 낮아지고 접합 단독형이 늘었다. 회귀분석에서 세부 기술을 더 다양하게 포함한 출원일수록 통합형일 가능성이 높았고(상대위험비 1.40), 이 연관은 세 국면 모두에서 유지되었다. 최근 출원일수록 접합 단독형 대비 공정 단독형으로 분류될 상대적 가능성은 낮아져, 출원의 무게중심이 접합 쪽으로 옮겨 갔다.</w:t>
       </w:r>
     </w:p>
     <w:p>
@@ -86,7 +86,7 @@
         <w:pStyle w:val="BodyText"/>
       </w:pPr>
       <w:r>
-        <w:t xml:space="preserve">기술 클러스터와 기술 네트워크 분석으로 찾은 하이브리드 본딩의 핵심 기술, 곧 접합 패드끼리 범프 없이 직접 연결하는 접합 기호 네 개를 담은 출원은 형성기에 제조공정 분류를 함께 가질 승산이 그렇지 않은 출원의 11.1배였지만, 그 차이는 확산기에 2.5배로 줄었고 재편기에는 사라졌다. 재편기의 융합은 핵심 기술이 아니라 임시 지지 기판, 봉지 같은 다이 취급 공정과의 결합에서 나타났다. 공정 단계 간 융합은 한 방향으로 쌓이기보다, 핵심 기술의 설계가 고착화되면서 융합이 일어나는 자리가 핵심에서 주변으로 옮겨 가는 방식으로 전개되었다.</w:t>
+        <w:t xml:space="preserve">기술 클러스터와 기술 네트워크 분석으로 찾은 하이브리드 본딩의 핵심 기술, 곧 접합 패드의 형성과 패드 간 직접 연결을 나타내는 접합 기호 네 개를 담은 출원은 형성기에 제조공정 분류를 함께 가질 승산이 그렇지 않은 출원의 11.1배였지만, 그 차이는 확산기에 2.5배로 줄었고 재편기에는 사라졌다. 핵심 기술과 함께 가장 자주 부여된 제조공정도 확산기의 반도체 몸체 접합과 기판 관통 배선에서 재편기의 임시 지지 기판, 봉지 같은 다이 취급 공정으로 바뀌었다. 공정 단계 간 융합은 한 방향으로 쌓이기보다, 핵심 기술의 설계가 고착화되면서 융합이 일어나는 자리가 핵심에서 주변으로 옮겨 가는 방식으로 전개되었다.</w:t>
       </w:r>
     </w:p>
     <w:p>
@@ -122,7 +122,7 @@
         <w:pStyle w:val="FirstParagraph"/>
       </w:pPr>
       <w:r>
-        <w:t xml:space="preserve">Wafer fabrication at the front end and assembly at the back end have long been separate domains of semiconductor manufacturing. Yet hybrid bonding, a back-end bonding technology that has recently drawn wide attention, does not perform without front-end fabrication capabilities such as surface planarisation and surface treatment. This paper examines whether the technologies of the two stages are actually combined within single patents and how that convergence has unfolded over time, using 928 hybrid-bonding-related patent applications from EPO PATSTAT. Each application is labelled bonding-only when its CPC symbols include only the bonding and interconnect class (H01L24), process-only when they include only the fabrication-process class (H01L21), and integrated when they include both; co-classification in the two classes serves as a proxy for cross-stage convergence. Integrated applications are the largest group at 45.8%, and 37.2% under a narrower definition that excludes packaging-stage processes.</w:t>
+        <w:t xml:space="preserve">Wafer fabrication at the front end and assembly at the back end have long been separate domains of semiconductor manufacturing. Yet hybrid bonding, a back-end bonding technology that has recently drawn wide attention, cannot achieve its required performance without front-end fabrication capabilities such as surface planarisation and surface treatment. This paper examines whether the technologies of the two stages are actually combined within single patents and how that convergence has unfolded over time, using 928 hybrid-bonding-related patent applications from EPO PATSTAT. Each application is labelled bonding-only when its CPC symbols include only the bonding and interconnect class (H01L24), process-only when they include only the fabrication-process class (H01L21), and integrated when they include both; co-classification in the two classes serves as a proxy for cross-stage convergence. Integrated applications formed the largest group (45.8%), and accounted for 37.2% even under a narrower definition that excludes packaging-stage processes.</w:t>
       </w:r>
     </w:p>
     <w:p>
@@ -130,7 +130,7 @@
         <w:pStyle w:val="BodyText"/>
       </w:pPr>
       <w:r>
-        <w:t xml:space="preserve">Convergence unfolded in three phases. In the formation phase before 2015, process-only applications were the most common at 43.6%; in the diffusion phase of 2015–2019, the integrated share peaked at 62.2%; and in the reconfiguration phase of 2020–2024, it fell to 44.3% while bonding-only applications increased. In the regressions, applications covering more diverse technical elements were more likely to be integrated (relative-risk ratio 1.40), and this association held in all three phases. More recent filings were relatively less likely to be classified as process-only, so the centre of gravity of convergence moved towards bonding.</w:t>
+        <w:t xml:space="preserve">Convergence unfolded in three phases. In the formation phase before 2015, process-only applications were the most common at 43.6%; in the diffusion phase of 2015–2019, the integrated share peaked at 62.2%; and in the reconfiguration phase of 2020–2024, it fell to 44.3% while bonding-only applications increased. In the regressions, applications covering more diverse technical elements were more likely to be integrated (relative-risk ratio 1.40), and this association held in all three phases. More recent filings were less likely to be classified as process-only rather than bonding-only, so the centre of gravity of filings moved towards bonding.</w:t>
       </w:r>
     </w:p>
     <w:p>
@@ -138,7 +138,7 @@
         <w:pStyle w:val="BodyText"/>
       </w:pPr>
       <w:r>
-        <w:t xml:space="preserve">A technology cluster and network analysis identifies the core of hybrid bonding as four bonding symbols for connecting bonding pads directly, without bumps. Applications containing this core had 11.1 times the odds of also carrying fabrication-process symbols in the formation phase; the ratio fell to 2.5 in the diffusion phase and disappeared in the reconfiguration phase. In the reconfiguration phase, convergence appeared not in the core technology but in combinations with die-handling processes such as temporary carriers and encapsulation. Rather than accumulating in one direction, cross-stage convergence unfolded as the place where it occurs moved from the core of the technology to its periphery while the core design settled.</w:t>
+        <w:t xml:space="preserve">A technology cluster and network analysis identifies the core of hybrid bonding as four bonding symbols for forming bonding pads and connecting them directly. In the formation phase, the odds that an application containing this core also carried fabrication-process symbols were 11.1 times those of an application without it; the odds ratio fell to 2.5 in the diffusion phase, and the difference disappeared in the reconfiguration phase. The fabrication processes most often co-assigned with the core also shifted from the joining of semiconductor bodies and through-substrate vias in the diffusion phase to die-handling processes such as temporary carriers and encapsulation in the reconfiguration phase. Rather than accumulating in one direction, cross-stage convergence unfolded as its locus moved from the core of the technology to its periphery while the core design became entrenched.</w:t>
       </w:r>
     </w:p>
     <w:p>
@@ -189,7 +189,7 @@
         <w:pStyle w:val="BodyText"/>
       </w:pPr>
       <w:r>
-        <w:t xml:space="preserve">회로를 더 작게 만드는 미세화는 집적도 향상이 둔해지고 비용이 빠르게 늘어나는 한계에 부딪혔다(그림 1). 그러자 산업은 다이를 나누고 쌓고 연결하는 방식에서 새 성능 향상의 여지를 찾기 시작했다(Arden et al., 2010; Khan et al., 2018). 그 중심에 하이브리드 본딩이 있다. 솔더 범프 없이 구리 패드와 주변 산화막을 직접 맞붙이는 이 기술은 종래 방식으로는 닿기 어려운 10 µm 이하의 연결 간격을 열어 준다고 Lau(2021, 2022)는 정리한다. 이 기술의 성패를 가르는 요소를 하나씩 짚어 보면 나노미터 수준의 표면 평탄화, 표면 활성화, 정밀 정렬인데, 어느 것도 후공정의 전통적 역량이 아니다. 모두 전공정의 제조공정 역량이다. 상호의존이 이렇게 커지자 선도 파운드리가 첨단 패키징 역량을 내부에 두려는 움직임이 나타난 것도 자연스럽다(Lau, 2022; KnowMade, 2024).</w:t>
+        <w:t xml:space="preserve">회로를 더 작게 만드는 미세화는 집적도 향상이 둔해지고 비용이 빠르게 늘어나는 한계에 부딪혔다(그림 1). 그러자 산업은 다이를 나누고 쌓고 연결하는 방식에서 새 성능 향상의 여지를 찾기 시작했다(Arden et al., 2010; Khan et al., 2018). 그 중심에 하이브리드 본딩이 있다. 솔더 범프 없이 구리 패드와 주변 산화막을 직접 맞붙이는 이 기술은 종래 방식으로는 닿기 어려운 10 µm 이하의 연결 간격을 열어 준다고 Lau(2021, 2022)는 정리한다. 이 기술의 성패를 가르는 요소는 나노미터 수준의 표면 평탄화, 표면 활성화, 정밀 정렬인데, 어느 것도 후공정의 전통적 역량이 아니다. 모두 전공정의 제조공정 역량이다. 상호의존이 이렇게 커지자 선도 파운드리가 첨단 패키징 역량을 내부에 두려는 움직임이 나타난 것도 자연스럽다(Lau, 2022; KnowMade, 2024).</w:t>
       </w:r>
     </w:p>
     <w:p>
@@ -263,7 +263,7 @@
         <w:pStyle w:val="BodyText"/>
       </w:pPr>
       <w:r>
-        <w:t xml:space="preserve">이러한 기술 경계의 융합을 개별 특허 수준에서 확인할 수 있는지, 그리고 그 융합이 시간이 지나면서 어떤 양태로 전개되는지가 이 논문의 질문이다. 기술융합 문헌은 서로 구분되던 기술 영역이 겹치고 결합하는 과정을 오랫동안 다루어 왔다(Rosenberg, 1963; Kodama, 1992; Curran and Leker, 2011; Sick and Bröring, 2022). 그러나 정보통신과 가전을 다룬 Hacklin et al.(2009), 식품과 제약을 다룬 Bröring et al.(2006), 나노기술과 바이오기술을 다룬 No와 Park(2010)에서 보듯, 이 문헌의 실증 연구는 주로 서로 다른 산업이나 기술 분야가 겹치는 경우에 관심을 두었다. 한 산업 안에서 가치사슬의 단계를 가로지르는 융합은 좀처럼 다루어지지 않았고, 융합을 단계적 과정으로 보는 이론(Hacklin et al., 2010)에 비해 융합의 내용이 시간에 따라 어떻게 바뀌는지를 살핀 실증도 드물다. 가치사슬 상·하류 기업 간의 특허 인용을 분석한 Karvonen과 Kässi(2012)가 가장 가까운 선례이지만, 하나의 기술이 공정 단계의 경계를 넘는지를 특허 단위에서 검정한 것은 아니었다. 공정 단계의 경계를 넘는 발명은 누가 무엇을 생산하고 가치를 어떻게 나누는가를 규정하는 산업의 틀(Jacobides et al., 2006)이 바뀌는 기술적 출발점이 될 수 있다는 점에서, 이러한 연구 공백을 메울 필요가 있다.</w:t>
+        <w:t xml:space="preserve">이러한 기술 경계의 융합을 개별 특허 수준에서 확인할 수 있는지, 그리고 그 융합이 시간이 지나면서 어떤 양태로 전개되는지가 본 연구의 질문이다. 기술융합 문헌은 서로 구분되던 기술 영역이 겹치고 결합하는 과정을 오랫동안 다루어 왔다(Rosenberg, 1963; Kodama, 1992; Curran and Leker, 2011; Sick and Bröring, 2022). 그러나 정보통신과 가전을 다룬 Hacklin et al.(2009), 식품과 제약을 다룬 Bröring et al.(2006), 나노기술과 바이오기술을 다룬 No와 Park(2010)에서 보듯, 이 문헌의 실증 연구는 주로 서로 다른 산업이나 기술 분야가 겹치는 경우에 관심을 두었다. 한 산업 안에서 가치사슬의 단계를 가로지르는 융합은 좀처럼 다루어지지 않았고, 융합을 단계적 과정으로 보는 이론(Hacklin et al., 2010)에 비해 융합의 내용이 시간에 따라 어떻게 바뀌는지를 살핀 실증도 드물다. 가치사슬 상·하류 기업 간의 특허 인용을 분석한 Karvonen과 Kässi(2012)가 가장 가까운 선례이지만, 하나의 기술이 공정 단계의 경계를 넘는지를 특허 단위에서 검정한 것은 아니었다. 공정 단계의 경계를 넘는 발명은 누가 무엇을 생산하고 가치를 어떻게 나누는가를 규정하는 산업의 틀(Jacobides et al., 2006)이 바뀌는 기술적 출발점이 될 수 있다는 점에서, 이러한 연구 공백을 메울 필요가 있다.</w:t>
       </w:r>
     </w:p>
     <w:p>
@@ -271,7 +271,7 @@
         <w:pStyle w:val="BodyText"/>
       </w:pPr>
       <w:r>
-        <w:t xml:space="preserve">자료는 유럽특허청(EPO) PATSTAT에서 추출한 하이브리드 본딩 관련 특허출원 928건이고, 여기에 부여된 협력적 특허분류(CPC) 기호가 분석의 재료다. 접합·인터커넥트 분류(H01L24)의 기호와 제조공정 기술 분류(H01L21)의 기호가 한 출원에 함께 붙어 있으면 그 출원을 통합형, 곧 경계를 넘는 특허로 본다. 접합·인터커넥트 기호만 있으면 접합 단독형, 제조공정 기호만 있으면 공정 단독형이다. 공동분류로 융합을 포착하는 것 자체는 Curran과 Leker(2011), Kwon et al.(2020) 등이 써 온 표준적인 방법이다. 이 논문이 새로 하는 일은 그 방법을 두 산업 사이가 아니라 한 산업을 가로지르는 경계에 적용하고, 분야 수준의 지수로 집계하는 대신 개별 특허의 유형으로 재구성하는 것이다. 이에 따라 본 연구가 답하려는 질문은 세 가지다. 첫째, 하이브리드 본딩 특허에서 제조공정과 접합 기술의 융합은 얼마나 일반적이며 시기에 따라 어떻게 전개되었는가. 둘째, 어떤 특허가 두 공정의 경계를 넘으며, 융합의 무게중심은 시간에 따라 어느 쪽으로 옮겨 갔는가. 셋째, 융합이 일어나는 자리는 하이브리드 본딩의 핵심 기술과 주변 기술 사이에서 어떻게 옮겨 갔는가.</w:t>
+        <w:t xml:space="preserve">자료는 유럽특허청(EPO) PATSTAT에서 추출한 하이브리드 본딩 관련 특허출원 928건이고, 여기에 부여된 협력적 특허분류(CPC) 기호가 분석의 재료다. 접합·인터커넥트 분류(H01L24)의 기호와 제조공정 기술 분류(H01L21)의 기호가 한 출원에 함께 붙어 있으면 그 출원을 통합형, 곧 경계를 넘는 특허로 본다. 접합·인터커넥트 기호만 있으면 접합 단독형, 제조공정 기호만 있으면 공정 단독형이다. 공동분류로 융합을 포착하는 것 자체는 Curran과 Leker(2011), Kwon et al.(2020) 등이 써 온 표준적인 방법이다. 본 연구가 새로 하는 일은 그 방법을 두 산업 사이가 아니라 한 산업을 가로지르는 경계에 적용하고, 분야 수준의 지수로 집계하는 대신 개별 특허의 유형으로 재구성하는 것이다. 이에 따라 본 연구가 답하려는 질문은 세 가지다. 첫째, 하이브리드 본딩 특허에서 제조공정과 접합 기술의 융합은 얼마나 일반적이며 시기에 따라 어떻게 전개되었는가. 둘째, 어떤 특허가 두 공정의 경계를 넘으며, 출원의 무게중심은 시간에 따라 어느 쪽으로 옮겨 갔는가. 셋째, 융합이 일어나는 자리는 하이브리드 본딩의 핵심 기술과 주변 기술 사이에서 어떻게 옮겨 갔는가.</w:t>
       </w:r>
     </w:p>
     <w:p>
@@ -279,7 +279,7 @@
         <w:pStyle w:val="BodyText"/>
       </w:pPr>
       <w:r>
-        <w:t xml:space="preserve">결론부터 적으면 통합형은 출원의 45.8%로 가장 많은 유형이고 좁은 정의로도 37.2%다. 그리고 융합은 세 국면을 거쳐 전개되었다. 2014년 이전의 형성기에는 공정 단독형이 가장 많았고, 2015–2019년의 확산기에는 두 공정의 기술을 함께 담은 통합형이 정점에 이르렀으며, 2020–2024년의 재편기에는 통합형이 낮아지고 접합 단독형이 늘었다. 세 국면 모두에서 세부 기술을 더 다양하게 포함한 출원일수록 경계를 넘을 가능성이 높았고, 공정 단독형은 최근으로 올수록 드물어졌다. 기술 클러스터와 기술 네트워크로 찾은 핵심 기술, 곧 접합 패드끼리 직접 연결하는 기술을 담은 출원은 형성기에 통합형인 경우가 훨씬 많았지만 재편기에는 그 차이가 사라졌고, 제조공정과의 결합은 그 대신 다이 취급 공정에서 늘었다. 융합은 한 방향으로 쌓인 것이 아니라 핵심에서 주변으로 자리를 옮겨 간 것이다.</w:t>
+        <w:t xml:space="preserve">결론부터 적으면 통합형은 출원의 45.8%로 가장 많은 유형이고, 패키징 단계 공정을 제조공정에서 뺀 좁은 정의로도 37.2%다. 그리고 융합은 세 국면을 거쳐 전개되었다. 2014년 이전의 형성기에는 공정 단독형이 가장 많았고, 2015–2019년의 확산기에는 두 공정의 기술을 함께 담은 통합형이 정점에 이르렀으며, 2020–2024년의 재편기에는 통합형이 낮아지고 접합 단독형이 늘었다. 세 국면 모두에서 세부 기술을 더 다양하게 포함한 출원일수록 경계를 넘을 가능성이 높았고, 공정 단독형은 최근으로 올수록 드물어졌다. 기술 클러스터와 기술 네트워크로 찾은 핵심 기술, 곧 접합 패드의 형성과 직접 연결에 관한 기술을 담은 출원은 형성기에 통합형인 경우가 훨씬 많았지만 재편기에는 그 차이가 사라졌고, 핵심 기술과 함께 부여되는 제조공정도 다이 취급 공정으로 바뀌었다. 융합은 한 방향으로 쌓인 것이 아니라 핵심에서 주변으로 자리를 옮겨 간 것이다.</w:t>
       </w:r>
     </w:p>
     <w:p>
@@ -287,7 +287,7 @@
         <w:pStyle w:val="BodyText"/>
       </w:pPr>
       <w:r>
-        <w:t xml:space="preserve">이 논문의 기여는 세 가지다. 첫째, 개념적으로는 산업 간 사례에 머물던 융합 이론을 산업 내 공정 단계 간 사례로 넓히고, 융합을 정도의 증감이 아니라 내용과 자리가 바뀌는 과정으로 기술한다. 이 과정에서 반도체 산업의 분업 구조에 관한 연구(Langlois and Steinmueller, 1999; Kapoor and Adner, 2012; Kapoor, 2013)와 지배적 설계에 관한 기술 순환 이론(Anderson and Tushman, 1990)을 공정 단계 수준의 특허 증거와 연결한다. 둘째, 방법론적으로는 융합지수를 하나 더 만드는 대신 공동분류를 개별 특허의 유형으로 재구성함으로써, 분야 수준 지수가 평균 속에 묻어 버리는 특허 간 이질성과 그 시간 변화를 추정할 수 있게 하고, 기술 클러스터와 기술 네트워크로 찾은 핵심 기술을 그 추정에 연결한다. 셋째, 이 설계는 CPC 클래스 둘, 분류 규칙 하나, 표준 추정량만으로 이루어져 있으므로, 하류 단계가 상류 역량에 기대기 시작한 다른 공정기술에도 그대로 옮겨 쓸 수 있다.</w:t>
+        <w:t xml:space="preserve">본 연구의 기여는 세 가지다. 첫째, 개념적으로는 산업 간 사례에 머물던 융합 이론을 산업 내 공정 단계 간 사례로 넓히고, 융합을 정도의 증감이 아니라 내용과 자리가 바뀌는 과정으로 기술한다. 이 과정에서 반도체 산업의 분업 구조에 관한 연구(Langlois and Steinmueller, 1999; Kapoor and Adner, 2012; Kapoor, 2013)와 지배적 설계에 관한 기술 순환 이론(Anderson and Tushman, 1990)을 공정 단계 수준의 특허 증거와 연결한다. 둘째, 방법론적으로는 융합지수를 하나 더 만드는 대신 공동분류를 개별 특허의 유형으로 재구성함으로써, 분야 수준 지수가 평균 속에 묻어 버리는 특허 간 이질성과 그 시간 변화를 추정할 수 있게 하고, 기술 클러스터와 기술 네트워크로 찾은 핵심 기술을 그 추정에 연결한다. 셋째, 이 설계는 CPC 클래스 둘, 분류 규칙 하나, 표준 추정량만으로 이루어져 있으므로, 하류 단계가 상류 역량에 기대기 시작한 다른 공정기술에도 그대로 옮겨 쓸 수 있다.</w:t>
       </w:r>
     </w:p>
     <w:p>
@@ -356,7 +356,7 @@
         <w:pStyle w:val="BodyText"/>
       </w:pPr>
       <w:r>
-        <w:t xml:space="preserve">기술융합 문헌과 수직 전문화 문헌을 잇는 논리는 다음과 같다. 산업 아키텍처는 누가 무엇을 하고 가치가 어떻게 나뉘는지를 정하는 틀이며(Jacobides et al., 2006), 공정 단계 사이의 인터페이스가 안정적일 때 전문화를 허용한다. 새로운 기술이 한 단계의 성능을 다른 단계의 지식에 의존하게 만들면 인터페이스가 불안정해지고, 기업은 경계 반대편의 지식을 획득하거나 통합해야 한다. 이때 지식의 결합은 먼저 발명 수준에서 나타난다. 한 발명이 두 단계의 기술을 함께 담기 시작하는 것이다. 특허의 공동분류는 이러한 지식 경계 확장의 흔적이다. 하이브리드 본딩은 이런 기술에 해당한다. 수율이 평탄화, 표면 화학, 정렬처럼 전공정에 자리한 제조공정 역량에 달려 있으므로 제조와 패키징 사이의 인터페이스는 더 이상 안정적이지 않다. 그 결과는 두 산업 사이가 아니라 한 산업의 두 단계 사이에서 일어나는 융합이다. 이 현상은 미세화의 한계에 관한 문헌이 예측하고(Arden et al., 2010; Iyer, 2016; Khan et al., 2018) 패키징 공학 문헌이 기술적으로 기록해 왔지만(Lau, 2021, 2022), 이를 발명의 기록에서 관찰하는 방법은 거의 제시되지 않았다.</w:t>
+        <w:t xml:space="preserve">기술융합 문헌과 수직 전문화 문헌을 잇는 논리는 다음과 같다. 산업 아키텍처는 누가 무엇을 하고 가치가 어떻게 나뉘는지를 정하는 틀이며(Jacobides et al., 2006), 공정 단계 사이의 인터페이스가 안정적일 때 전문화를 허용한다. 새로운 기술이 한 단계의 성능을 다른 단계의 지식에 의존하게 만들면 인터페이스가 불안정해지고, 기업은 경계 반대편의 지식을 획득하거나 통합해야 한다. 이때 지식의 결합은 먼저 발명 수준에서 나타난다. 한 발명이 두 단계의 기술을 함께 담기 시작하는 것이다. 특허의 공동분류는 이러한 지식 경계 확장의 흔적이다. 하이브리드 본딩은 한 단계의 성능을 다른 단계의 지식에 의존하게 만드는 기술에 해당한다. 수율이 평탄화, 표면 화학, 정렬처럼 전공정에 자리한 제조공정 역량에 달려 있으므로 제조와 패키징 사이의 인터페이스는 더 이상 안정적이지 않다. 그 결과는 두 산업 사이가 아니라 한 산업의 두 단계 사이에서 일어나는 융합이다. 이 현상은 미세화의 한계에 관한 문헌이 예측하고(Arden et al., 2010; Iyer, 2016; Khan et al., 2018) 패키징 공학 문헌이 기술적으로 기록해 왔지만(Lau, 2021, 2022), 이를 발명의 기록에서 관찰하는 방법은 거의 제시되지 않았다.</w:t>
       </w:r>
     </w:p>
     <w:bookmarkEnd w:id="16"/>
@@ -374,7 +374,7 @@
         <w:pStyle w:val="FirstParagraph"/>
       </w:pPr>
       <w:r>
-        <w:t xml:space="preserve">융합 측정에 특허가 가장 널리 쓰이는 이유는 분류 기호가 각 발명을 하나 이상의 기술 분야에 배치해 주기 때문이다(Curran and Leker, 2011). 기존 연구는 대체로 두 분야의 기호가 함께 부여된 특허의 수를 세어 분야 수준의 지수로 집계해 왔다(Cho and Kim, 2014; Lee et al., 2015; Jeong et al., 2015; Kwon et al., 2020). 분류가 발명을 뒤늦게 따라간다는 문제를 피하려고 특허 텍스트를 이용하는 연구도 있다(Preschitschek et al., 2013; Zhu and Motohashi, 2022).</w:t>
+        <w:t xml:space="preserve">융합 측정에 특허가 가장 널리 쓰이는 이유는 분류 기호가 각 발명을 하나 이상의 기술 분야에 배치해 주기 때문이다(Curran and Leker, 2011). 기존 연구는 대체로 두 분야의 기호가 함께 부여된 특허의 수를 세어 분야 수준의 지수로 집계해 왔다(Cho and Kim, 2014; Jeong et al., 2015; Lee et al., 2015; Kwon et al., 2020). 분류가 발명을 뒤늦게 따라간다는 문제를 피하려고 특허 텍스트를 이용하는 연구도 있다(Preschitschek et al., 2013; Zhu and Motohashi, 2022).</w:t>
       </w:r>
     </w:p>
     <w:p>
@@ -382,7 +382,7 @@
         <w:pStyle w:val="BodyText"/>
       </w:pPr>
       <w:r>
-        <w:t xml:space="preserve">공동분류를 융합의 신호로 쓴다는 점에서 본 연구는 앞의 첫째 흐름에 속한다. 다른 점은 분석 단위다. 공동분류를 분야 수준으로 집계하는 대신 개별 특허를 세 가지 공동분류 유형으로 나누는데, 접합·인터커넥트 기호(H01L24)만 부여된 접합 단독형, 제조공정 기호(H01L21)만 부여된 공정 단독형, 그리고 두 기호가 함께 부여된 통합형이 그것이다. 이 가운데 통합형이 경계를 넘는 특허다. 특허 하나하나에 대해 정의되는 구분이므로 표준 이산선택 모형으로 분석할 수 있고, 집계 지수가 평균해 버리는 특허 간 차이도 보존된다. 한 가지 단서는 필요하다. CPC 기호는 심사관이 발명의 기술 내용에 부여하는 것이므로, 공동분류는 두 영역의 기술이 한 발명에 함께 담겼다는 사실의 대리측정치이지 법적 청구범위의 측정치는 아니다. 이 점은 제4.2절에서 다시 정리한다.</w:t>
+        <w:t xml:space="preserve">공동분류를 융합의 신호로 쓴다는 점에서 본 연구는 앞의 첫째 흐름에 속한다. 다른 점은 분석 단위다. 공동분류를 분야 수준으로 집계하는 대신 개별 특허를 세 가지 공동분류 유형으로 나누는데, 접합·인터커넥트 기호(H01L24)만 부여된 접합 단독형, 제조공정 기호(H01L21)만 부여된 공정 단독형, 그리고 두 기호가 함께 부여된 통합형이 그것이다. 이 가운데 통합형이 경계를 넘는 특허다. 특허 하나하나에 대해 정의되는 구분이므로 표준 이산선택 모형으로 분석할 수 있고, 집계 지수가 평균해 버리는 특허 간 차이도 보존된다. 다만 한 가지 단서가 필요하다. CPC 기호는 심사관이 발명의 기술 내용에 부여하는 것이므로, 공동분류는 두 영역의 기술이 한 발명에 함께 담겼다는 사실의 대리측정치이지 법적 청구범위의 측정치는 아니다. 이 점은 제4.2절에서 다시 정리한다.</w:t>
       </w:r>
     </w:p>
     <w:p>
@@ -390,7 +390,7 @@
         <w:pStyle w:val="BodyText"/>
       </w:pPr>
       <w:r>
-        <w:t xml:space="preserve">본 연구의 설명변수 구성과 핵심 기술 식별은 특허 연구의 두 흐름에 근거한다. 하나는 특허 범위 연구다. Lerner(1994)는 특허가 걸치는 분류의 수로 범위를 재고 범위가 경제적 가치를 가짐을 보였으며, 반도체에서는 특허 시장이 잘게 나뉘어 있을수록 기업이 넓은 포트폴리오를 쌓는다는 점이 알려져 있다(Hall and Ziedonis, 2001; Ziedonis, 2004). 본 연구의 기술범위는 이 전통을 따르되 두 클래스 안의 세부 분류 수로 한정한 측정치다. 다른 하나는 기술 네트워크 연구다. 분류 기호를 노드로, 한 특허에 함께 부여된 기호의 쌍을 연결로 보면 기술 요소 사이의 결합 구조를 네트워크로 그릴 수 있다(Sternitzke et al., 2008). 두 기호가 함께 부여되는 빈도는 두 기술 사이의 지식 관련성을 나타내며(Breschi et al., 2003), 많은 특허가 공통으로 다루면서 서로 강하게 연결된 기호의 묶음, 곧 기술 클러스터는 그 기술의 핵심 요소를 드러낸다. 본 연구는 이 방법으로 하이브리드 본딩의 핵심 기술을 식별하고(제4.4절), 그 핵심 기술을 담은 특허가 경계를 넘는지를 가설로 검정한다.</w:t>
+        <w:t xml:space="preserve">본 연구의 설명변수 구성과 핵심 기술 식별은 특허 연구의 두 흐름에 근거한다. 하나는 특허 범위 연구다. Lerner(1994)는 특허가 걸치는 분류의 수로 범위를 재고 범위가 경제적 가치를 가짐을 보였으며, 반도체에서는 기술 시장이 잘게 나뉘어 있을수록 기업이 넓은 포트폴리오를 쌓는다는 점이 알려져 있다(Hall and Ziedonis, 2001; Ziedonis, 2004). 본 연구의 기술범위는 이 전통을 따르되 두 클래스 안의 세부 분류 수로 한정한 측정치다. 다른 하나는 기술 네트워크 연구다. 분류 기호를 노드로, 한 특허에 함께 부여된 기호의 쌍을 연결로 보면 기술 요소 사이의 결합 구조를 네트워크로 그릴 수 있다(Sternitzke et al., 2008). 두 기호가 함께 부여되는 빈도는 두 기술 사이의 지식 관련성을 나타내며(Breschi et al., 2003), 많은 특허가 공통으로 다루면서 서로 강하게 연결된 기호의 묶음, 곧 기술 클러스터는 그 기술의 핵심 요소를 드러낸다. 본 연구는 이 방법으로 하이브리드 본딩의 핵심 기술을 식별하고(제4.4절), 그 핵심 기술을 담은 특허가 경계를 넘는지를 가설로 검정한다.</w:t>
       </w:r>
     </w:p>
     <w:bookmarkEnd w:id="17"/>
@@ -408,7 +408,7 @@
         <w:pStyle w:val="FirstParagraph"/>
       </w:pPr>
       <w:r>
-        <w:t xml:space="preserve">융합은 한 번에 일어나는 사건이 아니라 여러 단계를 거쳐 진행되는 과정이다(Hacklin et al., 2010). 한편 기술 순환 모형(Anderson and Tushman, 1990)에 따르면 새로운 기술은 여러 설계가 경쟁하는 격동기를 거쳐 하나의 지배적 설계로 수렴한다. 두 관점을 결합하면 공정 단계 사이의 융합 역시 기술의 발전 단계에 따라 다른 양상을 보일 것으로 예상할 수 있다. 기술이 형성되는 시기에는 직접 접합을 가능하게 하는 공정 발명이 주를 이루고, 기술이 확산되는 시기에는 공정 지식이 접합 발명과 결합하는 사례가 늘어난다. 이후 하나의 설계 방식이 지배적 설계로 자리 잡으면, 두 공정의 결합은 응용에 필요한 주변 공정으로 옮겨 간다. 이러한 이론적 논의에 근거하여 본 연구는 다음 세 가지 가설을 설정한다. H1은 어떤 특허가 경계를 넘는가, H2는 융합의 무게중심이 제조공정 쪽에서 접합 쪽으로 옮겨 가는가, H3은 융합이 일어나는 자리가 핵심 기술에서 주변으로 옮겨 가는가를 묻는다.</w:t>
+        <w:t xml:space="preserve">융합은 한 번에 일어나는 사건이 아니라 여러 단계를 거쳐 진행되는 과정이다(Hacklin et al., 2010). 한편 기술 순환 모형(Anderson and Tushman, 1990)에 따르면 새로운 기술은 여러 설계가 경쟁하는 격동기를 거쳐 하나의 지배적 설계로 수렴한다. 두 관점을 결합하면 공정 단계 사이의 융합 역시 기술의 발전 단계에 따라 다른 양상을 보일 것으로 예상할 수 있다. 기술이 형성되는 시기에는 직접 접합을 가능하게 하는 공정 발명이 주를 이룰 것이고, 기술이 확산되는 시기에는 공정 지식이 접합 발명과 결합하는 사례가 늘어날 것이다. 이후 하나의 설계 방식이 지배적 설계로 자리 잡으면, 두 공정의 결합은 응용에 필요한 주변 공정으로 옮겨 갈 것이다. 이러한 이론적 논의에 근거하여 본 연구는 다음 세 가지 가설을 설정한다. H1은 어떤 특허가 경계를 넘는가, H2는 출원의 무게중심이 제조공정 쪽에서 접합 쪽으로 옮겨 가는가, H3은 핵심 기술을 담은 출원의 통합형 우위가 최근으로 올수록 줄어드는가, 곧 융합이 일어나는 자리가 핵심 기술에서 벗어나는가를 묻는다.</w:t>
       </w:r>
     </w:p>
     <w:p>
@@ -462,7 +462,7 @@
         <w:t xml:space="preserve"> </w:t>
       </w:r>
       <w:r>
-        <w:t xml:space="preserve">융합의 단계 모형(Hacklin et al., 2010; Jeong et al., 2015)에 따르면 기술이 발전하면서 융합의 형태도 바뀐다. 하이브리드 본딩의 초기 발명은 표면 준비, 저온 어닐링, 평탄화처럼 직접 접합을 가능하게 한 공정 단계에 관한 것이었고, 따라서 공정 발명으로 분류되었다. 적용 범위가 이미지센서와 3D NAND의 웨이퍼 단위 접합에서 고대역폭 메모리와 로직을 위한 다이 단위 접합으로 넓어지자 발명의 중심은 접합된 구조와 적층 쪽으로 옮겨 갔다(Lau, 2021).</w:t>
+        <w:t xml:space="preserve">융합의 단계 모형(Hacklin et al., 2010; Jeong et al., 2015)에 따르면 기술이 발전하면서 융합의 형태도 바뀐다. 하이브리드 본딩의 초기 발명은 표면 준비, 저온 어닐링, 평탄화처럼 직접 접합을 가능하게 한 공정 단계에 관한 것이었고, 따라서 공정 발명으로 분류되는 경우가 많았다. 적용 범위가 이미지센서와 3D NAND의 웨이퍼 단위 접합에서 고대역폭 메모리(HBM)와 로직을 위한 다이 단위 접합으로 넓어지자 발명의 중심은 접합된 구조와 적층 쪽으로 옮겨 갔다(Lau, 2021).</w:t>
       </w:r>
     </w:p>
     <w:p>
@@ -498,7 +498,7 @@
         <w:t xml:space="preserve"> </w:t>
       </w:r>
       <w:r>
-        <w:t xml:space="preserve">복합적인 기술은 다른 요소와 많이 얽힌 핵심 요소와 그렇지 않은 주변 요소로 이루어지며, 핵심 요소의 설계가 바뀌면 그와 얽힌 다른 요소도 함께 바뀌어야 한다(Murmann and Frenken, 2006). 하이브리드 본딩의 핵심은 범프나 솔더 없이 접합 패드끼리 직접 맞붙이는 연결이다(Lau, 2021). 그런데 핵심 요소를 다루는 발명이 경계 반대편의 지식을 얼마나 함께 담는지는 기술의 시기에 따라 다를 것이다. 기술 순환 모형에 따르면 새 기술이 등장한 직후의 격동기에는 여러 설계가 경쟁하고 핵심 요소와 다른 요소 사이의 인터페이스가 정해져 있지 않다. 지배적 설계가 자리 잡으면 인터페이스가 고착화되고, 이후의 발명은 정해진 설계를 다듬는 점진적 개선으로 바뀐다(Anderson and Tushman, 1990). 인터페이스가 정해지지 않은 동안 접합 패드의 직접 연결을 발명하려면 표면 평탄화와 웨이퍼 접합 같은 제조공정 지식을 함께 다루어야 한다. 반면 인터페이스가 고착화되면 그 지식은 정해진 조건으로 전제되고, 핵심 기술의 발명은 접합 영역 안에서 이루어질 수 있다. Brusoni et al.(2001)은 기업이 직접 만드는 것보다 넓은 지식을 가져야 하는 이유를 구성요소 사이의 예측하기 어려운 상호의존에서 찾았다. 같은 논리로, 상호의존이 예측 가능해질수록 한 발명이 경계 반대편의 지식을 함께 담을 필요는 줄어든다. 하이브리드 본딩은 이미지센서와 3D NAND의 웨이퍼 단위 접합에서 먼저 상용화된 뒤 다이 단위 접합으로 적용이 넓어졌으므로(Lau, 2021, 2022), 출원 시기가 늦을수록 핵심 기술의 설계가 고착화된 단계에 해당할 가능성이 크다. 핵심 기술이 무엇인지는 제4.4절의 기술 클러스터와 기술 네트워크 분석으로 식별한다.</w:t>
+        <w:t xml:space="preserve">복합적인 기술은 다른 요소와 많이 얽힌 핵심 요소와 그렇지 않은 주변 요소로 이루어지며, 핵심 요소의 설계가 바뀌면 그와 얽힌 다른 요소도 함께 바뀌어야 한다(Murmann and Frenken, 2006). 하이브리드 본딩의 핵심은 범프나 솔더 없이 접합 패드끼리 직접 맞붙이는 연결이다(Lau, 2021). 그런데 핵심 요소를 다루는 발명이 경계 반대편의 지식을 얼마나 함께 담는지는 기술의 발전 단계에 따라 다를 것이다. 기술 순환 모형에 따르면 새 기술이 등장한 직후의 격동기에는 여러 설계가 경쟁하고 핵심 요소와 다른 요소 사이의 인터페이스가 정해져 있지 않다. 지배적 설계가 자리 잡으면 인터페이스가 고착화되고, 이후의 발명은 정해진 설계를 다듬는 점진적 개선으로 바뀐다(Anderson and Tushman, 1990). 인터페이스가 정해지지 않은 동안 접합 패드의 직접 연결을 발명하려면 표면 평탄화와 웨이퍼 접합 같은 제조공정 지식을 함께 다루어야 한다. 반면 인터페이스가 고착화되면 그 지식은 정해진 조건으로 전제되고, 핵심 기술의 발명은 접합 영역 안에서 이루어질 수 있다. Brusoni et al.(2001)은 기업이 직접 만드는 것보다 넓은 지식을 가져야 하는 이유를 구성요소 사이의 예측하기 어려운 상호의존에서 찾았다. 같은 논리로, 상호의존이 예측 가능해질수록 한 발명이 경계 반대편의 지식을 함께 담을 필요는 줄어든다. 하이브리드 본딩은 이미지센서와 3D NAND의 웨이퍼 단위 접합에서 먼저 상용화된 뒤 다이 단위 접합으로 적용이 넓어졌으므로(Lau, 2021, 2022), 출원 시기가 늦을수록 핵심 기술의 설계가 고착화된 단계에 해당할 가능성이 크다. 핵심 기술이 무엇인지는 제4.4절의 기술 클러스터와 기술 네트워크 분석으로 식별한다.</w:t>
       </w:r>
     </w:p>
     <w:p>
@@ -535,7 +535,7 @@
         <w:pStyle w:val="FirstParagraph"/>
       </w:pPr>
       <w:r>
-        <w:t xml:space="preserve">하이브리드 본딩은 유전체 안에 구리 패드가 새겨진 두 평탄한 표면을 맞대어, 상온에서 유전체끼리 먼저 붙고 저온 어닐링 뒤 구리끼리 붙게 하여 영구적인 전기 연결을 만드는 기술이다. 솔더 범프가 없으므로 연결 간격은 마이크로범프 플립칩으로는 어려운 10 µm 이하로 내려가며, 연구 단계에서는 1 µm 이하에 이른다(Lau, 2021, 2022). 공정은 두 가지 형태로 쓰인다. 웨이퍼-투-웨이퍼(W2W) 접합은 웨이퍼 전체를 붙이는 방식으로 CMOS 이미지센서와 3D NAND에서 먼저 상용화되었다. 다이-투-웨이퍼(D2W) 접합은 개별 다이를 웨이퍼에 붙이는 방식으로 칩렛, 고대역폭 메모리(HBM), 3D 로직에 필요하다. 두 형태 모두에서 수율을 좌우하는 단계, 곧 나노미터 이하의 거칠기로 표면을 다듬는 화학적 기계연마(CMP), 플라즈마 표면 활성화, 파티클 제어, 정밀 정렬은 CPC 분류상 반도체 제조공정 클래스(H01L21)에 속한다(제4.1절, 표 1). 그림 2는 하이브리드 본딩을 기반 공정, 접합 형태, 소자 구조, 적용 제품의 네 층으로 정리한 것이다. 기반 공정은 주로 제조공정 클래스(H01L21)와, 접합 형태 및 인터커넥트 구성은 주로 접합·인터커넥트 클래스(H01L24)와 대응한다. 그림 3은 D2W 하이브리드 본딩의 공정 흐름이다. 다이를 잘라 붙이기 전까지 층간 절연막 증착, 다마신 식각, 구리 배리어·시드 증착, 구리 도금, 화학적 기계연마가 이어지며, 이는 모두 전공정에서 쓰던 공정과 장비다.</w:t>
+        <w:t xml:space="preserve">하이브리드 본딩은 유전체 안에 구리 패드가 새겨진 두 평탄한 표면을 맞대어, 상온에서 유전체끼리 먼저 붙고 저온 어닐링 뒤 구리끼리 붙게 하여 영구적인 전기 연결을 만드는 기술이다. 솔더 범프가 없으므로 연결 간격은 마이크로범프 플립칩으로는 어려운 10 µm 이하로 내려가며, 연구 단계에서는 1 µm 이하에 이른다(Lau, 2021, 2022). 공정은 두 가지 형태로 쓰인다. 웨이퍼-투-웨이퍼(W2W) 접합은 웨이퍼 전체를 붙이는 방식으로 CMOS 이미지센서와 3D NAND에서 먼저 상용화되었다. 다이-투-웨이퍼(D2W) 접합은 개별 다이를 웨이퍼에 붙이는 방식으로 칩렛, HBM, 3D 로직에 필요하다. 두 형태 모두에서 수율을 좌우하는 단계, 곧 나노미터 이하의 거칠기로 표면을 다듬는 화학적 기계연마(CMP), 플라즈마 표면 활성화, 파티클 제어, 정밀 정렬은 CPC 분류상 반도체 제조공정 클래스(H01L21)에 속한다(제4.1절, 표 1). 그림 2는 하이브리드 본딩을 기반 공정, 접합 형태, 소자 구조, 적용 제품의 네 층으로 정리한 것이다. 기반 공정은 주로 제조공정 클래스(H01L21)와, 접합 형태 및 인터커넥트 구성은 주로 접합·인터커넥트 클래스(H01L24)와 대응한다. 그림 3은 D2W 하이브리드 본딩의 공정 흐름이다. 다이를 잘라 붙이기 전까지 층간 절연막 증착, 다마신 식각, 구리 배리어·시드 증착, 구리 도금, 화학적 기계연마가 이어지며, 이는 모두 전공정에서 쓰던 공정과 장비다.</w:t>
       </w:r>
     </w:p>
     <w:p>
@@ -675,7 +675,7 @@
         <w:pStyle w:val="BodyText"/>
       </w:pPr>
       <w:r>
-        <w:t xml:space="preserve">산업 지형도 같은 방향을 가리킨다. 하이브리드 본딩 특허에 대한 독립적 산업 분석은 TSMC, Adeia, YMTC, Intel, Samsung을 특허 활동을 주도하는 출원인으로 꼽는다(KnowMade, 2024). 원천기술을 가진 라이선싱 기업, 첨단 패키징을 직접 운영하는 파운드리, 메모리 제조사가 나란히 앞서 있다는 사실은 접합 기술이 더 이상 후공정 전문기업만의 영역이 아님을 보여준다.</w:t>
+        <w:t xml:space="preserve">산업 지형도 같은 방향을 가리킨다. 하이브리드 본딩 특허에 대한 독립적 산업 분석은 TSMC, Adeia, YMTC, Intel, Samsung을 특허 활동을 주도하는 출원인으로 꼽는다(KnowMade, 2024). 원천기술을 가진 라이선싱 기업, 첨단 패키징을 직접 운영하는 파운드리, 메모리 제조사가 나란히 앞서 있다는 사실은 접합 기술이 더 이상 후공정 전문기업만의 영역이 아님을 보여 준다.</w:t>
       </w:r>
     </w:p>
     <w:bookmarkEnd w:id="26"/>
@@ -702,7 +702,7 @@
         <w:pStyle w:val="FirstParagraph"/>
       </w:pPr>
       <w:r>
-        <w:t xml:space="preserve">자료는 유럽특허청의 PATSTAT Global 2025년판에서 가져왔다(European Patent Office, 2025). 먼저 CPC 분류 H01L21(반도체 제조공정) 또는 H01L24(반도체 접합·연결 기술) 계열의 기호를 하나 이상 가진 출원을 후보로 검색한 뒤, 제목에 하이브리드 본딩 관련 키워드(</w:t>
+        <w:t xml:space="preserve">자료는 유럽특허청의 PATSTAT Global 2025년판에서 가져왔다(European Patent Office, 2025). 먼저 CPC 분류 H01L21(반도체 제조공정) 또는 H01L24(반도체 접합·인터커넥트 기술) 계열의 기호를 하나 이상 가진 출원을 후보로 검색한 뒤, 제목에 하이브리드 본딩 관련 키워드(</w:t>
       </w:r>
       <w:r>
         <w:rPr>
@@ -764,7 +764,7 @@
         <w:t xml:space="preserve">metal-oxide bond</w:t>
       </w:r>
       <w:r>
-        <w:t xml:space="preserve">) 가운데 하나 이상이 들어 있는 출원만 남겼다(표 1). 그 결과 출원–CPC 쌍 5,277건, 출원 단위로 1968–2024년에 출원된 928건이 된다. 따라서 표본은 하이브리드 본딩 특허 전체가 아니라 이 검색식으로 식별된 관련 출원이며, 제목에 관련어가 없는 출원은 포함되지 않는다. 또한 이 광의의 표본은 현대의 하이브리드 본딩뿐 아니라 그 기술적 기반이 된 초기 직접 접합(direct bonding) 전구 기술을 함께 포착하도록 설계되었다. 추출 단계에서 두 클래스 밖의 기호는 보존되지 않았으므로, 모든 기호는 H01L21 계열(202개)과 H01L24 계열(60개)의 서브그룹 기호(사선 뒤의 세부 번호까지 포함한 전체 기호, 예: H01L 21/603) 262개로 이루어진다. 다만 제4.4절의 기술 클러스터와 기술 네트워크 표는 같은 928건에 부여된 전체 CPC 기호(접합의 인덱싱 코드 H01L2224와 소자 조립체 클래스 H01L25 포함)를 저자가 따로 집계한 결과이며, 회귀분석에는 쓰지 않는다. 본 연구의 분석단위는 PATSTAT의 개별 특허출원이며, 같은 발명이 여러 출원청에 제출된 경우 각 출원을 별도의 관측치로 포함한다.</w:t>
+        <w:t xml:space="preserve">) 가운데 하나 이상이 들어 있는 출원만 남겼다(표 1). 그 결과 출원–CPC 쌍 5,277건, 출원 단위로 1968–2024년에 출원된 928건이 남았다. 따라서 표본은 하이브리드 본딩 특허 전체가 아니라 이 검색식으로 식별된 관련 출원이며, 제목에 관련어가 없는 출원은 포함되지 않는다. 또한 이 광의의 표본은 현대의 하이브리드 본딩뿐 아니라 그 기술적 기반이 된 초기 직접 접합(direct bonding) 전구 기술을 함께 포착하도록 설계되었다. 추출 단계에서 두 클래스 밖의 기호는 보존되지 않았으므로, 회귀분석 자료의 기호는 모두 H01L21 계열(202개)과 H01L24 계열(60개)의 서브그룹 기호(사선 뒤의 세부 번호까지 포함한 전체 기호, 예: H01L 21/603) 262개로 이루어진다. 다만 제4.4절의 기술 클러스터와 기술 네트워크 표는 같은 928건에 부여된 전체 CPC 기호(접합의 인덱싱 코드 H01L2224와 소자 조립체 클래스 H01L25 포함)를 저자가 따로 집계한 결과이며, 회귀분석에는 쓰지 않는다. 본 연구의 분석 단위는 PATSTAT의 개별 특허출원이며, 같은 발명이 여러 출원청에 제출된 경우 각 출원을 별도의 관측치로 포함한다.</w:t>
       </w:r>
     </w:p>
     <w:p>
@@ -1241,7 +1241,78 @@
         <w:t xml:space="preserve">hybrid bonding</w:t>
       </w:r>
       <w:r>
-        <w:t xml:space="preserve">이 들어 있는 출원은 467건이며, 이 핵심 표본으로 다시 추정한 결과를 제5.4절에 보고한다. 둘째, 키워드 필터는 직접 접합(direct bonding)이라는 말의 무관한 용법도 걸러내지 못한다. 세라믹 기판에 구리를 붙이는 DBC 기판, 구리 합금, 전력 모듈 등이 그 예다. 제목으로 식별한 이러한 출원은 68건이며, 이를 뺀 재추정 결과도 제5.4절에 보고한다(판정 기준과 분포는 부록 B). 셋째, 원자료에는 공식 특허 패밀리 식별자가 없어 패밀리 단위의 중복을 직접 제거할 수 없다. 같은 발명이 여러 나라에 출원되면 여러 건으로 잡힌다. 이에 민감도 분석으로 같은 제목을 가진 출원을 중복군으로 보고 각 제목군에서 가장 이른 출원 1건만 남긴 결과를 제5.4절에 보고한다. 928건은 473개의 고유 제목으로 이루어지며, 이 중 149개 제목은 둘 이상의 출원청에 출원되었다.</w:t>
+        <w:t xml:space="preserve">이 들어 있는 출원은 467건이며, 이 표본(이하</w:t>
+      </w:r>
+      <w:r>
+        <w:t xml:space="preserve"> </w:t>
+      </w:r>
+      <w:r>
+        <w:rPr>
+          <w:i/>
+          <w:iCs/>
+        </w:rPr>
+        <w:t xml:space="preserve">hybrid bonding</w:t>
+      </w:r>
+      <w:r>
+        <w:t xml:space="preserve"> </w:t>
+      </w:r>
+      <w:r>
+        <w:t xml:space="preserve">표본)으로 다시 추정한 결과를 제5.4절에 보고한다. 둘째, 키워드 필터는 검색어의 무관한 용법도 걸러내지 못한다. 대부분은 세라믹 기판에 구리를 붙이는 DBC 기판, 구리 합금, 전력 모듈처럼</w:t>
+      </w:r>
+      <w:r>
+        <w:t xml:space="preserve"> </w:t>
+      </w:r>
+      <w:r>
+        <w:rPr>
+          <w:i/>
+          <w:iCs/>
+        </w:rPr>
+        <w:t xml:space="preserve">direct bonding</w:t>
+      </w:r>
+      <w:r>
+        <w:t xml:space="preserve">이 다른 뜻으로 쓰인 경우이고, 화학 결합이나 전력 모듈용 접합 시트를 뜻하는</w:t>
+      </w:r>
+      <w:r>
+        <w:t xml:space="preserve"> </w:t>
+      </w:r>
+      <w:r>
+        <w:rPr>
+          <w:i/>
+          <w:iCs/>
+        </w:rPr>
+        <w:t xml:space="preserve">hybrid bonding</w:t>
+      </w:r>
+      <w:r>
+        <w:t xml:space="preserve">도 일부 있다. 제목으로 식별한 이러한 출원은 68건(</w:t>
+      </w:r>
+      <w:r>
+        <w:rPr>
+          <w:i/>
+          <w:iCs/>
+        </w:rPr>
+        <w:t xml:space="preserve">direct bonding</w:t>
+      </w:r>
+      <w:r>
+        <w:t xml:space="preserve"> </w:t>
+      </w:r>
+      <w:r>
+        <w:t xml:space="preserve">63건,</w:t>
+      </w:r>
+      <w:r>
+        <w:t xml:space="preserve"> </w:t>
+      </w:r>
+      <w:r>
+        <w:rPr>
+          <w:i/>
+          <w:iCs/>
+        </w:rPr>
+        <w:t xml:space="preserve">hybrid bonding</w:t>
+      </w:r>
+      <w:r>
+        <w:t xml:space="preserve"> </w:t>
+      </w:r>
+      <w:r>
+        <w:t xml:space="preserve">5건)이며, 이를 뺀 재추정 결과도 제5.4절에 보고한다(판정 기준과 분포는 부록 B). 셋째, 원자료에는 공식 특허 패밀리 식별자가 없어 패밀리 단위의 중복을 직접 제거할 수 없다. 같은 발명이 여러 나라에 출원되면 여러 건으로 잡힌다. 이에 민감도 분석으로 같은 제목을 가진 출원을 중복군으로 보고 각 제목군에서 가장 이른 출원 1건만 남긴 결과를 제5.4절에 보고한다. 928건은 473개의 고유 제목으로 이루어지며, 이 중 149개 제목은 둘 이상의 출원청에 출원되었다.</w:t>
       </w:r>
     </w:p>
     <w:bookmarkEnd w:id="27"/>
@@ -1665,7 +1736,7 @@
                 <w:sz w:val="18"/>
                 <w:szCs w:val="18"/>
               </w:rPr>
-              <w:t xml:space="preserve">핵심 기술(출원 200건 이상에 부여된 접합 기호)</w:t>
+              <w:t xml:space="preserve">핵심 기술(출원 200건 이상에 부여된 H01L24 기호)</w:t>
             </w:r>
           </w:p>
         </w:tc>
@@ -1695,7 +1766,7 @@
         <w:pStyle w:val="BodyText"/>
       </w:pPr>
       <w:r>
-        <w:t xml:space="preserve">CPC 기호는 심사관이 발명의 기술 내용에 부여하는 것으로, 청구항의 문구와 항상 일치하지는 않는다. 따라서 이하에서 어떤 출원이 어떤 기술을 ‘포함한다’ 또는 어떤 기술로 ’분류된다’는 말은 해당 클래스의 기호가 그 출원에 부여되어 있다는 뜻이며, 법적 청구범위에 관한 진술이 아니다.</w:t>
+        <w:t xml:space="preserve">CPC 기호는 심사관이 발명의 기술 내용에 부여하는 것으로, 청구항의 문구와 항상 일치하지는 않는다. 따라서 이하에서 어떤 출원이 어떤 기술을 ‘포함한다’ 또는 어떤 기술로 ‘분류된다’는 말은 해당 클래스의 기호가 그 출원에 부여되어 있다는 뜻이며, 법적 청구범위에 관한 진술이 아니다.</w:t>
       </w:r>
     </w:p>
     <w:bookmarkEnd w:id="28"/>
@@ -1713,7 +1784,7 @@
         <w:pStyle w:val="FirstParagraph"/>
       </w:pPr>
       <w:r>
-        <w:t xml:space="preserve">표 3은 변수를 정의한다. 기술범위(breadth)는 출원에 부여된 H01L21·H01L24 계열의 서로 다른 서브그룹 기호의 수다. 이는 분류 기호의 수로 범위를 재는 Lerner(1994)의 방식을 두 클래스 안에 적용한 것으로, 두 클래스 안에서 출원에 부여된 세부 기술의 다양성을 뜻하며 반도체 밖의 분야로 뻗는 정도나 법적 청구범위는 재지 않는다. 다만 공동분류 유형과 기술범위는 같은 CPC 정보로 만들어지므로, 통합형은 정의상 H01L21과 H01L24 기호를 하나씩은 가져 최소 breadth가 2인 반면 단독형의 최소값은 1이다. 이 기계적 최소치 차이를 완화하기 위해 출원이 보유한 클래스마다 최소 1개 기호를 차감한 유형 최소치 조정 CPC 범위(breadth_adj = breadth − I[H01L21 보유] − I[H01L24 보유])를 따로 두었다. 예컨대 H01L21 기호 2개와 H01L24 기호 1개를 가진 통합형 출원은 breadth 3, breadth_adj 1이고, H01L24 기호 4개만 가진 접합 단독형 출원은 breadth 4, breadth_adj 3이다. breadth_adj는 유형을 성립시키는 최소 분류 정보를 뺀 뒤 남는 추가 CPC 다양성이며, 종속변수의 유형 정보를 반영하는 탐색적 강건성 지표로만 쓴다. 공동분류 유형(tech_cat)은 각 출원을 접합 단독형(H01L24 기호만), 통합형(둘 다), 공정 단독형(H01L21 기호만)으로 나누며, 두 클래스의 기호가 함께 부여된 통합형이 경계 넘기의 측정치다. 제조공정 분류 여부(has_process)는 H01L21 기호를 하나라도 가지면 1인 지표로, 통합형과 공정 단독형을 합한 것이다. 핵심 기술 보유(core)는 제4.4절에서 식별한 핵심 접합 기호 네 개(24/03, 24/05, 24/08, 24/80) 가운데 하나 이상을 가지면 1이다. 출원연도(yc)는 표본의 첫 출원(1968년)부터 지난 햇수이고, 출원 시기(period)는 출원이 드문 1968–2014년을 한 시기로 묶고 이후를 2015–2019년과 2020–2024년으로 나눈 세 범주다. 출원청(ccode)은 출원이 제출된 특허청 또는 출원 경로로 8개 수준이다. 출원청마다 출원 시기와 기술 구성이 다르므로 모든 모형에 통제변수로 넣되, 출원청 사이의 차이는 이 논문의 질문이 아니므로 계수를 해석하지 않는다.</w:t>
+        <w:t xml:space="preserve">표 3은 변수를 정의한다. 기술범위(breadth)는 출원에 부여된 H01L21·H01L24 계열의 서로 다른 서브그룹 기호의 수다. 이는 분류 기호의 수로 범위를 재는 Lerner(1994)의 방식을 두 클래스 안에 적용한 것으로, 두 클래스 안에서 출원에 부여된 세부 기술의 다양성을 뜻하며 반도체 밖의 분야로 뻗는 정도나 법적 청구범위는 재지 않는다. 다만 공동분류 유형과 기술범위는 같은 CPC 정보로 만들어지므로, 통합형은 정의상 H01L21과 H01L24 기호를 하나씩은 가져 최소 breadth가 2인 반면 단독형의 최소값은 1이다. 이 기계적 최소치 차이를 완화하기 위해 출원이 보유한 클래스마다 최소 1개 기호를 차감한 유형 최소치 조정 CPC 범위(breadth_adj = breadth − I[H01L21 보유] − I[H01L24 보유])를 따로 두었다. 예컨대 H01L21 기호 2개와 H01L24 기호 1개를 가진 통합형 출원은 breadth 3, breadth_adj 1이고, H01L24 기호 4개만 가진 접합 단독형 출원은 breadth 4, breadth_adj 3이다. breadth_adj는 유형을 성립시키는 최소 분류 정보를 뺀 뒤 남는 추가 CPC 다양성이며, 종속변수의 유형 정보를 반영하는 탐색적 강건성 지표로만 쓴다. 공동분류 유형(tech_cat)은 각 출원을 접합 단독형(H01L24 기호만), 통합형(둘 다), 공정 단독형(H01L21 기호만)으로 나누며, 두 클래스의 기호가 함께 부여된 통합형이 경계 넘기의 측정치다. 제조공정 분류 여부(has_process)는 H01L21 기호를 하나라도 가지면 1인 지표로, 통합형과 공정 단독형을 합한 것이다. 핵심 기술 보유(core)는 제4.4절에서 식별한 핵심 접합 기호 네 개(24/03, 24/05, 24/08, 24/80) 가운데 하나 이상을 가지면 1이다. 출원연도(yc)는 표본의 첫 출원(1968년)부터 지난 햇수이고, 출원 시기(period)는 출원이 드문 1968–2014년을 한 시기로 묶고 이후를 2015–2019년과 2020–2024년으로 나눈 세 범주다. 출원청(ccode)은 출원이 제출된 특허청 또는 출원 경로로 8개 수준이다. 출원청마다 출원 시기와 기술 구성이 다르므로 모든 모형에 통제변수로 넣되, 출원청 사이의 차이는 본 연구의 질문이 아니므로 계수를 해석하지 않는다.</w:t>
       </w:r>
     </w:p>
     <w:p>
@@ -2510,7 +2581,7 @@
         <w:pStyle w:val="BodyText"/>
       </w:pPr>
       <w:r>
-        <w:t xml:space="preserve">기술범위는 평균 5.69개(표준편차 4.07, 범위 1–21)이며, 통합형 7.89개, 접합 단독형 4.16개, 공정 단독형 3.15개로 유형에 따라 다르다. 출원청별로는 미국 382건, 중국 175건, PCT 경로 113건, EPO 83건, 대만 75건, 한국 58건, 일본 26건, 기타 16건이다. 그림 4는 연도별 출원 건수다. 2010년 이전에는 드물다가 2010년대 후반에 급증하여 2022년경 정점에 이른다. 2023–2024년의 감소에는 출원 뒤 공개까지 걸리는 시차가 영향을 미쳤을 가능성이 크다. 유형별로는 통합형 425건(45.8%), 접합 단독형 338건(36.4%), 공정 단독형 165건(17.8%)이며, 제조공정 기호를 가진 출원은 590건(63.6%)이다.</w:t>
+        <w:t xml:space="preserve">기술범위는 평균 5.69개(표준편차 4.07, 범위 1–21)이며, 통합형 7.89개, 접합 단독형 4.16개, 공정 단독형 3.15개로 유형에 따라 다르다. 출원청별로는 미국 382건, 중국 175건, PCT 경로 113건, EPO 83건, 대만 75건, 한국 58건, 일본 26건, 기타 16건이다. 그림 4는 연도별 출원 건수다. 2010년 이전에는 드물다가 2010년대 후반에 급증하여 2022년경 정점에 이른다. 유형별로는 통합형 425건(45.8%), 접합 단독형 338건(36.4%), 공정 단독형 165건(17.8%)이며, 제조공정 기호를 가진 출원은 590건(63.6%)이다.</w:t>
       </w:r>
     </w:p>
     <w:p>
@@ -5217,7 +5288,7 @@
         <w:t xml:space="preserve"> </w:t>
       </w:r>
       <w:r>
-        <w:t xml:space="preserve">인덱싱 코드는 회귀 자료에 없으므로, 가설 검정에 쓰는 핵심 기술은 회귀 자료의 H01L24 기호 가운데에서 정한다. 그림 5는 회귀 자료에서 출원 30건 이상에 부여된 기호의 네트워크다. 표 4에서 출원 200건 이상에 부여된 H01L24 기호 네 개(24/80, 24/08, 24/05, 24/03)는 이 네트워크에서도 연결 강도(함께 부여된 출원 수의 합)가 가장 큰 네 기호이고(3,235, 3,140, 2,518, 1,778), 이 네 기호가 이루는 여섯 쌍(186–439건)이 전체 네트워크에서 가장 강한 여섯 연결이다. 회귀 자료에서 다섯째로 많은 기호인 층 형태 커넥터를 이용한 연결(24/83)은 164건으로, 네 기호와 차이가 크다. CPC 체계에서 이 네 기호는 범프·층·와이어 같은 별도의 커넥터 없이 접합 패드 자체를 맞붙이는 갈래에 속한다. 접합 패드의 제조와 구조(24/03, 24/05, 24/08)가 그 대상이고, 연결 방법의 상위 그룹(24/80)에서는 범프(24/81), 층(24/83), 와이어(24/85) 커넥터를 쓰는 방법이 하위 그룹으로 따로 분류된다. 본 연구는 이 네 기호를 하이브리드 본딩의 핵심 기술로 본다.</w:t>
+        <w:t xml:space="preserve">인덱싱 코드는 회귀 자료에 없으므로, 가설 검정에 쓰는 핵심 기술은 회귀 자료의 H01L24 기호 가운데에서 정한다. 그림 5는 회귀 자료에서 출원 30건 이상에 부여된 기호의 네트워크다. 표 4에서 출원 200건 이상에 부여된 H01L24 기호 네 개(24/80, 24/08, 24/05, 24/03)는 이 네트워크에서도 연결 강도(함께 부여된 출원 수의 합)가 가장 큰 네 기호이고(3,235, 3,140, 2,518, 1,778), 이 네 기호가 이루는 여섯 쌍(186–439건)이 전체 네트워크에서 가장 강한 여섯 연결이다. 출원 수로 다섯째인 층 형태 커넥터를 이용한 연결(24/83)은 164건으로 200건 기준에 미치지 못한다. CPC 체계에서 이 네 기호는 접합 패드 갈래에 속한다. 24/03과 24/05는 접합 패드의 제조와 연결 전 구조이고, 24/08과 24/80은 범프·층·와이어 같은 별도의 커넥터 없이 접합 패드끼리 연결한 뒤의 구조와 그 연결 방법이다. 연결 방법의 상위 그룹(24/80)에서는 범프(24/81), 층(24/83), 와이어(24/85) 커넥터를 쓰는 방법이 하위 그룹으로 따로 분류된다. 본 연구는 이 네 기호를 하이브리드 본딩의 핵심 기술로 본다.</w:t>
       </w:r>
     </w:p>
     <w:p>
@@ -5291,7 +5362,7 @@
         <w:pStyle w:val="BodyText"/>
       </w:pPr>
       <w:r>
-        <w:t xml:space="preserve">H01L24 기호를 가진 출원(이하 접합 출원) 763건 가운데 620건(81.3%)이 핵심 기술을 담는다. 그 비중은 2014년 이전 53.5%에서 2015–2019년 78.7%, 2020–2024년 88.0%로 높아져, 발명이 점점 이 핵심 기술로 모여들었다. 핵심 기술과 함께 부여되는 제조공정 기호도 시기에 따라 달랐다. 핵심 기술을 담은 통합형 출원에서 가장 흔한 H01L21 기호는 2015–2019년에는 반도체 몸체끼리의 접합(21/187, 22건)과 기판 관통 배선(21/76898, 21건)이었고, 2020–2024년에는 임시 지지 기판을 이용한 취급(21/6835, 48건)과 봉지 공정용 임시 기판(21/568, 43건)이었다.</w:t>
+        <w:t xml:space="preserve">H01L24 기호를 가진 출원(이하 접합 출원) 763건 가운데 620건(81.3%)이 핵심 기술을 담는다.</w:t>
       </w:r>
     </w:p>
     <w:bookmarkEnd w:id="36"/>
@@ -5309,7 +5380,7 @@
         <w:pStyle w:val="FirstParagraph"/>
       </w:pPr>
       <w:r>
-        <w:t xml:space="preserve">종속변수의 측정 척도와 각 가설이 묻는 질문이 다르기 때문에 세 모형을 쓴다(표 6). 분석단위는 출원 식별자별로 집계된 특허출원이며, 모든 모형에 출원청 더미를 통제변수로 넣는다. 제조공정 분류 보유 모형과 공동분류 유형 모형(928건)의 설명변수는 기술범위(breadth)와 출원연도(yc)이고, 핵심 기술 모형(763건)의 설명변수는 핵심 기술 보유(core), 출원 시기(period)와 둘의 상호작용이다.</w:t>
+        <w:t xml:space="preserve">종속변수의 측정 척도와 각 가설이 묻는 질문이 다르기 때문에 세 모형을 쓴다(표 6). 분석 단위는 출원 식별자별로 집계된 특허출원이며, 모든 모형에 출원청 더미를 통제변수로 넣는다. 제조공정 분류 보유 모형과 공동분류 유형 모형(928건)의 설명변수는 기술범위(breadth)와 출원연도(yc)이고, 핵심 기술 모형(763건)의 설명변수는 핵심 기술 보유(core), 출원 시기(period)와 둘의 상호작용이다.</w:t>
       </w:r>
     </w:p>
     <w:p>
@@ -5871,7 +5942,7 @@
         <w:t xml:space="preserve"> </w:t>
       </w:r>
       <w:r>
-        <w:t xml:space="preserve">has_process는 H01L21 계열 기호를 하나 이상 가지면 1, 아니면 0이다. 통합형 425건과 공정 단독형 165건이 1이고 접합 단독형 338건이 0이다. 종속변수가 두 상태뿐이므로 확률을 0과 1 사이로 제한하는 이항 로짓(log[P/(1 − P)] = β₀ + β₁·breadth + β₂·yc + Σγ_k·ccode_k)으로 추정하고 승산비(OR)로 보고한다. OR은 확률이 아니라 오즈의 배율이다. OR이 1.5이면 제조공정 분류를 가질 오즈가 1.5배라는 뜻이며, 확률이 50% 높다는 뜻으로 바꾸어 쓰지 않는다. 이 모형은 통합형과 공정 단독형을 제조공정 분류 보유 출원으로 묶어 어떤 특성의 출원에서 제조공정 분류가 전반적으로 관찰되는지를 확인하는 보완분석이며, 가설의 본 검정은 아니다.</w:t>
+        <w:t xml:space="preserve">has_process는 H01L21 계열 기호를 하나 이상 가지면 1, 아니면 0이다. 통합형 425건과 공정 단독형 165건이 1이고 접합 단독형 338건이 0이다. 종속변수가 두 상태뿐이므로 확률을 0과 1 사이로 제한하는 이항 로짓(log[P/(1 − P)] = β₀ + β₁·breadth + β₂·yc + Σγ_k·ccode_k)으로 추정하고 승산비(OR)로 보고한다. OR은 확률이 아니라 승산(오즈)의 배율이다. OR이 1.5이면 제조공정 분류를 가질 승산이 1.5배라는 뜻이며, 확률이 50% 높다는 뜻으로 바꾸어 쓰지 않는다. 이 모형은 통합형과 공정 단독형을 제조공정 분류 보유 출원으로 묶어 어떤 특성의 출원에서 제조공정 분류가 전반적으로 관찰되는지를 확인하는 보완분석이며, 가설의 본 검정은 아니다.</w:t>
       </w:r>
     </w:p>
     <w:p>
@@ -5889,7 +5960,7 @@
         <w:t xml:space="preserve"> </w:t>
       </w:r>
       <w:r>
-        <w:t xml:space="preserve">tech_cat의 세 범주는 크고 작음의 순서가 아니라 서로 다른 CPC 구성 방식이므로 순서형 로짓이 아닌 다항 로짓(McFadden, 1974)을 쓴다. 접합 단독형을 기준범주로 두면, 접합 기호만 있는 출원에 견주어 제조공정 분류가 함께 나타나는 통합형과 접합 분류 없이 제조공정만 나타나는 공정 단독형을 각각 비교할 수 있다. 결과는 통합형 대 접합 단독형, 공정 단독형 대 접합 단독형의 상대위험비(RRR)로 보고한다. RRR이 1.4이면 설명변수가 1단위 늘 때 해당 유형 대 접합 단독형의 상대확률비가 1.4배가 된다는 뜻이며, 해당 유형의 절대확률이 같은 비율로 변한다는 뜻은 아니다. 이 모형이 H1(기술범위와 통합형)과 H2(출원연도와 공정 단독형)의 주모형이다.</w:t>
+        <w:t xml:space="preserve">tech_cat의 세 범주는 크고 작음의 순서가 아니라 서로 다른 CPC 구성 방식이므로 순서형 로짓이 아닌 다항 로짓(McFadden, 1974)을 쓴다. 접합 단독형을 기준 범주로 두면, 접합 기호만 있는 출원에 견주어 제조공정 분류가 함께 나타나는 통합형과 접합 분류 없이 제조공정만 나타나는 공정 단독형을 각각 비교할 수 있다. 결과는 통합형 대 접합 단독형, 공정 단독형 대 접합 단독형의 상대위험비(RRR)로 보고한다. RRR이 1.4이면 설명변수가 1단위 늘 때 해당 유형 대 접합 단독형의 상대위험이 1.4배가 된다는 뜻이며, 해당 유형의 절대확률이 같은 비율로 변한다는 뜻은 아니다. 이 모형이 H1(기술범위와 통합형)과 H2(출원연도와 공정 단독형)의 주모형이다.</w:t>
       </w:r>
     </w:p>
     <w:p>
@@ -5925,7 +5996,7 @@
         <w:t xml:space="preserve"> </w:t>
       </w:r>
       <w:r>
-        <w:t xml:space="preserve">핵심 기술은 접합 기호이므로 공정 단독형 출원은 정의상 핵심 기술을 가질 수 없다. 따라서 H3은 H01L24 기호를 가진 출원 763건(통합형 425건, 접합 단독형 338건)에서 통합형 여부를 종속변수로 하는 이항 로짓으로 검정한다. 접합 기호를 가진 출원 가운데 어떤 출원이 제조공정 기호도 함께 가지는가를 묻는 모형이며, 부록 A의 대안 제외 민감도 분석과 같은 표본이다. 모형은 log[P/(1 − P)] = β₀ + β₁·core + Σδ_t·period_t + Σθ_t·(core × period_t) + Σγ_k·ccode_k이다. 2014년 이전 출원에서 핵심 기술의 승산비는 exp(β₁)이고, 2015–2019년과 2020–2024년에는 exp(β₁ + θ_t)이며, exp(θ_t)는 각 시기의 승산비가 2014년 이전의 몇 배인지를 나타낸다. H3이 지지되려면 2014년 이전의 승산비가 1보다 크고 θ_t가 0보다 작아야 한다. 시기별 승산비의 95% 신뢰구간은 두 계수 합의 표준오차로 계산한다. 출원연도를 선형으로 넣지 않고 세 시기로 나눈 것은 기술 순환의 단계를 근사하기 위해서다. 핵심 기호를 뺀 접합 기호 수를 통제한 결과는 제5.4절에 있다.</w:t>
+        <w:t xml:space="preserve">핵심 기술은 접합 기호이므로 공정 단독형 출원은 정의상 핵심 기술을 가질 수 없다. 따라서 H3은 H01L24 기호를 가진 출원 763건(통합형 425건, 접합 단독형 338건)에서 통합형 여부를 종속변수로 하는 이항 로짓으로 검정한다. 접합 기호를 가진 출원 가운데 어떤 출원이 제조공정 기호도 함께 가지는가를 묻는 모형이며, 부록 A의 대안 제외 민감도 분석과 같은 표본이다. 모형은 log[P/(1 − P)] = β₀ + β₁·core + Σδ_t·period_t + Σθ_t·(core × period_t) + Σγ_k·ccode_k이다. 2014년 이전 출원에서 핵심 기술의 승산비는 exp(β₁)이고, 2015–2019년과 2020–2024년에는 exp(β₁ + θ_t)이며, exp(θ_t)는 각 시기의 승산비가 2014년 이전의 몇 배인지를 나타낸다. H3이 지지되려면 2014년 이전의 승산비가 1보다 크고 θ_t가 0보다 작아야 한다. 시기별 승산비의 95% 신뢰구간은 두 계수 합의 표준오차로 계산하며, 표준오차는 이분산에 강건한 방식으로 추정한다. 출원연도를 선형으로 넣지 않고 세 시기로 나눈 것은 기술 순환의 단계를 근사하기 위해서다. 핵심 기호를 뺀 접합 기호 수를 통제한 결과는 제5.4절에 있다.</w:t>
       </w:r>
     </w:p>
     <w:p>
@@ -5943,7 +6014,7 @@
         <w:t xml:space="preserve"> </w:t>
       </w:r>
       <w:r>
-        <w:t xml:space="preserve">OR과 RRR은 비율 척도여서 실제 확률 변화의 크기를 보여주기 어렵다. 따라서 다항 로짓에 대해서는 관심 설명변수(기술범위, 출원연도)만 바꾸고 나머지 변수는 각 출원의 관측값에 둔 채 표본 전체에서 평균한 평균 예측확률을 함께 제시한다(제5.2절). 핵심 기술 모형은 시기별·핵심 기술 보유별 통합형 비중을 함께 제시한다(제5.3절).</w:t>
+        <w:t xml:space="preserve">OR과 RRR은 비율 척도여서 실제 확률 변화의 크기를 보여 주기 어렵다. 따라서 다항 로짓에 대해서는 관심 설명변수(기술범위, 출원연도)만 바꾸고 나머지 변수는 각 출원의 관측값에 둔 채 표본 전체에서 평균한 평균 예측확률을 함께 제시한다(제5.2절). 핵심 기술 모형은 시기별·핵심 기술 보유별 통합형 비중을 함께 제시한다(제5.3절).</w:t>
       </w:r>
     </w:p>
     <w:p>
@@ -5961,7 +6032,7 @@
         <w:t xml:space="preserve"> </w:t>
       </w:r>
       <w:r>
-        <w:t xml:space="preserve">전구 기술을 포함한 광의 표본에 결과가 의존하는지는 제목에</w:t>
+        <w:t xml:space="preserve">전구 기술을 포함한 광의 표본에 결과가 의존하는지는</w:t>
       </w:r>
       <w:r>
         <w:t xml:space="preserve"> </w:t>
@@ -5974,7 +6045,10 @@
         <w:t xml:space="preserve">hybrid bonding</w:t>
       </w:r>
       <w:r>
-        <w:t xml:space="preserve">이 있는 핵심 표본으로, 검색어의 다른 뜻이 결과를 흐리는지는 무관 용법 제외 표본으로, H01L21의 경계 설정에 민감한지는 좁은 제조공정 정의로, 반복·유사 발명의 영향은 동일 제목 중복 제거 표본으로 확인한다. H3에는 핵심 기호를 뺀 접합 기호 수를 통제한 모형과, 핵심 기술을 가장 강한 쌍(24/08, 24/80)으로 좁힌 정의를 더한다. 제목에</w:t>
+        <w:t xml:space="preserve"> </w:t>
+      </w:r>
+      <w:r>
+        <w:t xml:space="preserve">표본으로, 검색어의 다른 뜻이 결과를 흐리는지는 무관 용법 제외 표본으로, H01L21의 경계 설정에 민감한지는 좁은 제조공정 정의로, 반복·유사 발명의 영향은 동일 제목 중복 제거 표본으로 확인한다. H3에는 핵심 기호를 뺀 접합 기호 수를 통제한 모형과, 핵심 기술을 가장 강한 쌍(24/08, 24/80)으로 좁힌 정의를 더한다.</w:t>
       </w:r>
       <w:r>
         <w:t xml:space="preserve"> </w:t>
@@ -5987,7 +6061,10 @@
         <w:t xml:space="preserve">hybrid bonding</w:t>
       </w:r>
       <w:r>
-        <w:t xml:space="preserve">이 있는 핵심 표본은 2020년 이전에 핵심 기술이 없는 접합 출원이 12건뿐이어서 H3의 검정에는 쓰지 않는다. 같은 제목의 출원이 여러 출원청에 반복되어 관측치가 독립이 아닐 가능성에 대해서는 동일 제목을 군집으로 하는 군집강건 표준오차로 유의성을 다시 계산한다. 계수는 그대로이고 표준오차만 달라지는 방식이다. 다항 로짓이 가정하는 무관 대안의 독립성(IIA)에 대해서는 정식 검정 대신 공정 단독형을 제외하고 통합형 대 접합 단독형의 이항 로짓을 추정해 실질적 해석이 유지되는지를 보는 대안 제외 민감도 분석을 부록 A에 두었다. 가설 판정에는 5% 유의수준을 쓰되 단일 p값만으로 정하지 않고, 기준모형과 대안 표본·정의, 군집 표준오차에서 계수의 방향, 효과 크기, 유의성이 일관되는지를 함께 본다. p ≥ 0.05는 효과가 없다는 증명이 아니라 5% 수준에서 명확한 증거가 부족하다는 뜻이며, 핵심 효과비에는 95% 신뢰구간을 함께 제시한다. 모든 계수는 인과효과가 아니라 관찰된 변수를 통제한 조건부 연관으로 해석한다.</w:t>
+        <w:t xml:space="preserve"> </w:t>
+      </w:r>
+      <w:r>
+        <w:t xml:space="preserve">표본은 2019년 이전에 핵심 기술이 없는 접합 출원이 12건뿐이어서 H3의 검정에는 쓰지 않는다. 같은 제목의 출원이 여러 출원청에 반복되어 관측치가 독립이 아닐 가능성에 대해서는 동일 제목을 군집으로 하는 군집강건 표준오차로 유의성을 다시 계산한다. 계수는 그대로이고 표준오차만 달라지는 방식이다. 다항 로짓이 가정하는 무관 대안의 독립성(IIA)에 대해서는 정식 검정 대신 공정 단독형을 제외하고 통합형 대 접합 단독형의 이항 로짓을 추정해 실질적 해석이 유지되는지를 보는 대안 제외 민감도 분석을 부록 A에 두었다. 가설 판정에는 5% 유의수준을 쓰되 단일 p값만으로 정하지 않고, 기준모형과 대안 표본·정의, 군집 표준오차에서 계수의 방향, 효과 크기, 유의성이 일관되는지를 함께 본다. p ≥ 0.05는 효과가 없다는 증명이 아니라 5% 수준에서 명확한 증거가 부족하다는 뜻이며, 핵심 효과비에는 95% 신뢰구간을 함께 제시한다. 모든 계수는 인과효과가 아니라 관찰된 변수를 통제한 조건부 연관으로 해석한다.</w:t>
       </w:r>
     </w:p>
     <w:bookmarkEnd w:id="37"/>
@@ -6023,7 +6100,7 @@
         <w:pStyle w:val="BodyText"/>
       </w:pPr>
       <w:r>
-        <w:t xml:space="preserve">그 비중은 시기에 따라 크게 달랐다. 표 7과 그림 6은 출원 집중도를 고려해 세 시기로 나눈 유형 분포다. 출원이 드문 1968–2014년을 한 시기로 묶고, 이후는 2015–2019년과 2020–2024년으로 나누었다. 공정 단독형의 비중은 2014년 이전 43.6%에서 2015–2019년 14.8%, 2020–2024년 10.4%로 계속 줄었다. 통합형은 31.3%에서 62.2%로 크게 늘었다가 44.3%로 낮아졌고, 접합 단독형은 25.1%와 23.0%에서 45.4%로 늘었다. 융합의 전개는 세 국면으로 읽힌다. 2014년 이전에는 공정 단독형이 가장 많았고, 2015–2019년에는 통합형이 62.2%로 정점에 이르러, 두 공정의 기술이 한 발명에 함께 담기는 일이 가장 흔했다. 2020–2024년에는 통합형이 낮아지고 접합 단독형이 가장 많은 유형이 되었다. 이하에서는 세 국면을 각각 형성기, 확산기, 재편기라 부른다. 같은 세 시기에 접합 출원 가운데 핵심 기술을 담은 비중은 53.5%, 78.7%, 88.0%로 높아졌다(제4.4절). 융합이 오르내리는 동안 발명은 하나의 핵심 설계로 모여들었다.</w:t>
+        <w:t xml:space="preserve">그 비중은 시기에 따라 크게 달랐다. 표 7과 그림 6은 출원 집중도를 고려해 세 시기로 나눈 유형 분포다. 출원이 드문 1968–2014년을 한 시기로 묶고, 이후는 2015–2019년과 2020–2024년으로 나누었다. 공정 단독형의 비중은 2014년 이전 43.6%에서 2015–2019년 14.8%, 2020–2024년 10.4%로 계속 줄었다. 통합형은 31.3%에서 62.2%로 크게 늘었다가 44.3%로 낮아졌고, 접합 단독형은 25.1%와 23.0%에서 45.4%로 늘었다. 융합의 전개는 세 국면으로 읽힌다. 2014년 이전에는 공정 단독형이 가장 많았고, 2015–2019년에는 통합형이 62.2%로 정점에 이르러, 두 공정의 기술이 한 발명에 함께 담기는 일이 가장 흔했다. 2020–2024년에는 통합형이 낮아지고 접합 단독형(45.4%)이 통합형(44.3%)과 비슷한 수준으로 늘었다. 이하에서는 세 국면을 각각 형성기, 확산기, 재편기라 부른다. 같은 세 시기에 접합 출원 가운데 핵심 기술(제4.4절)을 담은 비중은 53.5%, 78.7%, 88.0%로 높아졌다. 융합이 오르내리는 동안 발명은 하나의 핵심 설계로 모여든 것으로 보인다.</w:t>
       </w:r>
     </w:p>
     <w:p>
@@ -6649,7 +6726,7 @@
         <w:pStyle w:val="BodyText"/>
       </w:pPr>
       <w:r>
-        <w:t xml:space="preserve">표 8은 출원이 제조공정 기호(H01L21)를 가지는지에 대한 이항 로짓이다. 시기별 분포에서 본 제조공정 분류의 감소는 이 모형에서도 나타난다. 출원연도의 승산비는 1보다 작아(연간 OR 0.946, p &lt; 0.01), 최근 출원일수록 제조공정 기호를 가질 승산이 낮다. 기술범위도 강하게 관련되어, 세부 분류가 하나 늘 때마다 제조공정 기호를 가질 승산이 약 27% 높아진다(OR 1.267, p &lt; 0.01). 모형의 판별력을 나타내는 ROC 곡선 하면적은 0.707로, Hosmer et al.(2013)의 기준에서 받아들일 만한 수준의 하한에 해당한다. 표 8의 이항 로짓은 제조공정 분류의 전반적 보유 여부를 확인하는 보완분석이다.</w:t>
+        <w:t xml:space="preserve">표 8은 출원이 제조공정 기호(H01L21)를 가지는지에 대한 이항 로짓이다. 시기별 분포에서 본 제조공정 분류의 감소는 이 모형에서도 나타난다. 출원연도의 승산비는 1보다 작아(연간 OR 0.946, p &lt; 0.01), 최근 출원일수록 제조공정 기호를 가질 승산이 낮다. 기술범위도 강하게 관련되어, 세부 분류가 하나 늘 때마다 제조공정 기호를 가질 승산이 약 27% 높아진다(OR 1.267, p &lt; 0.01). 모형의 판별력을 나타내는 ROC 곡선 아래 면적(AUC)은 0.707로, Hosmer et al.(2013)의 기준에서 받아들일 만한 수준의 하한에 해당한다.</w:t>
       </w:r>
     </w:p>
     <w:p>
@@ -6958,13 +7035,13 @@
       </w:tr>
     </w:tbl>
     <w:bookmarkEnd w:id="42"/>
-    <w:bookmarkStart w:id="46" w:name="경계를-넘는-특허와-융합의-무게중심-이동"/>
+    <w:bookmarkStart w:id="46" w:name="경계를-넘는-특허와-출원의-무게중심-이동"/>
     <w:p>
       <w:pPr>
         <w:pStyle w:val="Heading3"/>
       </w:pPr>
       <w:r>
-        <w:t xml:space="preserve">5.2 경계를 넘는 특허와 융합의 무게중심 이동</w:t>
+        <w:t xml:space="preserve">5.2 경계를 넘는 특허와 출원의 무게중심 이동</w:t>
       </w:r>
     </w:p>
     <w:p>
@@ -6972,7 +7049,7 @@
         <w:pStyle w:val="FirstParagraph"/>
       </w:pPr>
       <w:r>
-        <w:t xml:space="preserve">표 9는 접합 단독형을 기준으로 통합형과 공정 단독형의 상대위험비를 보고하는 다항 로짓이다. 이것이 경계 넘기에 대한 본 검정이다. 그림 7은 이 모형에서 기술범위와 출원연도를 바꾸었을 때 세 유형의 예측확률을 보여준다(다른 변수는 각 출원의 관측값에 둔 채 평균).</w:t>
+        <w:t xml:space="preserve">표 9는 접합 단독형을 기준으로 통합형과 공정 단독형의 상대위험비를 보고하는 다항 로짓이다. 이것이 경계 넘기에 대한 본 검정이다. 그림 7은 이 모형에서 기술범위와 출원연도를 바꾸었을 때 세 유형의 예측확률을 보여 준다(다른 변수는 각 출원의 관측값에 둔 채 평균).</w:t>
       </w:r>
     </w:p>
     <w:p>
@@ -6990,7 +7067,7 @@
         <w:t xml:space="preserve"> </w:t>
       </w:r>
       <w:r>
-        <w:t xml:space="preserve">세부 분류가 하나 늘 때마다 접합 단독형 대비 통합형일 상대위험은 40% 높아지고(RRR 1.403, p &lt; 0.01), 공정 단독형일 상대위험은 10% 낮아진다(RRR 0.905, p &lt; 0.05). 크기로 보면 기술범위가 3인 출원은 통합형으로 예측될 확률이 0.26, 접합 단독형 0.50, 공정 단독형 0.24이지만, 기술범위가 8인 출원은 통합형 0.68, 접합 단독형 0.24, 공정 단독형 0.08이다(그림 7 왼쪽). 넓은 출원은 두 영역에 걸치고, 좁은 출원은 한 영역에 머문다. 이 연관은 세 국면 모두에서 나타난다. 시기별로 따로 추정하면 통합형의 상대위험비는 형성기 1.179, 확산기 1.513, 재편기 1.414로 모두 1% 수준에서 유의하다(첫 시기에는 비어 있는 출원청 칸이 많아 출원청 더미를 빼고 추정). 경계를 넘는 특허가 더 다양한 세부 기술을 담는다는 것은 융합의 국면과 상관없는 특징이다. H1은 통합형 특허가 선택된 CPC 영역 안에서 더 다양한 세부 기술을 포함한다는 구성적 특징으로서 지지된다.</w:t>
+        <w:t xml:space="preserve">세부 분류가 하나 늘 때마다 접합 단독형 대비 통합형일 상대위험은 40% 높아지고(RRR 1.403, p &lt; 0.01), 공정 단독형일 상대위험은 10% 낮아진다(RRR 0.905, p &lt; 0.05). 크기로 보면 기술범위가 3인 출원은 통합형으로 예측될 확률이 0.26, 접합 단독형 0.50, 공정 단독형 0.24이지만, 기술범위가 8인 출원은 통합형 0.68, 접합 단독형 0.24, 공정 단독형 0.08이다(그림 7 왼쪽). 넓은 출원은 두 영역에 걸치고, 좁은 출원은 한 영역에 머문다. 이 연관은 세 국면 모두에서 나타난다. 시기별로 따로 추정하면 통합형의 상대위험비는 형성기 1.179, 확산기 1.513, 재편기 1.414로 모두 1% 수준에서 유의하다(첫 시기에는 비어 있는 출원청 칸이 많아 출원청 더미를 빼고 추정). 경계를 넘는 특허가 더 다양한 세부 기술을 담는다는 것은 세 국면 모두에서 유지된 특징이다. H1은 통합형 특허가 선택된 CPC 영역 안에서 더 다양한 세부 기술을 포함한다는 구성적 특징으로서 지지된다.</w:t>
       </w:r>
     </w:p>
     <w:p>
@@ -7008,7 +7085,7 @@
         <w:t xml:space="preserve"> </w:t>
       </w:r>
       <w:r>
-        <w:t xml:space="preserve">공정 단독형의 상대위험은 해마다 약 8.7%씩 떨어지는 반면(RRR 0.913, p &lt; 0.01), 통합형의 상대위험은 전 기간의 선형 추세로는 변하지 않는다(RRR 0.993, 비유의). 2010년 출원의 공정 단독형 예측확률은 0.27이지만 2022년 출원은 0.12이며, 같은 기간 접합 단독형은 0.31에서 0.40으로 늘고 통합형은 0.43에서 0.47로 거의 변하지 않는다(그림 7 오른쪽). 표 8에서 본 제조공정 분류의 감소는 주로 공정 단독형의 감소에서 온 것이다. 선형 연도 대신 기간 더미를 넣은 다항 로짓에서도 같은 그림이 나온다. 2014년 이전 대비 공정 단독형의 상대위험은 2015–2019년 0.273, 2020–2024년 0.101(모두 p &lt; 0.01)로 낮아지고, 통합형은 1.707(p = 0.09)로 올랐다가 0.762(비유의)로 내려온다. 2010년 이후 표본(N = 830)에서는 통합형의 연도 계수도 1보다 유의하게 작다(RRR 0.934, p &lt; 0.05). 융합의 무게중심은 제조공정 쪽에서 접합 쪽으로 옮겨 갔다. H2는 지지된다.</w:t>
+        <w:t xml:space="preserve">공정 단독형의 상대위험은 해마다 약 8.7%씩 떨어지는 반면(RRR 0.913, p &lt; 0.01), 통합형의 상대위험에는 전 기간에 걸친 유의한 선형 추세가 없다(RRR 0.993). 2010년 출원의 공정 단독형 예측확률은 0.27이지만 2022년 출원은 0.12이며, 같은 기간 접합 단독형은 0.31에서 0.40으로 늘고 통합형은 0.43에서 0.47로 거의 변하지 않는다(그림 7 오른쪽). 표 8에서 본 제조공정 분류의 선형 감소는 주로 공정 단독형의 감소에서 온 것이다. 선형 연도 대신 기간 더미를 넣은 다항 로짓에서도 같은 그림이 나온다. 2014년 이전 대비 공정 단독형의 상대위험은 2015–2019년 0.273, 2020–2024년 0.101(모두 p &lt; 0.01)로 낮아지고, 통합형은 1.707(p = 0.09)로 올랐다가 0.762(비유의)로 내려온다. 2010년 이후 표본(N = 830)에서는 통합형의 연도 계수도 1보다 유의하게 작고(RRR 0.934, p &lt; 0.05), 좁은 제조공정 정의와 무관 용법 제외 표본에서도 마찬가지다(부록 A). 출원의 무게중심은 제조공정 쪽에서 접합 쪽으로 옮겨 갔다. H2는 지지된다.</w:t>
       </w:r>
     </w:p>
     <w:p>
@@ -7575,13 +7652,13 @@
       </w:tr>
     </w:tbl>
     <w:bookmarkEnd w:id="46"/>
-    <w:bookmarkStart w:id="47" w:name="융합-위치의-이동-핵심-기술과-공동분류-유형"/>
+    <w:bookmarkStart w:id="47" w:name="융합-자리의-이동-핵심-기술과-공동분류-유형"/>
     <w:p>
       <w:pPr>
         <w:pStyle w:val="Heading3"/>
       </w:pPr>
       <w:r>
-        <w:t xml:space="preserve">5.3 융합 위치의 이동: 핵심 기술과 공동분류 유형</w:t>
+        <w:t xml:space="preserve">5.3 융합 자리의 이동: 핵심 기술과 공동분류 유형</w:t>
       </w:r>
     </w:p>
     <w:p>
@@ -7589,7 +7666,7 @@
         <w:pStyle w:val="FirstParagraph"/>
       </w:pPr>
       <w:r>
-        <w:t xml:space="preserve">표 10은 H3의 검정 결과다. 형성기인 2014년 이전에는 핵심 기술을 담은 접합 출원의 79.6%가 통합형이었지만 핵심 기술이 없는 출원은 27.7%에 그쳤고, 출원청을 통제한 핵심 기술의 승산비는 11.071(p &lt; 0.01)이다. 확산기인 2015–2019년에도 핵심 기술을 담은 출원이 더 자주 통합형이었지만(77.1% 대 57.9%, 승산비 2.452, p &lt; 0.05), 그 승산비는 2014년 이전의 0.221배로 줄었다(p &lt; 0.05). 재편기인 2020–2024년에는 핵심 기술을 담은 출원의 통합형 비중이 48.4%로 낮아져 핵심 기술이 없는 출원(56.9%)과 차이가 없다(승산비 0.658, p = 0.15). 이 시기의 승산비는 2014년 이전의 0.059배다(p &lt; 0.01). 핵심 기술을 담은 출원이 경계를 넘는 경향은 형성기에 뚜렷했고 재편기에는 사라졌다. H3은 지지된다.</w:t>
+        <w:t xml:space="preserve">표 10은 H3의 검정 결과다. 형성기인 2014년 이전에는 핵심 기술을 담은 접합 출원의 79.6%가 통합형이었지만 핵심 기술이 없는 출원은 27.7%에 그쳤고, 출원청을 통제한 핵심 기술의 승산비는 11.071(p &lt; 0.01)이다. 확산기인 2015–2019년에도 핵심 기술을 담은 출원이 더 자주 통합형이었지만(77.1% 대 57.9%, 승산비 2.452, p &lt; 0.05), 그 승산비는 2014년 이전의 0.221배로 줄었다(p &lt; 0.05). 재편기인 2020–2024년에는 핵심 기술을 담은 출원의 통합형 비중이 48.4%로 낮아져 핵심 기술이 없는 출원(56.9%)과 유의한 차이가 없다(승산비 0.658, p = 0.15). 이 시기의 승산비는 2014년 이전의 0.059배다(p &lt; 0.01). 핵심 기술을 담은 출원이 경계를 넘는 경향은 형성기에 뚜렷했고 재편기에는 사라졌다. H3은 지지된다.</w:t>
       </w:r>
     </w:p>
     <w:p>
@@ -8171,7 +8248,7 @@
         <w:pStyle w:val="BodyText"/>
       </w:pPr>
       <w:r>
-        <w:t xml:space="preserve">변화는 핵심 기술 쪽에서 일어났다. 핵심 기술이 없는 접합 출원의 통합형 비중은 27.7%에서 57.9%, 56.9%로 오히려 높아진 반면, 핵심 기술을 담은 출원은 79.6%와 77.1%에서 48.4%로 낮아졌다. 2020–2024년에 핵심 기술을 담은 통합형 출원과 함께 부여된 제조공정 기호는 주로 임시 지지 기판과 봉지 공정의 기호였으며(제4.4절), 이는 접합 원리 자체보다 다이를 취급하고 패키지로 완성하는 공정에 해당한다. 요컨대 초기에는 핵심 기술의 발명이 제조공정 지식을 함께 담았지만, 최근에는 핵심 기술이 접합 분류 안에서 독립적으로 기술되고 제조공정 지식은 다이 취급이나 패키지 공정 같은 주변 공정과 결합하는 방향으로 변화한 것으로 해석된다.</w:t>
+        <w:t xml:space="preserve">변화는 핵심 기술 쪽에서 일어났다. 핵심 기술이 없는 접합 출원의 통합형 비중은 27.7%에서 57.9%, 56.9%로 오히려 높아진 반면, 핵심 기술을 담은 출원은 79.6%와 77.1%에서 48.4%로 낮아졌다. 핵심 기술과 함께 부여된 제조공정 기호도 시기에 따라 달랐다. 핵심 기술을 담은 통합형 출원에서 가장 흔한 H01L21 기호는 2015–2019년에는 반도체 몸체끼리의 접합(21/187, 22건)과 기판 관통 배선(21/76898, 21건)이었고, 2020–2024년에는 임시 지지 기판을 이용한 취급(21/6835, 48건)과 봉지 공정용 임시 기판(21/568, 43건)이었다. 뒤의 두 기호는 접합 원리 자체보다 다이를 취급하고 패키지로 완성하는 공정에 해당한다. 요컨대 초기에는 핵심 기술을 담은 발명이 다른 접합 발명보다 제조공정 지식을 훨씬 자주 담았지만, 최근에는 그 차이가 사라졌고 핵심 기술과 함께 부여되는 제조공정도 다이 취급이나 패키지 공정 같은 주변 공정으로 바뀐 것으로 해석된다.</w:t>
       </w:r>
     </w:p>
     <w:bookmarkEnd w:id="47"/>
@@ -8759,10 +8836,26 @@
             </w:pPr>
             <w:r>
               <w:rPr>
-                <w:sz w:val="18"/>
-                <w:szCs w:val="18"/>
-              </w:rPr>
-              <w:t xml:space="preserve">핵심 표본(제목에 hybrid bonding)</w:t>
+                <w:i/>
+                <w:iCs/>
+                <w:sz w:val="18"/>
+                <w:szCs w:val="18"/>
+              </w:rPr>
+              <w:t xml:space="preserve">hybrid bonding</w:t>
+            </w:r>
+            <w:r>
+              <w:rPr>
+                <w:sz w:val="18"/>
+                <w:szCs w:val="18"/>
+              </w:rPr>
+              <w:t xml:space="preserve"> </w:t>
+            </w:r>
+            <w:r>
+              <w:rPr>
+                <w:sz w:val="18"/>
+                <w:szCs w:val="18"/>
+              </w:rPr>
+              <w:t xml:space="preserve">표본(제목 기준)</w:t>
             </w:r>
           </w:p>
         </w:tc>
@@ -8913,7 +9006,7 @@
         <w:t xml:space="preserve"> </w:t>
       </w:r>
       <w:r>
-        <w:t xml:space="preserve">제4.2절에서 밝혔듯이 H01L21에는 패키징 단계의 제조공정도 들어 있다. 이를 제조공정으로 세지 않는 좁은 정의를 쓰면(어느 기호도 남지 않는 20건 제외, N = 908) 제조공정 기호를 가진 출원은 52.0%로 낮아지고, 유형 분포는 접합 단독형 46.8%, 통합형 37.2%, 공정 단독형 16.0%로 바뀌어 접합 단독형이 가장 많아진다. 즉 통합형이 최다 유형이라는 기술통계는 정의에 따라 달라지지만, 좁은 정의에서도 출원의 3분의 1 이상이 두 영역의 기호를 함께 가지며, H1과 H2의 계수는 부호와 유의성이 그대로다.</w:t>
+        <w:t xml:space="preserve">제4.2절에서 밝혔듯이 H01L21에는 패키징 단계의 제조공정도 들어 있다. 이를 제조공정으로 세지 않는 좁은 정의를 쓰면(어느 기호도 남지 않는 20건 제외, N = 908) 제조공정 기호를 가진 출원은 전체 928건의 52.0%로 낮아지고, 908건의 유형 분포는 접합 단독형 46.8%, 통합형 37.2%, 공정 단독형 16.0%로 바뀌어 접합 단독형이 가장 많아진다. 즉 통합형이 최다 유형이라는 기술통계는 정의에 따라 달라지지만, 좁은 정의에서도 출원의 3분의 1 이상이 두 영역의 기호를 함께 가지며, H1과 H2의 계수는 부호와 유의성이 그대로다.</w:t>
       </w:r>
     </w:p>
     <w:p>
@@ -8931,7 +9024,7 @@
         <w:t xml:space="preserve"> </w:t>
       </w:r>
       <w:r>
-        <w:t xml:space="preserve">무관한 용법 68건을 뺀 표본(N = 860)에서 유형 분포는 통합형 47.4%, 접합 단독형 35.4%, 공정 단독형 17.2%이며 핵심 계수는 모두 유지된다. 제목에</w:t>
+        <w:t xml:space="preserve">무관한 용법 68건을 뺀 표본(N = 860)에서 유형 분포는 통합형 47.4%, 접합 단독형 35.4%, 공정 단독형 17.2%이며 핵심 계수는 모두 유지된다.</w:t>
       </w:r>
       <w:r>
         <w:t xml:space="preserve"> </w:t>
@@ -8944,7 +9037,10 @@
         <w:t xml:space="preserve">hybrid bonding</w:t>
       </w:r>
       <w:r>
-        <w:t xml:space="preserve">이 들어 있는 핵심 표본(N = 467)에서는 통합형 49.5%, 접합 단독형 38.3%, 공정 단독형 12.2%이며, 범위 → 통합형의 상대위험비(1.485)는 1% 수준에서 유지된다. 다만 이 표본은 2015년 이전 출원이 30건뿐이어서 연도 계수는 유의하지 않다(1.029). 공정 단독형의 감소는 상당 부분</w:t>
+        <w:t xml:space="preserve"> </w:t>
+      </w:r>
+      <w:r>
+        <w:t xml:space="preserve">표본(N = 467)에서는 통합형 49.5%, 접합 단독형 38.3%, 공정 단독형 12.2%이며, 범위 → 통합형의 상대위험비(1.485)는 1% 수준에서 유지된다. 다만 이 표본은 2014년 이전 출원이 30건뿐이어서 연도 계수는 유의하지 않다(1.029). 공정 단독형의 감소가</w:t>
       </w:r>
       <w:r>
         <w:t xml:space="preserve"> </w:t>
@@ -8957,10 +9053,7 @@
         <w:t xml:space="preserve">direct bonding</w:t>
       </w:r>
       <w:r>
-        <w:t xml:space="preserve"> </w:t>
-      </w:r>
-      <w:r>
-        <w:t xml:space="preserve">시기의 웨이퍼 접합 공정 출원에서</w:t>
+        <w:t xml:space="preserve">이라는 말이 주로 쓰이던 시기의 웨이퍼 접합 공정 출원에서</w:t>
       </w:r>
       <w:r>
         <w:t xml:space="preserve"> </w:t>
@@ -8976,7 +9069,7 @@
         <w:t xml:space="preserve"> </w:t>
       </w:r>
       <w:r>
-        <w:t xml:space="preserve">시기의 구조 출원으로 넘어온 변화이며, 핵심 표본만으로는 그 이전 시기를 관찰할 수 없기 때문이다.</w:t>
+        <w:t xml:space="preserve">시기의 구조 출원으로 넘어온 변화를 상당 부분 반영하는데, 이 표본으로는 그 앞 시기를 충분히 관찰할 수 없기 때문으로 보인다.</w:t>
       </w:r>
     </w:p>
     <w:p>
@@ -8994,7 +9087,7 @@
         <w:t xml:space="preserve"> </w:t>
       </w:r>
       <w:r>
-        <w:t xml:space="preserve">표 12는 H3의 재추정 결과다. 2014년 이전의 승산비가 1보다 크고, 2020–2024년의 승산비가 1과 다르지 않으며, 그 차이(마지막 열)가 유의하게 1보다 작다는 결과는 일곱 가지 추정에서 모두 유지된다. 핵심 기호 외의 접합 기호 수를 통제해도(그 자체의 승산비 1.100, p &lt; 0.01) 시기별 승산비는 거의 그대로다. 결과가 가장 약해지는 것은 무관 용법을 뺀 표본이다. 2014년 이전의 승산비가 3.981로 작아지는데, 접합 기호를 가진 무관한 출원 51건 가운데 28건이 2014년 이전의 핵심 기술 없는 출원이고 그중 25건이 접합 단독형이었기 때문이다. 이 표본에서도 2014년 이전의 승산비(p &lt; 0.05)와 2020–2024년의 상호작용(0.185, p &lt; 0.05)은 유의하다. 다만 2015–2019년의 승산비는 군집 표준오차와 무관 용법 제외 표본에서 유의성을 잃으므로, 차이가 줄어든 시점이 2015–2019년부터인지 2020–2024년인지는 확정하지 않는다.</w:t>
+        <w:t xml:space="preserve">표 12는 H3의 재추정 결과다. 2014년 이전의 승산비가 1보다 크고, 2020–2024년의 승산비가 1과 유의하게 다르지 않으며, 그 차이(마지막 열)가 유의하게 1보다 작다는 결과는 일곱 가지 추정에서 모두 유지된다. 핵심 기호 외의 접합 기호 수를 통제해도(그 자체의 승산비 1.100, p &lt; 0.01) 시기별 승산비는 거의 그대로다. 결과가 가장 약해지는 것은 무관 용법을 뺀 표본이다. 2014년 이전의 승산비가 3.981로 작아지는데, 접합 기호를 가진 무관한 출원 51건 가운데 28건이 2014년 이전의 핵심 기술 없는 출원이고 그중 25건이 접합 단독형이었기 때문이다. 이 표본에서도 2014년 이전의 승산비(p &lt; 0.05)와 2020–2024년의 상호작용(0.185, p &lt; 0.05)은 유의하다. 다만 2015–2019년의 승산비는 군집 표준오차와 무관 용법 제외 표본에서 유의성을 잃으므로, 핵심 기술의 우위가 사라진 시점이 확산기인지 재편기인지는 확정하지 않는다.</w:t>
       </w:r>
     </w:p>
     <w:p>
@@ -10072,7 +10165,7 @@
         <w:t xml:space="preserve"> </w:t>
       </w:r>
       <w:r>
-        <w:t xml:space="preserve">좁은 제조공정 정의에서는 패키징 단계 공정 기호만 가진 출원을 접합 단독형으로 다시 분류하므로 표본 수는 같고 통합형이 338건이 된다. 제목에</w:t>
+        <w:t xml:space="preserve">좁은 제조공정 정의에서는 제조공정 기호가 패키징 단계 공정 기호뿐인 통합형 출원을 접합 단독형으로 다시 분류하므로 표본 수는 같고 통합형이 338건이 된다.</w:t>
       </w:r>
       <w:r>
         <w:t xml:space="preserve"> </w:t>
@@ -10085,7 +10178,10 @@
         <w:t xml:space="preserve">hybrid bonding</w:t>
       </w:r>
       <w:r>
-        <w:t xml:space="preserve">이 있는 핵심 표본은 2020년 이전에 핵심 기술이 없는 접합 출원이 12건뿐이어서 추정하지 않았다.</w:t>
+        <w:t xml:space="preserve"> </w:t>
+      </w:r>
+      <w:r>
+        <w:t xml:space="preserve">표본은 2019년 이전에 핵심 기술이 없는 접합 출원이 12건뿐이어서 추정하지 않았다.</w:t>
       </w:r>
     </w:p>
     <w:bookmarkEnd w:id="48"/>
@@ -10303,7 +10399,7 @@
                 <w:sz w:val="14"/>
                 <w:szCs w:val="14"/>
               </w:rPr>
-              <w:t xml:space="preserve">RRR 1.403***(95% CI 1.321–1.489; 표 9); 세 시기 모두 1.179–1.513***; 모든 재추정에서 1.295–1.485***(표 11)</w:t>
+              <w:t xml:space="preserve">RRR 1.403***(95% CI 1.321–1.489; 표 9); 세 시기 모두 1.179–1.513***; 표 11의 모든 재추정에서 1.295–1.485***</w:t>
             </w:r>
           </w:p>
         </w:tc>
@@ -10365,7 +10461,7 @@
                 <w:sz w:val="14"/>
                 <w:szCs w:val="14"/>
               </w:rPr>
-              <w:t xml:space="preserve">최근 출원일수록 공정 단독형이 드묾</w:t>
+              <w:t xml:space="preserve">최근 출원일수록 접합 단독형 대비 공정 단독형이 드묾</w:t>
             </w:r>
           </w:p>
         </w:tc>
@@ -10384,7 +10480,37 @@
                 <w:sz w:val="14"/>
                 <w:szCs w:val="14"/>
               </w:rPr>
-              <w:t xml:space="preserve">RRR 0.913***(95% CI 0.887–0.940; 표 9); 기간 더미 0.273***/0.101***; 재추정에서 0.820–0.935***(표 11); 다만 2015년 이전 출원이 30건뿐인 핵심 표본에서는 시간 추세가 식별되지 않음</w:t>
+              <w:t xml:space="preserve">RRR 0.913***(95% CI 0.887–0.940; 표 9); 기간 더미 0.273***/0.101***; 재추정에서 0.820–0.935***(표 11); 다만 2014년 이전 출원이 30건뿐인</w:t>
+            </w:r>
+            <w:r>
+              <w:rPr>
+                <w:sz w:val="14"/>
+                <w:szCs w:val="14"/>
+              </w:rPr>
+              <w:t xml:space="preserve"> </w:t>
+            </w:r>
+            <w:r>
+              <w:rPr>
+                <w:i/>
+                <w:iCs/>
+                <w:sz w:val="14"/>
+                <w:szCs w:val="14"/>
+              </w:rPr>
+              <w:t xml:space="preserve">hybrid bonding</w:t>
+            </w:r>
+            <w:r>
+              <w:rPr>
+                <w:sz w:val="14"/>
+                <w:szCs w:val="14"/>
+              </w:rPr>
+              <w:t xml:space="preserve"> </w:t>
+            </w:r>
+            <w:r>
+              <w:rPr>
+                <w:sz w:val="14"/>
+                <w:szCs w:val="14"/>
+              </w:rPr>
+              <w:t xml:space="preserve">표본에서는 시간 추세가 식별되지 않음</w:t>
             </w:r>
           </w:p>
         </w:tc>
@@ -10525,7 +10651,7 @@
         <w:t xml:space="preserve"> </w:t>
       </w:r>
       <w:r>
-        <w:t xml:space="preserve">이 논문의 결과를 시간 순서로 엮으면 표 14와 같다. 융합을 단순하게 생각하면 경계를 넘는 특허의 비중이 시간이 갈수록 계속 늘 것으로 기대하게 된다. 결과는 그렇지 않았다. 형성기(2014년 이전)에는 평탄화, 표면 활성화, 웨이퍼 접합 같은 제조공정 발명이 홀로 나오는 경우가 가장 많았고(공정 단독형 43.6%), 접합의 핵심을 다루는 발명은 대부분 제조공정 지식을 함께 담았다(핵심 기술의 승산비 11.071). 확산기(2015–2019년)에는 공정 발명이 홀로 분류되기보다 접합 기술과 함께 분류되면서 통합형이 62.2%로 정점에 이르렀다. 재편기(2020–2024년)에는 통합형이 44.3%로 낮아지고 접합 단독형이 45.4%로 늘었다. 이 시기에는 핵심 기술을 담은 출원이 그렇지 않은 출원보다 경계를 더 자주 넘지 않았고(승산비 0.658, 비유의), 제조공정과의 결합은 임시 지지 기판과 봉지 같은 다이 취급 공정에서 나타났다. 핵심 기술이 없는 접합 출원의 통합형 비중은 오히려 27.7%에서 56.9%로 높아졌다. 출원당 기호 수도 같은 방향이다. 접합 계열(H01L24) 기호는 2014년 이전 3.03개에서 2015–2019년 4.73개로 늘었다가 2020–2024년 3.91개로 줄었고, 제조공정 계열(H01L21) 기호는 2.12개와 2.23개에서 1.46개로 줄었다.</w:t>
+        <w:t xml:space="preserve">본 연구의 결과를 시간 순서로 엮으면 표 14와 같다. 융합을 단순하게 생각하면 경계를 넘는 특허의 비중이 시간이 갈수록 계속 늘 것으로 기대하게 된다. 결과는 그렇지 않았다. 형성기(2014년 이전)에는 평탄화, 표면 활성화, 웨이퍼 접합 같은 제조공정 발명이 홀로 나오는 경우가 가장 많았고(공정 단독형 43.6%), 접합의 핵심을 다루는 발명은 대부분 제조공정 지식을 함께 담았다(핵심 기술의 승산비 11.071). 확산기(2015–2019년)에는 공정 발명이 홀로 분류되기보다 접합 기술과 함께 분류되면서 통합형이 62.2%로 정점에 이르렀다. 재편기(2020–2024년)에는 통합형이 44.3%로 낮아지고 접합 단독형이 45.4%로 늘었다. 이 시기에는 핵심 기술을 담은 출원이 그렇지 않은 출원보다 경계를 더 자주 넘지 않았고(승산비 0.658, 비유의), 핵심 기술과 함께 부여된 제조공정은 임시 지지 기판과 봉지 같은 다이 취급 공정이 가장 많았다. 핵심 기술이 없는 접합 출원의 통합형 비중은 오히려 27.7%에서 56.9%로 높아졌다. 출원당 기호 수도 같은 흐름을 보인다. 접합 계열(H01L24) 기호는 2014년 이전 3.03개에서 2015–2019년 4.73개로 늘었다가 2020–2024년 3.91개로 줄었고, 제조공정 계열(H01L21) 기호는 2.12개와 2.23개에서 1.46개로 줄었다.</w:t>
       </w:r>
     </w:p>
     <w:p>
@@ -10544,13 +10670,13 @@
         <w:t xml:space="preserve"> </w:t>
       </w:r>
       <w:r>
-        <w:t xml:space="preserve">하이브리드 본딩에서 공정단계 간 융합의 세 국면(유형 비중은 표 7, 핵심 기술은 표 10과 제4.4절).</w:t>
+        <w:t xml:space="preserve">하이브리드 본딩에서 공정 단계 간 융합의 세 국면(유형 비중은 표 7, 핵심 기술 비중은 제5.1절, 승산비는 표 10, 주요 제조공정은 제5.3절).</w:t>
       </w:r>
     </w:p>
     <w:tbl>
       <w:tblPr>
         <w:tblStyle w:val="Table"/>
-        <w:tblW w:type="dxa" w:w="9073"/>
+        <w:tblW w:type="dxa" w:w="9072"/>
         <w:tblLayout w:type="fixed"/>
         <w:tblLook w:firstRow="1" w:lastRow="0" w:firstColumn="0" w:lastColumn="0" w:noHBand="0" w:noVBand="0" w:val="0020"/>
         <w:tblCellMar>
@@ -10569,13 +10695,13 @@
         </w:tblBorders>
       </w:tblPr>
       <w:tblGrid>
-        <w:gridCol w:w="1708"/>
+        <w:gridCol w:w="1730"/>
         <w:gridCol w:w="824"/>
         <w:gridCol w:w="824"/>
         <w:gridCol w:w="824"/>
-        <w:gridCol w:w="1514"/>
-        <w:gridCol w:w="1055"/>
-        <w:gridCol w:w="2324"/>
+        <w:gridCol w:w="1540"/>
+        <w:gridCol w:w="1069"/>
+        <w:gridCol w:w="2261"/>
       </w:tblGrid>
       <w:tr>
         <w:trPr>
@@ -10584,7 +10710,7 @@
         </w:trPr>
         <w:tc>
           <w:tcPr>
-            <w:tcW w:type="dxa" w:w="1708"/>
+            <w:tcW w:type="dxa" w:w="1730"/>
             <w:tcBorders>
               <w:bottom w:val="single" w:sz="4" w:space="0" w:color="000000"/>
             </w:tcBorders>
@@ -10675,7 +10801,7 @@
         </w:tc>
         <w:tc>
           <w:tcPr>
-            <w:tcW w:type="dxa" w:w="1514"/>
+            <w:tcW w:type="dxa" w:w="1540"/>
             <w:tcBorders>
               <w:bottom w:val="single" w:sz="4" w:space="0" w:color="000000"/>
             </w:tcBorders>
@@ -10698,7 +10824,7 @@
         </w:tc>
         <w:tc>
           <w:tcPr>
-            <w:tcW w:type="dxa" w:w="1055"/>
+            <w:tcW w:type="dxa" w:w="1069"/>
             <w:tcBorders>
               <w:bottom w:val="single" w:sz="4" w:space="0" w:color="000000"/>
             </w:tcBorders>
@@ -10721,7 +10847,7 @@
         </w:tc>
         <w:tc>
           <w:tcPr>
-            <w:tcW w:type="dxa" w:w="2324"/>
+            <w:tcW w:type="dxa" w:w="2261"/>
             <w:tcBorders>
               <w:bottom w:val="single" w:sz="4" w:space="0" w:color="000000"/>
             </w:tcBorders>
@@ -10748,7 +10874,7 @@
         </w:trPr>
         <w:tc>
           <w:tcPr>
-            <w:tcW w:type="dxa" w:w="1708"/>
+            <w:tcW w:type="dxa" w:w="1730"/>
           </w:tcPr>
           <w:p>
             <w:pPr>
@@ -10827,7 +10953,7 @@
         </w:tc>
         <w:tc>
           <w:tcPr>
-            <w:tcW w:type="dxa" w:w="1514"/>
+            <w:tcW w:type="dxa" w:w="1540"/>
           </w:tcPr>
           <w:p>
             <w:pPr>
@@ -10847,7 +10973,7 @@
         </w:tc>
         <w:tc>
           <w:tcPr>
-            <w:tcW w:type="dxa" w:w="1055"/>
+            <w:tcW w:type="dxa" w:w="1069"/>
           </w:tcPr>
           <w:p>
             <w:pPr>
@@ -10867,20 +10993,20 @@
         </w:tc>
         <w:tc>
           <w:tcPr>
-            <w:tcW w:type="dxa" w:w="2324"/>
-          </w:tcPr>
-          <w:p>
-            <w:pPr>
-              <w:pStyle w:val="Compact"/>
-              <w:spacing w:before="20" w:after="20" w:line="240" w:lineRule="auto"/>
-              <w:keepNext/>
-            </w:pPr>
-            <w:r>
-              <w:rPr>
-                <w:sz w:val="13"/>
-                <w:szCs w:val="13"/>
-              </w:rPr>
-              <w:t xml:space="preserve">패키지 부품 제조(21/48)</w:t>
+            <w:tcW w:type="dxa" w:w="2261"/>
+          </w:tcPr>
+          <w:p>
+            <w:pPr>
+              <w:pStyle w:val="Compact"/>
+              <w:spacing w:before="20" w:after="20" w:line="240" w:lineRule="auto"/>
+              <w:keepNext/>
+            </w:pPr>
+            <w:r>
+              <w:rPr>
+                <w:sz w:val="13"/>
+                <w:szCs w:val="13"/>
+              </w:rPr>
+              <w:t xml:space="preserve">—</w:t>
             </w:r>
           </w:p>
         </w:tc>
@@ -10891,7 +11017,7 @@
         </w:trPr>
         <w:tc>
           <w:tcPr>
-            <w:tcW w:type="dxa" w:w="1708"/>
+            <w:tcW w:type="dxa" w:w="1730"/>
           </w:tcPr>
           <w:p>
             <w:pPr>
@@ -10970,7 +11096,7 @@
         </w:tc>
         <w:tc>
           <w:tcPr>
-            <w:tcW w:type="dxa" w:w="1514"/>
+            <w:tcW w:type="dxa" w:w="1540"/>
           </w:tcPr>
           <w:p>
             <w:pPr>
@@ -10990,7 +11116,7 @@
         </w:tc>
         <w:tc>
           <w:tcPr>
-            <w:tcW w:type="dxa" w:w="1055"/>
+            <w:tcW w:type="dxa" w:w="1069"/>
           </w:tcPr>
           <w:p>
             <w:pPr>
@@ -11010,7 +11136,7 @@
         </w:tc>
         <w:tc>
           <w:tcPr>
-            <w:tcW w:type="dxa" w:w="2324"/>
+            <w:tcW w:type="dxa" w:w="2261"/>
           </w:tcPr>
           <w:p>
             <w:pPr>
@@ -11034,7 +11160,7 @@
         </w:trPr>
         <w:tc>
           <w:tcPr>
-            <w:tcW w:type="dxa" w:w="1708"/>
+            <w:tcW w:type="dxa" w:w="1730"/>
           </w:tcPr>
           <w:p>
             <w:pPr>
@@ -11113,7 +11239,7 @@
         </w:tc>
         <w:tc>
           <w:tcPr>
-            <w:tcW w:type="dxa" w:w="1514"/>
+            <w:tcW w:type="dxa" w:w="1540"/>
           </w:tcPr>
           <w:p>
             <w:pPr>
@@ -11133,7 +11259,7 @@
         </w:tc>
         <w:tc>
           <w:tcPr>
-            <w:tcW w:type="dxa" w:w="1055"/>
+            <w:tcW w:type="dxa" w:w="1069"/>
           </w:tcPr>
           <w:p>
             <w:pPr>
@@ -11153,7 +11279,7 @@
         </w:tc>
         <w:tc>
           <w:tcPr>
-            <w:tcW w:type="dxa" w:w="2324"/>
+            <w:tcW w:type="dxa" w:w="2261"/>
           </w:tcPr>
           <w:p>
             <w:pPr>
@@ -11187,7 +11313,7 @@
         <w:t xml:space="preserve"> </w:t>
       </w:r>
       <w:r>
-        <w:t xml:space="preserve">핵심 기술의 승산비는 핵심 기술을 담은 접합 출원이 통합형일 승산을 담지 않은 접합 출원과 비교한 값이다(** p &lt; 0.05, *** p &lt; 0.01). 주요 제조공정은 핵심 기술을 담은 통합형 출원에서 가장 흔한 H01L21 기호다.</w:t>
+        <w:t xml:space="preserve">핵심 기술의 승산비는 핵심 기술을 담은 접합 출원이 통합형일 승산을 담지 않은 접합 출원과 비교한 값이다(** p &lt; 0.05, *** p &lt; 0.01). 주요 제조공정은 핵심 기술을 담은 통합형 출원에서 가장 흔한 H01L21 기호다. 형성기의 해당 출원 43건은 소수의 같은 제목 출원에 몰려 있어(가장 흔한 기호도 5개 제목에서 나옴) 대표 기호를 제시하지 않았다.</w:t>
       </w:r>
     </w:p>
     <w:p>
@@ -11195,7 +11321,7 @@
         <w:pStyle w:val="BodyText"/>
       </w:pPr>
       <w:r>
-        <w:t xml:space="preserve">이 전개는 지배적 설계가 자리 잡으면 인터페이스가 고착화되고 이후의 혁신이 정해진 설계 안의 점진적 개선으로 바뀐다는 기술 순환 모형(Anderson and Tushman, 1990)과 맞는다. 접합 출원 가운데 핵심 기술을 담은 비중이 53.5%에서 88.0%로 높아진 것은 발명이 하나의 핵심 설계로 모여들었다는 뜻이고, 그 핵심을 다루는 발명이 더 이상 제조공정 지식을 따로 담지 않게 된 것은 핵심 요소의 설계가 고착화되면 그와 얽힌 요소를 함께 바꿀 필요가 줄어든다는 Murmann과 Frenken(2006)의 논리와 통한다. 적용이 웨이퍼 단위에서 다이 단위 접합으로 넓어지고 HBM과 칩렛이 양산에 가까워지면서(Lau, 2021, 2022), 두 공정이 만나는 지점도 접합 원리에서 다이를 다루고 쌓는 공정으로 옮겨 간 것으로 읽힌다. 따라서 공정 단계 간 융합은 더 많은 특허가 경계를 넘는 방식으로 쌓인 것이 아니라, 경계를 넘는 내용과 자리가 국면마다 바뀌는 방식으로 전개되었다. 이는 Hacklin et al.(2009)의 공진화 논리를 하나의 기술 안에서 관찰한 것에 해당한다.</w:t>
+        <w:t xml:space="preserve">이 전개는 지배적 설계가 자리 잡으면 인터페이스가 고착화되고 이후의 혁신이 정해진 설계 안의 점진적 개선으로 바뀐다는 기술 순환 모형(Anderson and Tushman, 1990)과 맞는다. 접합 출원 가운데 핵심 기술을 담은 비중이 53.5%에서 88.0%로 높아진 것은 발명이 하나의 핵심 설계로 모여든 것으로 읽을 수 있고, 그 핵심을 다루는 발명이 다른 접합 발명보다 제조공정 지식을 더 자주 담지는 않게 된 것은 핵심 요소의 설계가 고착화되면 그와 얽힌 요소를 함께 바꿀 필요가 줄어든다는 Murmann과 Frenken(2006)의 논리와 통한다. 적용이 웨이퍼 단위에서 다이 단위 접합으로 넓어지고 HBM과 칩렛이 양산에 가까워지면서(Lau, 2021, 2022), 두 공정이 만나는 지점도 접합 원리에서 다이를 다루고 쌓는 공정으로 옮겨 간 것으로 읽힌다. 따라서 공정 단계 간 융합은 더 많은 특허가 경계를 넘는 방식으로 쌓인 것이 아니라, 경계를 넘는 내용과 자리가 국면마다 바뀌는 방식으로 전개되었다. 이는 Hacklin et al.(2009)의 공진화 논리를 하나의 기술 안에서 관찰한 것에 해당한다.</w:t>
       </w:r>
     </w:p>
     <w:p>
@@ -11213,7 +11339,7 @@
         <w:t xml:space="preserve"> </w:t>
       </w:r>
       <w:r>
-        <w:t xml:space="preserve">기존 문헌은 융합을 주로 산업과 산업, 기술 분야와 기술 분야 사이의 일로 다루어 왔다(Hacklin et al., 2010; Curran and Leker, 2011). 본 연구의 결과는 같은 개념이 한 산업을 가로지르는 경계, 곧 반도체 제조의 제조공정 영역과 접합 영역 사이에도 적용되며, 그 경계 넘기를 개별 특허에서 관찰할 수 있음을 보여준다. 하이브리드 본딩 관련 특허의 45.8%는 두 영역의 기호를 함께 가지며, 좁은 정의에서도 37.2%가 그렇다. Jacobides et al.(2006)의 말대로 산업 아키텍처가 분업의 틀이라면, 단계 사이의 인터페이스가 흔들릴 때 발명이 그 양쪽을 함께 담기 시작하는 것은 그 틀이 다시 짜이는 데 선행할 수 있는 기술적 상호의존의 확대이며, 본 연구는 이를 특허 공동분류로 포착한다. Kapoor(2013)가 보인 것이 분업 속에서도 조직적 통합이 이어졌다는 사실이라면, 본 연구에서 관찰된 것은 그 통합의 기술적 바탕, 곧 두 영역의 지식이 개별 발명 안에서 결합되고 있다는 사실이다. 융합의 단계 논리(Hacklin et al., 2010)에 따르면 기술의 결합이 조직의 결합에 앞서므로, 경계를 넘는 특허의 분포는 조직 경계의 변화에 앞서 나타나는 지표가 될 수 있다는 가설을 후속 연구에 남긴다.</w:t>
+        <w:t xml:space="preserve">기존 문헌은 융합을 주로 산업과 산업, 기술 분야와 기술 분야 사이의 일로 다루어 왔다(Hacklin et al., 2010; Curran and Leker, 2011). 본 연구의 결과는 같은 개념이 한 산업을 가로지르는 경계, 곧 반도체 제조의 제조공정 영역과 접합 영역 사이에도 적용되며, 그 경계 넘기를 개별 특허에서 관찰할 수 있음을 보여 준다. 하이브리드 본딩 관련 특허의 45.8%는 두 영역의 기호를 함께 가지며, 좁은 정의에서도 37.2%가 그렇다. Jacobides et al.(2006)의 말대로 산업 아키텍처가 분업의 틀이라면, 단계 사이의 인터페이스가 흔들릴 때 발명이 그 양쪽을 함께 담기 시작하는 것은 그 틀이 다시 짜이는 데 선행할 수 있는 기술적 상호의존의 확대이며, 본 연구는 이를 특허 공동분류로 포착한다. Kapoor(2013)가 보인 것이 분업 속에서도 조직적 통합이 이어졌다는 사실이라면, 본 연구에서 관찰된 것은 그 통합의 기술적 바탕, 곧 두 영역의 지식이 개별 발명 안에서 결합되고 있다는 사실이다. 융합의 단계 논리(Hacklin et al., 2010)에 따르면 기술의 결합이 조직의 결합에 앞서므로, 경계를 넘는 특허의 분포는 조직 경계의 변화에 앞서 나타나는 지표가 될 수 있다는 가설을 후속 연구에 남긴다.</w:t>
       </w:r>
     </w:p>
     <w:p>
@@ -11231,7 +11357,7 @@
         <w:t xml:space="preserve"> </w:t>
       </w:r>
       <w:r>
-        <w:t xml:space="preserve">Kodama(1992)의 융합은 기업의 연구개발 조직 수준에서, 융합 지수는 분야 수준에서 정의되었다. 본 연구의 특허 수준 증거는 그 메커니즘을 개별 발명의 기술적 다양성에 놓는다. 더 많은 세부 기술에 걸치는 출원일수록 제조공정과 접합 기호를 함께 가질 가능성이 높고, 좁은 출원은 한 영역에 머무는 경향이 있다. 이 연관은 형성기, 확산기, 재편기 모두에서 나타났으므로, 융합의 자리가 옮겨 가는 동안에도 경계를 넘는 특허의 구성은 같았다. 이는 범위가 가치를 지닌다는 Lerner(1994)의 발견, 잘게 나뉜 기술 시장에서 넓은 포트폴리오가 유리하다는 Ziedonis(2004)의 설명과 맞닿아 있다. 성능과 수율이 인접한 공정 단계의 역량에 좌우되는 기술에서 넓은 기술적 다양성은 권리 보호를 위한 전략인 동시에, 공정 간 융합이 특허 분류에 드러나는 방식이기도 하다.</w:t>
+        <w:t xml:space="preserve">Kodama(1992)의 융합은 기업의 연구개발 조직 수준에서, 융합 지수는 분야 수준에서 정의되었다. 본 연구의 특허 수준 증거는 경계를 넘는 발명의 특징을 기술적 다양성에서 찾는다. 더 많은 세부 기술에 걸치는 출원일수록 제조공정과 접합 기호를 함께 가질 가능성이 높고, 좁은 출원은 한 영역에 머무는 경향이 있다. 이 연관은 형성기, 확산기, 재편기 모두에서 나타나, 융합의 자리가 옮겨 가는 동안에도 유지되었다. 이는 범위가 가치를 지닌다는 Lerner(1994)의 발견, 잘게 나뉜 기술 시장에서 넓은 포트폴리오가 유리하다는 Ziedonis(2004)의 설명과 맞닿아 있다. 성능과 수율이 인접한 공정 단계의 역량에 좌우되는 기술에서 넓은 기술적 다양성은 권리 보호 전략과도 관련될 수 있으며, 공정 간 융합이 특허 분류에 드러나는 방식이기도 하다.</w:t>
       </w:r>
     </w:p>
     <w:bookmarkEnd w:id="51"/>
@@ -11249,7 +11375,7 @@
         <w:pStyle w:val="FirstParagraph"/>
       </w:pPr>
       <w:r>
-        <w:t xml:space="preserve">상당수 출원이 제조공정과 접합 기술을 함께 포함한다는 결과는, 하이브리드 본딩에서 접합 기술을 잘 다루는 것만으로는 충분하지 않고 표면 평탄화, 오염 제어, 표면 화학, 정렬까지 아우르는 인접 공정 지식이 중요해질 수 있음을 시사한다. KnowMade(2024)의 독립적 산업 분석이 파운드리, 종합반도체기업, 라이선싱 기업을 특허 활동을 주도하는 출원인으로 꼽는 것도 같은 방향이다. 제조공정과 접합 기술의 공동분류가 빈번하다는 사실은 두 공정 영역을 잇는 지식 범위가 하이브리드 본딩 관련 특허 활동에서 중요함을 보여주며, Kapoor와 Adner(2012)가 말한 지식 경계의 논리와도 통한다.</w:t>
+        <w:t xml:space="preserve">상당수 출원이 제조공정과 접합 기술을 함께 포함한다는 결과는, 하이브리드 본딩에서 접합 기술을 잘 다루는 것만으로는 충분하지 않고 표면 평탄화, 오염 제어, 표면 화학, 정렬까지 아우르는 인접 공정 지식이 중요해질 수 있음을 시사한다. 이는 기업이 직접 만드는 범위보다 넓은 지식을 가질수록 유리하다는 Kapoor와 Adner(2012)의 지식 경계 논리와도 통한다. KnowMade(2024)의 독립적 산업 분석이 파운드리, 종합반도체기업, 라이선싱 기업을 특허 활동을 주도하는 출원인으로 꼽는 것도 같은 방향이다.</w:t>
       </w:r>
     </w:p>
     <w:p>
@@ -11257,7 +11383,7 @@
         <w:pStyle w:val="BodyText"/>
       </w:pPr>
       <w:r>
-        <w:t xml:space="preserve">재편기에 하이브리드 본딩의 핵심 원리를 담은 발명은 접합 영역 안에서 기술되고, 제조공정과의 결합은 임시 지지 기판, 봉지, 다이싱처럼 다이를 다루고 패키지로 만드는 공정에서 늘었다. 경쟁의 초점이 핵심 원리의 발명에서 그 원리를 다이 단위 공정과 결합하는 응용의 발명으로 옮겨 가고 있을 수 있다는 뜻이다. 차세대 HBM을 하이브리드 본딩에 기대고 있는 한국 메모리 산업에 이 결과가 던지는 시사점은, 패키징 경쟁력이 접합 원리 하나에 달려 있지 않을 수 있다는 점이다. 평탄화, 표면 화학, 정렬 계측 같은 제조공정 역량에 더해, 다이를 얇게 다루고 쌓는 공정까지 하나의 특허출원에서 통합적으로 보호하는 능력이 함께 필요할 수 있다.</w:t>
+        <w:t xml:space="preserve">재편기에는 하이브리드 본딩의 핵심 원리를 담은 발명이 다른 접합 발명보다 제조공정 기호를 더 자주 갖지 않았고, 핵심 기술과 결합하는 제조공정은 임시 지지 기판, 봉지처럼 다이를 다루고 패키지로 만드는 공정이 많았다. 경쟁의 초점이 핵심 원리의 발명에서 그 원리를 다이 단위 공정과 결합하는 응용의 발명으로 옮겨 가고 있을 수 있다는 뜻이다. 차세대 HBM 적층에 하이브리드 본딩을 도입하려는 한국 메모리 산업에 이 결과가 던지는 시사점은, 패키징 경쟁력이 접합 원리 하나에 달려 있지 않을 수 있다는 점이다. 평탄화, 표면 화학, 정렬 계측 같은 제조공정 역량에 더해, 다이를 얇게 다루고 쌓는 공정까지 함께 아우르는 역량이 필요할 수 있다.</w:t>
       </w:r>
     </w:p>
     <w:bookmarkEnd w:id="52"/>
@@ -11275,7 +11401,42 @@
         <w:pStyle w:val="FirstParagraph"/>
       </w:pPr>
       <w:r>
-        <w:t xml:space="preserve">본 연구의 한계는 다섯 가지로 정리된다. 첫째, 구성타당성이다. H01L21–H01L24 공동분류는 공정 단계 간 기술융합의 대리측정치이며, H01L21에는 패키징 단계의 제조공정도 들어 있고, 기술범위는 유형과 같은 CPC 정보에서 만들어진다. 좁은 정의로도 회귀 결과는 유지되지만 통합형의 비중 같은 기술통계는 정의에 따라 달라진다. 또한 CPC는 주기적으로 개정되고 과거 출원도 소급하여 재분류될 수 있으므로, 관찰된 시간 변화의 일부는 기술 자체의 변화가 아니라 분류 체계와 심사 관행의 변화를 반영할 수 있다. 둘째, 표본 선택이다. 제목 키워드 검색은 정밀하지만 제목에 관련어가 없는 출원을 놓치고,</w:t>
+        <w:t xml:space="preserve">본 연구의 한계는 여섯 가지로 정리된다. 첫째, 구성타당성이다. H01L21–H01L24 공동분류는 공정 단계 간 기술융합의 대리측정치이며, H01L21에는 패키징 단계의 제조공정도 들어 있고, 기술범위는 유형과 같은 CPC 정보에서 만들어진다. 좁은 정의로도 회귀 결과는 유지되지만 통합형의 비중 같은 기술통계는 정의에 따라 달라진다. 또한 CPC는 주기적으로 개정되고 과거 출원도 소급하여 재분류될 수 있으므로, 관찰된 시간 변화의 일부는 기술 자체의 변화가 아니라 분류 체계와 심사 관행의 변화를 반영할 수 있다. 둘째, 표본 선택이다. 제목 키워드 검색은 기준이 명확하지만 제목에 관련어가 없는 출원을 놓치고, 검색어의 무관한 용법 68건은 따로 판정해 민감도 분석으로 확인해야 했다. 셋째, 관측 단위와 중복이다. 분석 단위는 출원이며 공식 패밀리 식별자가 없어 동일 제목으로 근사 조정했으므로, 관측치의 독립성은 완전히 보장되지 않는다. 넷째, 누락변수다. 출원인과 기업 유형, 국적, 응용처, 웨이퍼 단위와 다이 단위 접합의 구분이 자료에 없고, 두 클래스 밖의 CPC 기호는 회귀 자료에 없다. 기술 클러스터와 기술 네트워크 표의 인덱싱 코드는 같은 출원의 전체 CPC 기호를 따로 집계한 것이어서, 핵심 기술 변수는 회귀 자료에 있는 접합 기호 네 개로만 정의했다. 핵심 기술의 경계도 출원 200건 이상이라는 기준에 기댄다. 다만 가장 강한 쌍(24/08, 24/80)으로 좁혀도 결과는 같았다. 다섯째, 인과성이다. 다양성과 유형은 함께 결정될 가능성이 높고 적절한 도구변수가 없으므로 인과관계는 주장하지 않으며, 출원청은 통제변수로만 넣었다. H3의 시기 구분도 지배적 설계의 형성 시점을 직접 잰 것이 아니라 출원 시기로 근사한 것이다. 여섯째, 측정 시점이다. 융합의 신호로 쓴 CPC 공동분류는 재현 가능하지만 발명보다 늦게 부여된다. 텍스트 기반 방법(Preschitschek et al., 2013; Zhu and Motohashi, 2022)은 더 이른 탐지가 가능하지만 학습된 모형에 의존한다. H01L21과 H01L24의 경계가 제도적으로 명확한 본 연구에서는 재현성을 택했다.</w:t>
+      </w:r>
+    </w:p>
+    <w:p>
+      <w:pPr>
+        <w:pStyle w:val="BodyText"/>
+      </w:pPr>
+      <w:r>
+        <w:t xml:space="preserve">본 연구의 설계는 다른 맥락에도 그대로 적용할 수 있다. 디스플레이의 첨단 리소그래피, 배터리의 셀-투-팩 통합, 항공우주 조립의 적층제조처럼 하류 단계가 상류 역량에 의존하기 시작한 공정기술은 모두 같은 두 클래스 규칙과 이산선택 모형으로 살필 수 있다. 여러 사례를 비교하면 여기서 관찰한 형성–확산–재편의 전개가 일반적인지 알 수 있을 것이다. 또한 각 특허가 여러 기호의 집합이라는 점을 살려 고차 공출현을 보존하는 표현이나 일반성 지수(Petralia, 2020)를 쓰면, 하이브리드 본딩이 로직, 메모리, 이미지센서로 퍼져 가는 범용기술적 성격을 직접 검정할 수 있다.</w:t>
+      </w:r>
+    </w:p>
+    <w:bookmarkEnd w:id="53"/>
+    <w:bookmarkEnd w:id="54"/>
+    <w:bookmarkStart w:id="55" w:name="결론"/>
+    <w:p>
+      <w:pPr>
+        <w:pStyle w:val="Heading2"/>
+      </w:pPr>
+      <w:r>
+        <w:t xml:space="preserve">7. 결론</w:t>
+      </w:r>
+    </w:p>
+    <w:p>
+      <w:pPr>
+        <w:pStyle w:val="FirstParagraph"/>
+      </w:pPr>
+      <w:r>
+        <w:t xml:space="preserve">기술융합은 그동안 주로 산업과 산업의 만남으로, 그리고 융합의 정도가 늘었는가의 문제로 연구되어 왔다. 본 연구는 융합이 한 산업의 공정 단계 사이에서도 일어나는지, 그리고 그 융합이 시간이 지나면서 어떤 양태로 전개되는지를 개별 출원 수준에서 물었다. 하이브리드 본딩 관련 출원 928건에 부여된 CPC 기호를 기준으로 각 출원을 접합 단독형, 공정 단독형, 통합형으로 나누고, 어떤 특허가 두 공정의 경계를 넘는지와 그 양상이 시기마다 어떻게 바뀌었는지를 추정하였다.</w:t>
+      </w:r>
+    </w:p>
+    <w:p>
+      <w:pPr>
+        <w:pStyle w:val="BodyText"/>
+      </w:pPr>
+      <w:r>
+        <w:t xml:space="preserve">결과는 세 가지로 요약된다. 첫째, 공정 단계 간 융합은 예외적인 현상이 아니며 세 국면을 거쳐 전개되었다. 통합형은 45.8%로 가장 많은 유형이었고 좁은 정의로도 37.2%였다. 형성기에는 제조공정 발명이 홀로 나오는 경우가 가장 많았고, 확산기에는 두 공정을 함께 담은 통합형이 62.2%로 정점에 이르렀으며, 재편기에는 통합형이 줄고 접합 단독형이 늘었다. 둘째, 세부 기술을 더 다양하게 담은 특허일수록 경계를 넘을 가능성이 높았고, 이 연관은 세 국면 모두에서 유지되었다. 또한 최근 출원일수록 공정 단독형이 드물어져 출원의 무게중심이 접합 쪽으로 옮겨 갔으며, 이 결과는 2014년 이전 출원이 적은</w:t>
       </w:r>
       <w:r>
         <w:t xml:space="preserve"> </w:t>
@@ -11285,10 +11446,13 @@
           <w:i/>
           <w:iCs/>
         </w:rPr>
-        <w:t xml:space="preserve">direct bonding</w:t>
-      </w:r>
-      <w:r>
-        <w:t xml:space="preserve">은 뜻이 넓어 무관한 용법 68건을 따로 걸러야 했다. 셋째, 관측단위와 중복이다. 분석단위는 출원이며 공식 패밀리 식별자가 없어 동일 제목으로 근사 조정했으므로, 관측치의 독립성은 완전히 보장되지 않는다. 넷째, 누락변수다. 출원인과 기업 유형, 국적, 응용처, 웨이퍼 단위와 다이 단위 접합의 구분이 자료에 없고, 두 클래스 밖의 CPC 기호는 회귀 자료에 없다. 기술 클러스터와 기술 네트워크 표의 인덱싱 코드는 같은 출원의 전체 CPC 기호를 따로 집계한 것이어서, 핵심 기술 변수는 회귀 자료에 있는 접합 기호 네 개로만 정의했다. 핵심 기술의 경계도 출원 200건 이상이라는 기준에 기댄다. 다만 가장 강한 쌍(24/08, 24/80)으로 좁혀도 결과는 같았다. 다섯째, 인과성이다. 다양성과 유형은 함께 결정될 가능성이 높고 적절한 도구변수가 없으므로 인과관계는 주장하지 않으며, 출원청은 통제변수로만 넣었다. H3의 시기 구분도 지배적 설계의 형성 시점을 직접 잰 것이 아니라 출원 시기로 근사한 것이다. 끝으로 융합의 신호로 쓴 CPC 공동분류는 재현 가능하지만 발명보다 늦게 부여된다. 텍스트 기반 방법(Preschitschek et al., 2013; Zhu and Motohashi, 2022)은 더 이른 탐지가 가능하지만 학습된 모형에 의존한다. H01L21과 H01L24의 경계가 제도적으로 명확한 본 연구에서는 재현가능성을 택했다.</w:t>
+        <w:t xml:space="preserve">hybrid bonding</w:t>
+      </w:r>
+      <w:r>
+        <w:t xml:space="preserve"> </w:t>
+      </w:r>
+      <w:r>
+        <w:t xml:space="preserve">표본을 제외한 모든 재추정에서 유지되었다. 셋째, 융합이 일어나는 자리가 옮겨 갔다. 기술 클러스터와 기술 네트워크로 찾은 핵심 기술을 담은 출원은 형성기에 제조공정 분류를 함께 가질 승산이 그렇지 않은 출원의 11.1배였지만, 그 차이는 재편기에 사라졌고, 핵심 기술과 함께 부여되는 제조공정도 다이 취급 공정으로 바뀌었다. 이 차이의 감소는 모든 재추정에서 유지되었다.</w:t>
       </w:r>
     </w:p>
     <w:p>
@@ -11296,42 +11460,7 @@
         <w:pStyle w:val="BodyText"/>
       </w:pPr>
       <w:r>
-        <w:t xml:space="preserve">본 연구의 설계는 다른 맥락에도 그대로 적용할 수 있다. 디스플레이의 첨단 리소그래피, 배터리의 셀-투-팩 통합, 항공우주 조립의 적층제조처럼 하류 단계가 상류 역량에 의존하기 시작한 공정기술은 모두 같은 두 클래스 규칙과 이산선택 모형으로 살필 수 있다. 여러 사례를 비교하면 여기서 관찰한 형성–확산–재편의 전개가 일반적인지 알 수 있을 것이다. 또한 각 특허가 여러 기호의 집합이라는 점을 살려 고차 공출현을 보존하는 표현이나 일반성 지수(Petralia, 2020)를 쓰면, 하이브리드 본딩이 로직, 메모리, 이미지센서로 퍼져 가는 범용기술적 성격을 직접 검정할 수 있다.</w:t>
-      </w:r>
-    </w:p>
-    <w:bookmarkEnd w:id="53"/>
-    <w:bookmarkEnd w:id="54"/>
-    <w:bookmarkStart w:id="55" w:name="결론"/>
-    <w:p>
-      <w:pPr>
-        <w:pStyle w:val="Heading2"/>
-      </w:pPr>
-      <w:r>
-        <w:t xml:space="preserve">7. 결론</w:t>
-      </w:r>
-    </w:p>
-    <w:p>
-      <w:pPr>
-        <w:pStyle w:val="FirstParagraph"/>
-      </w:pPr>
-      <w:r>
-        <w:t xml:space="preserve">기술융합은 그동안 주로 산업과 산업의 만남으로, 그리고 융합의 정도가 늘었는가의 문제로 연구되어 왔다. 본 연구는 융합이 한 산업의 공정 단계 사이에서도 일어나는지, 그리고 그 융합이 시간이 지나면서 어떤 양태로 전개되는지를 개별 출원 수준에서 물었다. 하이브리드 본딩 관련 출원 928건에 부여된 CPC 기호를 기준으로 각 출원을 접합 단독형, 공정 단독형, 통합형으로 나누고, 어떤 특허가 두 공정의 경계를 넘는지와 그 양상이 시기마다 어떻게 바뀌었는지를 추정하였다.</w:t>
-      </w:r>
-    </w:p>
-    <w:p>
-      <w:pPr>
-        <w:pStyle w:val="BodyText"/>
-      </w:pPr>
-      <w:r>
-        <w:t xml:space="preserve">결과는 세 가지로 요약된다. 첫째, 공정 단계 간 융합은 예외적인 현상이 아니다. 통합형은 45.8%로 가장 많은 유형이었고 좁은 정의로도 37.2%였으며, 세부 기술을 더 다양하게 담은 특허일수록 경계를 넘을 가능성이 높았다. 둘째, 융합은 세 국면을 거쳐 전개되었다. 형성기에는 제조공정 발명이 홀로 나오는 경우가 가장 많았고, 확산기에는 두 공정을 함께 담은 통합형이 62.2%로 정점에 이르렀으며, 재편기에는 통합형이 줄고 접합 단독형이 늘었다. 공정 단독형의 감소는 2015년 이전 출원이 적은 핵심 표본을 제외한 모든 재추정에서 유지되어, 융합의 무게중심은 접합 쪽으로 옮겨 갔다. 셋째, 융합이 일어나는 자리가 옮겨 갔다. 기술 클러스터와 기술 네트워크로 찾은 핵심 기술을 담은 출원은 형성기에 제조공정 분류를 함께 가질 승산이 그렇지 않은 출원의 11.1배였지만, 그 차이는 재편기에 사라졌고, 그 대신 다이 취급 공정과의 결합이 늘었다. 이 감소는 모든 재추정에서 유지되었다.</w:t>
-      </w:r>
-    </w:p>
-    <w:p>
-      <w:pPr>
-        <w:pStyle w:val="BodyText"/>
-      </w:pPr>
-      <w:r>
-        <w:t xml:space="preserve">이 결과는 공정 단계 간 융합이 한 방향으로 쌓이는 과정이 아니라, 핵심 기술의 설계가 고착화되면서 융합의 자리가 핵심에서 주변으로 옮겨 가는 과정이었음을 보여준다.</w:t>
+        <w:t xml:space="preserve">이 결과는 공정 단계 간 융합이 한 방향으로 쌓이는 과정이 아니라, 핵심 기술의 설계가 고착화되면서 융합의 자리가 핵심에서 주변으로 옮겨 가는 과정이었음을 시사한다.</w:t>
       </w:r>
     </w:p>
     <w:p>
@@ -11372,7 +11501,7 @@
         <w:pStyle w:val="BodyText"/>
       </w:pPr>
       <w:r>
-        <w:t xml:space="preserve">Applied Materials, 2025. Kinex(키넥스) 다이 투 웨이퍼 하이브리드 본딩 통합 시스템 [Kinex integrated die-to-wafer hybrid bonding system; 김지혜 작성]. 어플라이드머티리얼즈(Applied Materials) 홈페이지.</w:t>
+        <w:t xml:space="preserve">Applied Materials, 2025. Kinex(키넥스) 다이 투 웨이퍼 하이브리드 본딩 통합 시스템(김지혜 작성) [Web page]. 어플라이드머티리얼즈(Applied Materials) 홈페이지.</w:t>
       </w:r>
     </w:p>
     <w:p>
@@ -11408,6 +11537,14 @@
         <w:pStyle w:val="BodyText"/>
       </w:pPr>
       <w:r>
+        <w:t xml:space="preserve">Bröring, S., Cloutier, L.M., Leker, J., 2006. The front end of innovation in an era of industry convergence: Evidence from nutraceuticals and functional foods. R&amp;D Management 36 (5), 487–498. https://doi.org/10.1111/j.1467-9310.2006.00449.x</w:t>
+      </w:r>
+    </w:p>
+    <w:p>
+      <w:pPr>
+        <w:pStyle w:val="BodyText"/>
+      </w:pPr>
+      <w:r>
         <w:t xml:space="preserve">Brown, C., Linden, G., 2009. Chips and Change: How Crisis Reshapes the Semiconductor Industry. MIT Press, Cambridge, MA.</w:t>
       </w:r>
     </w:p>
@@ -11424,7 +11561,7 @@
         <w:pStyle w:val="BodyText"/>
       </w:pPr>
       <w:r>
-        <w:t xml:space="preserve">Bröring, S., Cloutier, L.M., Leker, J., 2006. The front end of innovation in an era of industry convergence: Evidence from nutraceuticals and functional foods. R&amp;D Management 36 (5), 487–498. https://doi.org/10.1111/j.1467-9310.2006.00449.x</w:t>
+        <w:t xml:space="preserve">Caviggioli, F., 2016. Technology fusion: Identification and analysis of the drivers of technology convergence using patent data. Technovation 55–56, 22–32. https://doi.org/10.1016/j.technovation.2016.04.003</w:t>
       </w:r>
     </w:p>
     <w:p>
@@ -11432,7 +11569,7 @@
         <w:pStyle w:val="BodyText"/>
       </w:pPr>
       <w:r>
-        <w:t xml:space="preserve">Caviggioli, F., 2016. Technology fusion: Identification and analysis of the drivers of technology convergence using patent data. Technovation 55–56, 22–32. https://doi.org/10.1016/j.technovation.2016.04.003</w:t>
+        <w:t xml:space="preserve">Cho, Y., Kim, M., 2014. Entropy and gravity concepts as new methodological indexes to investigate technological convergence: Patent network-based approach. PLOS ONE 9 (6), e98009. https://doi.org/10.1371/journal.pone.0098009</w:t>
       </w:r>
     </w:p>
     <w:p>
@@ -11440,7 +11577,7 @@
         <w:pStyle w:val="BodyText"/>
       </w:pPr>
       <w:r>
-        <w:t xml:space="preserve">Cho, Y., Kim, M., 2014. Entropy and gravity concepts as new methodological indexes to investigate technological convergence: Patent network-based approach. PLOS ONE 9 (6), e98009. https://doi.org/10.1371/journal.pone.0098009</w:t>
+        <w:t xml:space="preserve">Curran, C.-S., Bröring, S., Leker, J., 2010. Anticipating converging industries using publicly available data. Technological Forecasting and Social Change 77 (3), 385–395. https://doi.org/10.1016/j.techfore.2009.10.002</w:t>
       </w:r>
     </w:p>
     <w:p>
@@ -11448,7 +11585,7 @@
         <w:pStyle w:val="BodyText"/>
       </w:pPr>
       <w:r>
-        <w:t xml:space="preserve">Curran, C.-S., Bröring, S., Leker, J., 2010. Anticipating converging industries using publicly available data. Technological Forecasting and Social Change 77 (3), 385–395. https://doi.org/10.1016/j.techfore.2009.10.002</w:t>
+        <w:t xml:space="preserve">Curran, C.-S., Leker, J., 2011. Patent indicators for monitoring convergence – Examples from NFF and ICT. Technological Forecasting and Social Change 78 (2), 256–273. https://doi.org/10.1016/j.techfore.2010.06.021</w:t>
       </w:r>
     </w:p>
     <w:p>
@@ -11456,7 +11593,7 @@
         <w:pStyle w:val="BodyText"/>
       </w:pPr>
       <w:r>
-        <w:t xml:space="preserve">Curran, C.-S., Leker, J., 2011. Patent indicators for monitoring convergence – Examples from NFF and ICT. Technological Forecasting and Social Change 78 (2), 256–273. https://doi.org/10.1016/j.techfore.2010.06.021</w:t>
+        <w:t xml:space="preserve">Deca Technologies, 2023. Conference presentation at the IMAPS 19th International Conference and Exhibition on Device Packaging. International Microelectronics Assembly and Packaging Society (IMAPS).</w:t>
       </w:r>
     </w:p>
     <w:p>
@@ -11464,7 +11601,7 @@
         <w:pStyle w:val="BodyText"/>
       </w:pPr>
       <w:r>
-        <w:t xml:space="preserve">Deca Technologies, 2023. Conference presentation at the IMAPS 19th International Conference and Exhibition on Device Packaging. International Microelectronics Assembly and Packaging Society (IMAPS).</w:t>
+        <w:t xml:space="preserve">European Patent Office, 2025. PATSTAT Global (2025 edition) [Database]. EPO, Vienna.</w:t>
       </w:r>
     </w:p>
     <w:p>
@@ -11472,7 +11609,7 @@
         <w:pStyle w:val="BodyText"/>
       </w:pPr>
       <w:r>
-        <w:t xml:space="preserve">European Patent Office, 2025. PATSTAT Global (2025 edition) [Database]. EPO, Vienna.</w:t>
+        <w:t xml:space="preserve">Gambardella, A., Torrisi, S., 1998. Does technological convergence imply convergence in markets? Evidence from the electronics industry. Research Policy 27 (5), 445–463. https://doi.org/10.1016/S0048-7333(98)00062-6</w:t>
       </w:r>
     </w:p>
     <w:p>
@@ -11480,7 +11617,7 @@
         <w:pStyle w:val="BodyText"/>
       </w:pPr>
       <w:r>
-        <w:t xml:space="preserve">Gambardella, A., Torrisi, S., 1998. Does technological convergence imply convergence in markets? Evidence from the electronics industry. Research Policy 27 (5), 445–463. https://doi.org/10.1016/S0048-7333(98)00062-6</w:t>
+        <w:t xml:space="preserve">Geum, Y., Kim, M.-S., Lee, S., 2016. How industrial convergence happens: A taxonomical approach based on empirical evidences. Technological Forecasting and Social Change 107, 112–120. https://doi.org/10.1016/j.techfore.2016.03.020</w:t>
       </w:r>
     </w:p>
     <w:p>
@@ -11488,7 +11625,7 @@
         <w:pStyle w:val="BodyText"/>
       </w:pPr>
       <w:r>
-        <w:t xml:space="preserve">Geum, Y., Kim, M.-S., Lee, S., 2016. How industrial convergence happens: A taxonomical approach based on empirical evidences. Technological Forecasting and Social Change 107, 112–120. https://doi.org/10.1016/j.techfore.2016.03.020</w:t>
+        <w:t xml:space="preserve">Hacklin, F., Marxt, C., Fahrni, F., 2009. Coevolutionary cycles of convergence: An extrapolation from the ICT industry. Technological Forecasting and Social Change 76 (6), 723–736. https://doi.org/10.1016/j.techfore.2009.03.003</w:t>
       </w:r>
     </w:p>
     <w:p>
@@ -11496,7 +11633,7 @@
         <w:pStyle w:val="BodyText"/>
       </w:pPr>
       <w:r>
-        <w:t xml:space="preserve">Hacklin, F., Marxt, C., Fahrni, F., 2009. Coevolutionary cycles of convergence: An extrapolation from the ICT industry. Technological Forecasting and Social Change 76 (6), 723–736. https://doi.org/10.1016/j.techfore.2009.03.003</w:t>
+        <w:t xml:space="preserve">Hacklin, F., Marxt, C., Fahrni, F., 2010. An evolutionary perspective on convergence: Inducing a stage model of inter-industry innovation. International Journal of Technology Management 49 (1–3), 220–249. https://doi.org/10.1504/IJTM.2010.029419</w:t>
       </w:r>
     </w:p>
     <w:p>
@@ -11504,7 +11641,7 @@
         <w:pStyle w:val="BodyText"/>
       </w:pPr>
       <w:r>
-        <w:t xml:space="preserve">Hacklin, F., Marxt, C., Fahrni, F., 2010. An evolutionary perspective on convergence: Inducing a stage model of inter-industry innovation. International Journal of Technology Management 49 (1–3), 220–249. https://doi.org/10.1504/IJTM.2010.029419</w:t>
+        <w:t xml:space="preserve">Hall, B.H., Ziedonis, R.H., 2001. The patent paradox revisited: An empirical study of patenting in the U.S. semiconductor industry, 1979–1995. RAND Journal of Economics 32 (1), 101–128. https://doi.org/10.2307/2696400</w:t>
       </w:r>
     </w:p>
     <w:p>
@@ -11512,7 +11649,7 @@
         <w:pStyle w:val="BodyText"/>
       </w:pPr>
       <w:r>
-        <w:t xml:space="preserve">Hall, B.H., Ziedonis, R.H., 2001. The patent paradox revisited: An empirical study of patenting in the U.S. semiconductor industry, 1979–1995. RAND Journal of Economics 32 (1), 101–128. https://doi.org/10.2307/2696400</w:t>
+        <w:t xml:space="preserve">Hosmer, D.W., Lemeshow, S., Sturdivant, R.X., 2013. Applied Logistic Regression, 3rd ed. Wiley, Hoboken, NJ.</w:t>
       </w:r>
     </w:p>
     <w:p>
@@ -11520,7 +11657,7 @@
         <w:pStyle w:val="BodyText"/>
       </w:pPr>
       <w:r>
-        <w:t xml:space="preserve">Hosmer, D.W., Lemeshow, S., Sturdivant, R.X., 2013. Applied Logistic Regression, 3rd ed. Wiley, Hoboken, NJ.</w:t>
+        <w:t xml:space="preserve">Hwang, I., 2020. The effect of collaborative innovation on ICT-based technological convergence: A patent-based analysis. PLOS ONE 15 (2), e0228616. https://doi.org/10.1371/journal.pone.0228616</w:t>
       </w:r>
     </w:p>
     <w:p>
@@ -11528,7 +11665,7 @@
         <w:pStyle w:val="BodyText"/>
       </w:pPr>
       <w:r>
-        <w:t xml:space="preserve">Hwang, I., 2020. The effect of collaborative innovation on ICT-based technological convergence: A patent-based analysis. PLOS ONE 15 (2), e0228616. https://doi.org/10.1371/journal.pone.0228616</w:t>
+        <w:t xml:space="preserve">Iyer, S.S., 2016. Heterogeneous integration for performance and scaling. IEEE Transactions on Components, Packaging and Manufacturing Technology 6 (7), 973–982. https://doi.org/10.1109/TCPMT.2015.2511626</w:t>
       </w:r>
     </w:p>
     <w:p>
@@ -11536,7 +11673,7 @@
         <w:pStyle w:val="BodyText"/>
       </w:pPr>
       <w:r>
-        <w:t xml:space="preserve">Iyer, S.S., 2016. Heterogeneous integration for performance and scaling. IEEE Transactions on Components, Packaging and Manufacturing Technology 6 (7), 973–982. https://doi.org/10.1109/TCPMT.2015.2511626</w:t>
+        <w:t xml:space="preserve">Jacobides, M.G., Knudsen, T., Augier, M., 2006. Benefiting from innovation: Value creation, value appropriation and the role of industry architectures. Research Policy 35 (8), 1200–1221. https://doi.org/10.1016/j.respol.2006.09.005</w:t>
       </w:r>
     </w:p>
     <w:p>
@@ -11544,7 +11681,7 @@
         <w:pStyle w:val="BodyText"/>
       </w:pPr>
       <w:r>
-        <w:t xml:space="preserve">Jacobides, M.G., Knudsen, T., Augier, M., 2006. Benefiting from innovation: Value creation, value appropriation and the role of industry architectures. Research Policy 35 (8), 1200–1221. https://doi.org/10.1016/j.respol.2006.09.005</w:t>
+        <w:t xml:space="preserve">Jeong, S., Kim, J.-C., Choi, J.Y., 2015. Technology convergence: What developmental stage are we in? Scientometrics 104 (3), 841–871. https://doi.org/10.1007/s11192-015-1606-6</w:t>
       </w:r>
     </w:p>
     <w:p>
@@ -11552,7 +11689,7 @@
         <w:pStyle w:val="BodyText"/>
       </w:pPr>
       <w:r>
-        <w:t xml:space="preserve">Jeong, S., Kim, J.-C., Choi, J.Y., 2015. Technology convergence: What developmental stage are we in? Scientometrics 104 (3), 841–871. https://doi.org/10.1007/s11192-015-1606-6</w:t>
+        <w:t xml:space="preserve">Kapoor, R., 2013. Persistence of integration in the face of specialization: How firms navigated the winds of disintegration and shaped the architecture of the semiconductor industry. Organization Science 24 (4), 1195–1213. https://doi.org/10.1287/orsc.1120.0802</w:t>
       </w:r>
     </w:p>
     <w:p>
@@ -11560,7 +11697,7 @@
         <w:pStyle w:val="BodyText"/>
       </w:pPr>
       <w:r>
-        <w:t xml:space="preserve">Kapoor, R., 2013. Persistence of integration in the face of specialization: How firms navigated the winds of disintegration and shaped the architecture of the semiconductor industry. Organization Science 24 (4), 1195–1213. https://doi.org/10.1287/orsc.1120.0802</w:t>
+        <w:t xml:space="preserve">Kapoor, R., Adner, R., 2012. What firms make vs. what they know: How firms’ production and knowledge boundaries affect competitive advantage in the face of technological change. Organization Science 23 (5), 1227–1248. https://doi.org/10.1287/orsc.1110.0686</w:t>
       </w:r>
     </w:p>
     <w:p>
@@ -11568,7 +11705,7 @@
         <w:pStyle w:val="BodyText"/>
       </w:pPr>
       <w:r>
-        <w:t xml:space="preserve">Kapoor, R., Adner, R., 2012. What firms make vs. what they know: How firms’ production and knowledge boundaries affect competitive advantage in the face of technological change. Organization Science 23 (5), 1227–1248. https://doi.org/10.1287/orsc.1110.0686</w:t>
+        <w:t xml:space="preserve">Karvonen, M., Kässi, T., 2012. Industry convergence analysis with patent citations in changing value systems. International Journal of Business and Systems Research 6 (2), 150–175. https://doi.org/10.1504/IJBSR.2012.046353</w:t>
       </w:r>
     </w:p>
     <w:p>
@@ -11576,7 +11713,7 @@
         <w:pStyle w:val="BodyText"/>
       </w:pPr>
       <w:r>
-        <w:t xml:space="preserve">Karvonen, M., Kässi, T., 2012. Industry convergence analysis with patent citations in changing value systems. International Journal of Business and Systems Research 6 (2), 150–175. https://doi.org/10.1504/IJBSR.2012.046353</w:t>
+        <w:t xml:space="preserve">Khan, H.N., Hounshell, D.A., Fuchs, E.R.H., 2018. Science and research policy at the end of Moore’s law. Nature Electronics 1 (1), 14–21. https://doi.org/10.1038/s41928-017-0005-9</w:t>
       </w:r>
     </w:p>
     <w:p>
@@ -11584,7 +11721,7 @@
         <w:pStyle w:val="BodyText"/>
       </w:pPr>
       <w:r>
-        <w:t xml:space="preserve">Khan, H.N., Hounshell, D.A., Fuchs, E.R.H., 2018. Science and research policy at the end of Moore’s law. Nature Electronics 1 (1), 14–21. https://doi.org/10.1038/s41928-017-0005-9</w:t>
+        <w:t xml:space="preserve">KnowMade, 2024. Hybrid Bonding Patent Landscape Analysis 2024 [Industry report]. KnowMade (Yole Group), Sophia Antipolis. https://www.knowmade.com/patent-analytics-services/patent-report/semiconductor-patent-landscape/semiconductor-advanced-packaging-patent-landscape/hybrid-bonding-patent-landscape-analysis-2024/</w:t>
       </w:r>
     </w:p>
     <w:p>
@@ -11592,7 +11729,7 @@
         <w:pStyle w:val="BodyText"/>
       </w:pPr>
       <w:r>
-        <w:t xml:space="preserve">KnowMade, 2024. Hybrid Bonding Patent Landscape Analysis 2024 [Industry report]. KnowMade (Yole Group), Sophia Antipolis. https://www.knowmade.com/patent-analytics-services/patent-report/semiconductor-patent-landscape/semiconductor-advanced-packaging-patent-landscape/hybrid-bonding-patent-landscape-analysis-2024/</w:t>
+        <w:t xml:space="preserve">Kodama, F., 1992. Technology fusion and the new R&amp;D. Harvard Business Review 70 (4), 70–78.</w:t>
       </w:r>
     </w:p>
     <w:p>
@@ -11600,7 +11737,7 @@
         <w:pStyle w:val="BodyText"/>
       </w:pPr>
       <w:r>
-        <w:t xml:space="preserve">Kodama, F., 1992. Technology fusion and the new R&amp;D. Harvard Business Review 70 (4), 70–78.</w:t>
+        <w:t xml:space="preserve">Kwon, O., An, Y., Kim, M., Lee, C., 2020. Anticipating technology-driven industry convergence: Evidence from large-scale patent analysis. Technology Analysis &amp; Strategic Management 32 (4), 363–378. https://doi.org/10.1080/09537325.2019.1661374</w:t>
       </w:r>
     </w:p>
     <w:p>
@@ -11608,7 +11745,7 @@
         <w:pStyle w:val="BodyText"/>
       </w:pPr>
       <w:r>
-        <w:t xml:space="preserve">Kwon, O., An, Y., Kim, M., Lee, C., 2020. Anticipating technology-driven industry convergence: Evidence from large-scale patent analysis. Technology Analysis &amp; Strategic Management 32 (4), 363–378. https://doi.org/10.1080/09537325.2019.1661374</w:t>
+        <w:t xml:space="preserve">Langlois, R.N., Steinmueller, W.E., 1999. The evolution of competitive advantage in the worldwide semiconductor industry, 1947–1996. In: Mowery, D.C., Nelson, R.R. (Eds.), Sources of Industrial Leadership: Studies of Seven Industries. Cambridge University Press, Cambridge, pp. 19–78.</w:t>
       </w:r>
     </w:p>
     <w:p>
@@ -11616,7 +11753,7 @@
         <w:pStyle w:val="BodyText"/>
       </w:pPr>
       <w:r>
-        <w:t xml:space="preserve">Langlois, R.N., Steinmueller, W.E., 1999. The evolution of competitive advantage in the worldwide semiconductor industry, 1947–1996. In: Mowery, D.C., Nelson, R.R. (Eds.), Sources of Industrial Leadership: Studies of Seven Industries. Cambridge University Press, Cambridge, pp. 19–78.</w:t>
+        <w:t xml:space="preserve">Lau, J.H., 2021. State-of-the-art and outlooks of chiplets heterogeneous integration and hybrid bonding. Journal of Microelectronics and Electronic Packaging 18 (4), 145–160. https://doi.org/10.4071/imaps.1542066</w:t>
       </w:r>
     </w:p>
     <w:p>
@@ -11624,7 +11761,7 @@
         <w:pStyle w:val="BodyText"/>
       </w:pPr>
       <w:r>
-        <w:t xml:space="preserve">Lau, J.H., 2021. State-of-the-art and outlooks of chiplets heterogeneous integration and hybrid bonding. Journal of Microelectronics and Electronic Packaging 18 (4), 145–160. https://doi.org/10.4071/imaps.1542066</w:t>
+        <w:t xml:space="preserve">Lau, J.H., 2022. Recent advances and trends in advanced packaging. IEEE Transactions on Components, Packaging and Manufacturing Technology 12 (2), 228–252. https://doi.org/10.1109/TCPMT.2022.3144461</w:t>
       </w:r>
     </w:p>
     <w:p>
@@ -11632,7 +11769,7 @@
         <w:pStyle w:val="BodyText"/>
       </w:pPr>
       <w:r>
-        <w:t xml:space="preserve">Lau, J.H., 2022. Recent advances and trends in advanced packaging. IEEE Transactions on Components, Packaging and Manufacturing Technology 12 (2), 228–252. https://doi.org/10.1109/TCPMT.2022.3144461</w:t>
+        <w:t xml:space="preserve">Lee, W.S., Han, E.J., Sohn, S.Y., 2015. Predicting the pattern of technology convergence using big-data technology on large-scale triadic patents. Technological Forecasting and Social Change 100, 317–329. https://doi.org/10.1016/j.techfore.2015.07.022</w:t>
       </w:r>
     </w:p>
     <w:p>
@@ -11640,7 +11777,7 @@
         <w:pStyle w:val="BodyText"/>
       </w:pPr>
       <w:r>
-        <w:t xml:space="preserve">Lee, W.S., Han, E.J., Sohn, S.Y., 2015. Predicting the pattern of technology convergence using big-data technology on large-scale triadic patents. Technological Forecasting and Social Change 100, 317–329. https://doi.org/10.1016/j.techfore.2015.07.022</w:t>
+        <w:t xml:space="preserve">Lerner, J., 1994. The importance of patent scope: An empirical analysis. RAND Journal of Economics 25 (2), 319–333. https://doi.org/10.2307/2555833</w:t>
       </w:r>
     </w:p>
     <w:p>
@@ -11648,7 +11785,7 @@
         <w:pStyle w:val="BodyText"/>
       </w:pPr>
       <w:r>
-        <w:t xml:space="preserve">Lerner, J., 1994. The importance of patent scope: An empirical analysis. RAND Journal of Economics 25 (2), 319–333. https://doi.org/10.2307/2555833</w:t>
+        <w:t xml:space="preserve">Macher, J.T., Mowery, D.C., 2004. Vertical specialization and industry structure in high technology industries. In: Baum, J.A.C., McGahan, A.M. (Eds.), Business Strategy over the Industry Lifecycle. Advances in Strategic Management, vol. 21. Emerald, Bingley, pp. 317–355. https://doi.org/10.1016/S0742-3322(04)21011-7</w:t>
       </w:r>
     </w:p>
     <w:p>
@@ -11656,7 +11793,7 @@
         <w:pStyle w:val="BodyText"/>
       </w:pPr>
       <w:r>
-        <w:t xml:space="preserve">Macher, J.T., Mowery, D.C., 2004. Vertical specialization and industry structure in high technology industries. In: Baum, J.A.C., McGahan, A.M. (Eds.), Business Strategy over the Industry Lifecycle. Advances in Strategic Management, vol. 21. Emerald, Bingley, pp. 317–355. https://doi.org/10.1016/S0742-3322(04)21011-7</w:t>
+        <w:t xml:space="preserve">McFadden, D., 1974. Conditional logit analysis of qualitative choice behavior. In: Zarembka, P. (Ed.), Frontiers in Econometrics. Academic Press, New York, pp. 105–142.</w:t>
       </w:r>
     </w:p>
     <w:p>
@@ -11664,7 +11801,7 @@
         <w:pStyle w:val="BodyText"/>
       </w:pPr>
       <w:r>
-        <w:t xml:space="preserve">McFadden, D., 1974. Conditional logit analysis of qualitative choice behavior. In: Zarembka, P. (Ed.), Frontiers in Econometrics. Academic Press, New York, pp. 105–142.</w:t>
+        <w:t xml:space="preserve">Murmann, J.P., Frenken, K., 2006. Toward a systematic framework for research on dominant designs, technological innovations, and industrial change. Research Policy 35 (7), 925–952. https://doi.org/10.1016/j.respol.2006.04.011</w:t>
       </w:r>
     </w:p>
     <w:p>
@@ -11672,7 +11809,7 @@
         <w:pStyle w:val="BodyText"/>
       </w:pPr>
       <w:r>
-        <w:t xml:space="preserve">Murmann, J.P., Frenken, K., 2006. Toward a systematic framework for research on dominant designs, technological innovations, and industrial change. Research Policy 35 (7), 925–952. https://doi.org/10.1016/j.respol.2006.04.011</w:t>
+        <w:t xml:space="preserve">No, H.J., Park, Y., 2010. Trajectory patterns of technology fusion: Trend analysis and taxonomical grouping in nanobiotechnology. Technological Forecasting and Social Change 77 (1), 63–75. https://doi.org/10.1016/j.techfore.2009.06.006</w:t>
       </w:r>
     </w:p>
     <w:p>
@@ -11680,7 +11817,7 @@
         <w:pStyle w:val="BodyText"/>
       </w:pPr>
       <w:r>
-        <w:t xml:space="preserve">No, H.J., Park, Y., 2010. Trajectory patterns of technology fusion: Trend analysis and taxonomical grouping in nanobiotechnology. Technological Forecasting and Social Change 77 (1), 63–75. https://doi.org/10.1016/j.techfore.2009.06.006</w:t>
+        <w:t xml:space="preserve">Petralia, S., 2020. Mapping general purpose technologies with patent data. Research Policy 49 (7), 104013. https://doi.org/10.1016/j.respol.2020.104013</w:t>
       </w:r>
     </w:p>
     <w:p>
@@ -11688,7 +11825,7 @@
         <w:pStyle w:val="BodyText"/>
       </w:pPr>
       <w:r>
-        <w:t xml:space="preserve">Petralia, S., 2020. Mapping general purpose technologies with patent data. Research Policy 49 (7), 104013. https://doi.org/10.1016/j.respol.2020.104013</w:t>
+        <w:t xml:space="preserve">Preschitschek, N., Niemann, H., Leker, J., Moehrle, M.G., 2013. Anticipating industry convergence: Semantic analyses vs IPC co-classification analyses of patents. Foresight 15 (6), 446–464. https://doi.org/10.1108/FS-10-2012-0075</w:t>
       </w:r>
     </w:p>
     <w:p>
@@ -11696,7 +11833,7 @@
         <w:pStyle w:val="BodyText"/>
       </w:pPr>
       <w:r>
-        <w:t xml:space="preserve">Preschitschek, N., Niemann, H., Leker, J., Moehrle, M.G., 2013. Anticipating industry convergence: Semantic analyses vs IPC co-classification analyses of patents. Foresight 15 (6), 446–464. https://doi.org/10.1108/FS-10-2012-0075</w:t>
+        <w:t xml:space="preserve">Rosenberg, N., 1963. Technological change in the machine tool industry, 1840–1910. Journal of Economic History 23 (4), 414–443. https://doi.org/10.1017/S0022050700109155</w:t>
       </w:r>
     </w:p>
     <w:p>
@@ -11704,7 +11841,7 @@
         <w:pStyle w:val="BodyText"/>
       </w:pPr>
       <w:r>
-        <w:t xml:space="preserve">Rosenberg, N., 1963. Technological change in the machine tool industry, 1840–1910. Journal of Economic History 23 (4), 414–443. https://doi.org/10.1017/S0022050700109155</w:t>
+        <w:t xml:space="preserve">Sick, N., Bröring, S., 2022. Exploring the research landscape of convergence from a TIM perspective: A review and research agenda. Technological Forecasting and Social Change 175, 121321. https://doi.org/10.1016/j.techfore.2021.121321</w:t>
       </w:r>
     </w:p>
     <w:p>
@@ -11712,15 +11849,7 @@
         <w:pStyle w:val="BodyText"/>
       </w:pPr>
       <w:r>
-        <w:t xml:space="preserve">Sick, N., Bröring, S., 2022. Exploring the research landscape of convergence from a TIM perspective: A review and research agenda. Technological Forecasting and Social Change 175, 121321. https://doi.org/10.1016/j.techfore.2021.121321</w:t>
-      </w:r>
-    </w:p>
-    <w:p>
-      <w:pPr>
-        <w:pStyle w:val="BodyText"/>
-      </w:pPr>
-      <w:r>
-        <w:t xml:space="preserve">Song, C.H., Elvers, D., Leker, J., 2017. Anticipation of converging technology areas — A refined approach for the identification of attractive fields of innovation. Technological Forecasting and Social Change 116, 98–115. https://doi.org/10.1016/j.techfore.2016.11.001</w:t>
+        <w:t xml:space="preserve">Song, C.H., Elvers, D., Leker, J., 2017. Anticipation of converging technology areas – A refined approach for the identification of attractive fields of innovation. Technological Forecasting and Social Change 116, 98–115. https://doi.org/10.1016/j.techfore.2016.11.001</w:t>
       </w:r>
     </w:p>
     <w:p>
@@ -11778,7 +11907,36 @@
         <w:pStyle w:val="FirstParagraph"/>
       </w:pPr>
       <w:r>
-        <w:t xml:space="preserve">표 A1과 A2는 본문의 강건성 요약표(표 11)에 실은 재추정의 전체 계수다. 각 열은 표본 또는 변수 정의를 하나씩 바꾼 다항 로짓이며, 기준 열은 본문의 다항 로짓 표와 같다. 모든 열에 출원청 더미를 통제변수로 넣었으나 계수는 생략하였다. 조정 범위는 출원이 보유한 클래스마다 최소 1개 기호를 차감한 유형 최소치 조정 CPC 범위(breadth_adj)를, 동일 제목 중복 제거는 같은 제목의 출원 가운데 가장 이른 1건만 남긴 표본을, 좁은 제조공정 정의는 H01L21의 패키징 단계 공정 기호를 제조공정으로 세지 않은 변수를, 무관 용법 제외는 부록 B의 68건을 뺀 표본을, 핵심 표본은 제목에 hybrid bonding이 들어 있는 출원만 남긴 표본을 뜻한다. 2010년 이후 표본은 본문 제5.2절에서 언급한 것이다.</w:t>
+        <w:t xml:space="preserve">표 A1과 A2는 본문 표 11에 실은 재추정에 조정 범위와 2010년 이후 표본을 더해 전체 계수를 보인다. 각 열은 표본 또는 변수 정의를 하나씩 바꾼 다항 로짓이며, 기준 열은 본문의 다항 로짓 표와 같다. 모든 열에 출원청 더미를 통제변수로 넣었으나 계수는 생략하였다. 조정 범위는 출원이 보유한 클래스마다 최소 1개 기호를 차감한 유형 최소치 조정 CPC 범위(breadth_adj)를, 동일 제목 중복 제거는 같은 제목의 출원 가운데 가장 이른 1건만 남긴 표본을, 좁은 제조공정 정의는 H01L21의 패키징 단계 공정 기호를 제조공정으로 세지 않은 변수를, 무관 용법 제외는 부록 B의 68건을 뺀 표본을,</w:t>
+      </w:r>
+      <w:r>
+        <w:t xml:space="preserve"> </w:t>
+      </w:r>
+      <w:r>
+        <w:rPr>
+          <w:i/>
+          <w:iCs/>
+        </w:rPr>
+        <w:t xml:space="preserve">hybrid bonding</w:t>
+      </w:r>
+      <w:r>
+        <w:t xml:space="preserve"> </w:t>
+      </w:r>
+      <w:r>
+        <w:t xml:space="preserve">표본은 제목에</w:t>
+      </w:r>
+      <w:r>
+        <w:t xml:space="preserve"> </w:t>
+      </w:r>
+      <w:r>
+        <w:rPr>
+          <w:i/>
+          <w:iCs/>
+        </w:rPr>
+        <w:t xml:space="preserve">hybrid bonding</w:t>
+      </w:r>
+      <w:r>
+        <w:t xml:space="preserve">이 들어 있는 출원만 남긴 표본을 뜻한다. 2010년 이후 표본은 본문 제5.2절에서 언급한 것이다.</w:t>
       </w:r>
     </w:p>
     <w:p>
@@ -11825,9 +11983,9 @@
         <w:gridCol w:w="1137"/>
         <w:gridCol w:w="1137"/>
         <w:gridCol w:w="1137"/>
-        <w:gridCol w:w="1143"/>
+        <w:gridCol w:w="1142"/>
         <w:gridCol w:w="1137"/>
-        <w:gridCol w:w="1137"/>
+        <w:gridCol w:w="1138"/>
         <w:gridCol w:w="1137"/>
       </w:tblGrid>
       <w:tr>
@@ -11921,7 +12079,7 @@
         </w:tc>
         <w:tc>
           <w:tcPr>
-            <w:tcW w:type="dxa" w:w="1143"/>
+            <w:tcW w:type="dxa" w:w="1142"/>
             <w:tcBorders>
               <w:bottom w:val="single" w:sz="4" w:space="0" w:color="000000"/>
             </w:tcBorders>
@@ -11967,7 +12125,7 @@
         </w:tc>
         <w:tc>
           <w:tcPr>
-            <w:tcW w:type="dxa" w:w="1137"/>
+            <w:tcW w:type="dxa" w:w="1138"/>
             <w:tcBorders>
               <w:bottom w:val="single" w:sz="4" w:space="0" w:color="000000"/>
             </w:tcBorders>
@@ -11981,10 +12139,26 @@
             </w:pPr>
             <w:r>
               <w:rPr>
-                <w:sz w:val="13"/>
-                <w:szCs w:val="13"/>
-              </w:rPr>
-              <w:t xml:space="preserve">핵심 표본</w:t>
+                <w:i/>
+                <w:iCs/>
+                <w:sz w:val="13"/>
+                <w:szCs w:val="13"/>
+              </w:rPr>
+              <w:t xml:space="preserve">hybrid bonding</w:t>
+            </w:r>
+            <w:r>
+              <w:rPr>
+                <w:sz w:val="13"/>
+                <w:szCs w:val="13"/>
+              </w:rPr>
+              <w:t xml:space="preserve"> </w:t>
+            </w:r>
+            <w:r>
+              <w:rPr>
+                <w:sz w:val="13"/>
+                <w:szCs w:val="13"/>
+              </w:rPr>
+              <w:t xml:space="preserve">표본</w:t>
             </w:r>
           </w:p>
         </w:tc>
@@ -12097,7 +12271,7 @@
         </w:tc>
         <w:tc>
           <w:tcPr>
-            <w:tcW w:type="dxa" w:w="1143"/>
+            <w:tcW w:type="dxa" w:w="1142"/>
           </w:tcPr>
           <w:p>
             <w:pPr>
@@ -12137,7 +12311,7 @@
         </w:tc>
         <w:tc>
           <w:tcPr>
-            <w:tcW w:type="dxa" w:w="1137"/>
+            <w:tcW w:type="dxa" w:w="1138"/>
           </w:tcPr>
           <w:p>
             <w:pPr>
@@ -12261,7 +12435,7 @@
         </w:tc>
         <w:tc>
           <w:tcPr>
-            <w:tcW w:type="dxa" w:w="1143"/>
+            <w:tcW w:type="dxa" w:w="1142"/>
           </w:tcPr>
           <w:p>
             <w:pPr>
@@ -12301,7 +12475,7 @@
         </w:tc>
         <w:tc>
           <w:tcPr>
-            <w:tcW w:type="dxa" w:w="1137"/>
+            <w:tcW w:type="dxa" w:w="1138"/>
           </w:tcPr>
           <w:p>
             <w:pPr>
@@ -12425,7 +12599,7 @@
         </w:tc>
         <w:tc>
           <w:tcPr>
-            <w:tcW w:type="dxa" w:w="1143"/>
+            <w:tcW w:type="dxa" w:w="1142"/>
           </w:tcPr>
           <w:p>
             <w:pPr>
@@ -12465,7 +12639,7 @@
         </w:tc>
         <w:tc>
           <w:tcPr>
-            <w:tcW w:type="dxa" w:w="1137"/>
+            <w:tcW w:type="dxa" w:w="1138"/>
           </w:tcPr>
           <w:p>
             <w:pPr>
@@ -12589,7 +12763,7 @@
         </w:tc>
         <w:tc>
           <w:tcPr>
-            <w:tcW w:type="dxa" w:w="1143"/>
+            <w:tcW w:type="dxa" w:w="1142"/>
           </w:tcPr>
           <w:p>
             <w:pPr>
@@ -12629,7 +12803,7 @@
         </w:tc>
         <w:tc>
           <w:tcPr>
-            <w:tcW w:type="dxa" w:w="1137"/>
+            <w:tcW w:type="dxa" w:w="1138"/>
           </w:tcPr>
           <w:p>
             <w:pPr>
@@ -12690,7 +12864,7 @@
     <w:tbl>
       <w:tblPr>
         <w:tblStyle w:val="Table"/>
-        <w:tblW w:type="dxa" w:w="9073"/>
+        <w:tblW w:type="dxa" w:w="9071"/>
         <w:tblLayout w:type="fixed"/>
         <w:tblLook w:firstRow="1" w:lastRow="0" w:firstColumn="0" w:lastColumn="0" w:noHBand="0" w:noVBand="0" w:val="0020"/>
         <w:tblCellMar>
@@ -12710,13 +12884,13 @@
       </w:tblPr>
       <w:tblGrid>
         <w:gridCol w:w="1106"/>
-        <w:gridCol w:w="1157"/>
-        <w:gridCol w:w="1157"/>
-        <w:gridCol w:w="1157"/>
-        <w:gridCol w:w="1162"/>
-        <w:gridCol w:w="1157"/>
-        <w:gridCol w:w="1020"/>
-        <w:gridCol w:w="1157"/>
+        <w:gridCol w:w="1156"/>
+        <w:gridCol w:w="1156"/>
+        <w:gridCol w:w="1156"/>
+        <w:gridCol w:w="1161"/>
+        <w:gridCol w:w="1156"/>
+        <w:gridCol w:w="1024"/>
+        <w:gridCol w:w="1156"/>
       </w:tblGrid>
       <w:tr>
         <w:trPr>
@@ -12740,7 +12914,7 @@
         </w:tc>
         <w:tc>
           <w:tcPr>
-            <w:tcW w:type="dxa" w:w="1157"/>
+            <w:tcW w:type="dxa" w:w="1156"/>
             <w:tcBorders>
               <w:bottom w:val="single" w:sz="4" w:space="0" w:color="000000"/>
             </w:tcBorders>
@@ -12763,7 +12937,7 @@
         </w:tc>
         <w:tc>
           <w:tcPr>
-            <w:tcW w:type="dxa" w:w="1157"/>
+            <w:tcW w:type="dxa" w:w="1156"/>
             <w:tcBorders>
               <w:bottom w:val="single" w:sz="4" w:space="0" w:color="000000"/>
             </w:tcBorders>
@@ -12786,7 +12960,7 @@
         </w:tc>
         <w:tc>
           <w:tcPr>
-            <w:tcW w:type="dxa" w:w="1157"/>
+            <w:tcW w:type="dxa" w:w="1156"/>
             <w:tcBorders>
               <w:bottom w:val="single" w:sz="4" w:space="0" w:color="000000"/>
             </w:tcBorders>
@@ -12809,7 +12983,7 @@
         </w:tc>
         <w:tc>
           <w:tcPr>
-            <w:tcW w:type="dxa" w:w="1162"/>
+            <w:tcW w:type="dxa" w:w="1161"/>
             <w:tcBorders>
               <w:bottom w:val="single" w:sz="4" w:space="0" w:color="000000"/>
             </w:tcBorders>
@@ -12832,7 +13006,7 @@
         </w:tc>
         <w:tc>
           <w:tcPr>
-            <w:tcW w:type="dxa" w:w="1157"/>
+            <w:tcW w:type="dxa" w:w="1156"/>
             <w:tcBorders>
               <w:bottom w:val="single" w:sz="4" w:space="0" w:color="000000"/>
             </w:tcBorders>
@@ -12855,7 +13029,7 @@
         </w:tc>
         <w:tc>
           <w:tcPr>
-            <w:tcW w:type="dxa" w:w="1020"/>
+            <w:tcW w:type="dxa" w:w="1024"/>
             <w:tcBorders>
               <w:bottom w:val="single" w:sz="4" w:space="0" w:color="000000"/>
             </w:tcBorders>
@@ -12869,16 +13043,32 @@
             </w:pPr>
             <w:r>
               <w:rPr>
-                <w:sz w:val="13"/>
-                <w:szCs w:val="13"/>
-              </w:rPr>
-              <w:t xml:space="preserve">핵심 표본</w:t>
-            </w:r>
-          </w:p>
-        </w:tc>
-        <w:tc>
-          <w:tcPr>
-            <w:tcW w:type="dxa" w:w="1157"/>
+                <w:i/>
+                <w:iCs/>
+                <w:sz w:val="13"/>
+                <w:szCs w:val="13"/>
+              </w:rPr>
+              <w:t xml:space="preserve">hybrid bonding</w:t>
+            </w:r>
+            <w:r>
+              <w:rPr>
+                <w:sz w:val="13"/>
+                <w:szCs w:val="13"/>
+              </w:rPr>
+              <w:t xml:space="preserve"> </w:t>
+            </w:r>
+            <w:r>
+              <w:rPr>
+                <w:sz w:val="13"/>
+                <w:szCs w:val="13"/>
+              </w:rPr>
+              <w:t xml:space="preserve">표본</w:t>
+            </w:r>
+          </w:p>
+        </w:tc>
+        <w:tc>
+          <w:tcPr>
+            <w:tcW w:type="dxa" w:w="1156"/>
             <w:tcBorders>
               <w:bottom w:val="single" w:sz="4" w:space="0" w:color="000000"/>
             </w:tcBorders>
@@ -12925,7 +13115,7 @@
         </w:tc>
         <w:tc>
           <w:tcPr>
-            <w:tcW w:type="dxa" w:w="1157"/>
+            <w:tcW w:type="dxa" w:w="1156"/>
           </w:tcPr>
           <w:p>
             <w:pPr>
@@ -12945,7 +13135,7 @@
         </w:tc>
         <w:tc>
           <w:tcPr>
-            <w:tcW w:type="dxa" w:w="1157"/>
+            <w:tcW w:type="dxa" w:w="1156"/>
           </w:tcPr>
           <w:p>
             <w:pPr>
@@ -12965,7 +13155,7 @@
         </w:tc>
         <w:tc>
           <w:tcPr>
-            <w:tcW w:type="dxa" w:w="1157"/>
+            <w:tcW w:type="dxa" w:w="1156"/>
           </w:tcPr>
           <w:p>
             <w:pPr>
@@ -12985,7 +13175,7 @@
         </w:tc>
         <w:tc>
           <w:tcPr>
-            <w:tcW w:type="dxa" w:w="1162"/>
+            <w:tcW w:type="dxa" w:w="1161"/>
           </w:tcPr>
           <w:p>
             <w:pPr>
@@ -13005,7 +13195,7 @@
         </w:tc>
         <w:tc>
           <w:tcPr>
-            <w:tcW w:type="dxa" w:w="1157"/>
+            <w:tcW w:type="dxa" w:w="1156"/>
           </w:tcPr>
           <w:p>
             <w:pPr>
@@ -13025,7 +13215,7 @@
         </w:tc>
         <w:tc>
           <w:tcPr>
-            <w:tcW w:type="dxa" w:w="1020"/>
+            <w:tcW w:type="dxa" w:w="1024"/>
           </w:tcPr>
           <w:p>
             <w:pPr>
@@ -13045,7 +13235,7 @@
         </w:tc>
         <w:tc>
           <w:tcPr>
-            <w:tcW w:type="dxa" w:w="1157"/>
+            <w:tcW w:type="dxa" w:w="1156"/>
           </w:tcPr>
           <w:p>
             <w:pPr>
@@ -13089,7 +13279,7 @@
         </w:tc>
         <w:tc>
           <w:tcPr>
-            <w:tcW w:type="dxa" w:w="1157"/>
+            <w:tcW w:type="dxa" w:w="1156"/>
           </w:tcPr>
           <w:p>
             <w:pPr>
@@ -13109,7 +13299,7 @@
         </w:tc>
         <w:tc>
           <w:tcPr>
-            <w:tcW w:type="dxa" w:w="1157"/>
+            <w:tcW w:type="dxa" w:w="1156"/>
           </w:tcPr>
           <w:p>
             <w:pPr>
@@ -13129,7 +13319,7 @@
         </w:tc>
         <w:tc>
           <w:tcPr>
-            <w:tcW w:type="dxa" w:w="1157"/>
+            <w:tcW w:type="dxa" w:w="1156"/>
           </w:tcPr>
           <w:p>
             <w:pPr>
@@ -13149,7 +13339,7 @@
         </w:tc>
         <w:tc>
           <w:tcPr>
-            <w:tcW w:type="dxa" w:w="1162"/>
+            <w:tcW w:type="dxa" w:w="1161"/>
           </w:tcPr>
           <w:p>
             <w:pPr>
@@ -13169,7 +13359,7 @@
         </w:tc>
         <w:tc>
           <w:tcPr>
-            <w:tcW w:type="dxa" w:w="1157"/>
+            <w:tcW w:type="dxa" w:w="1156"/>
           </w:tcPr>
           <w:p>
             <w:pPr>
@@ -13189,7 +13379,7 @@
         </w:tc>
         <w:tc>
           <w:tcPr>
-            <w:tcW w:type="dxa" w:w="1020"/>
+            <w:tcW w:type="dxa" w:w="1024"/>
           </w:tcPr>
           <w:p>
             <w:pPr>
@@ -13209,7 +13399,7 @@
         </w:tc>
         <w:tc>
           <w:tcPr>
-            <w:tcW w:type="dxa" w:w="1157"/>
+            <w:tcW w:type="dxa" w:w="1156"/>
           </w:tcPr>
           <w:p>
             <w:pPr>
@@ -13253,7 +13443,7 @@
         </w:tc>
         <w:tc>
           <w:tcPr>
-            <w:tcW w:type="dxa" w:w="1157"/>
+            <w:tcW w:type="dxa" w:w="1156"/>
           </w:tcPr>
           <w:p>
             <w:pPr>
@@ -13273,7 +13463,7 @@
         </w:tc>
         <w:tc>
           <w:tcPr>
-            <w:tcW w:type="dxa" w:w="1157"/>
+            <w:tcW w:type="dxa" w:w="1156"/>
           </w:tcPr>
           <w:p>
             <w:pPr>
@@ -13293,7 +13483,7 @@
         </w:tc>
         <w:tc>
           <w:tcPr>
-            <w:tcW w:type="dxa" w:w="1157"/>
+            <w:tcW w:type="dxa" w:w="1156"/>
           </w:tcPr>
           <w:p>
             <w:pPr>
@@ -13313,7 +13503,7 @@
         </w:tc>
         <w:tc>
           <w:tcPr>
-            <w:tcW w:type="dxa" w:w="1162"/>
+            <w:tcW w:type="dxa" w:w="1161"/>
           </w:tcPr>
           <w:p>
             <w:pPr>
@@ -13333,7 +13523,7 @@
         </w:tc>
         <w:tc>
           <w:tcPr>
-            <w:tcW w:type="dxa" w:w="1157"/>
+            <w:tcW w:type="dxa" w:w="1156"/>
           </w:tcPr>
           <w:p>
             <w:pPr>
@@ -13353,7 +13543,7 @@
         </w:tc>
         <w:tc>
           <w:tcPr>
-            <w:tcW w:type="dxa" w:w="1020"/>
+            <w:tcW w:type="dxa" w:w="1024"/>
           </w:tcPr>
           <w:p>
             <w:pPr>
@@ -13373,7 +13563,7 @@
         </w:tc>
         <w:tc>
           <w:tcPr>
-            <w:tcW w:type="dxa" w:w="1157"/>
+            <w:tcW w:type="dxa" w:w="1156"/>
           </w:tcPr>
           <w:p>
             <w:pPr>
@@ -13417,7 +13607,7 @@
         </w:tc>
         <w:tc>
           <w:tcPr>
-            <w:tcW w:type="dxa" w:w="1157"/>
+            <w:tcW w:type="dxa" w:w="1156"/>
           </w:tcPr>
           <w:p>
             <w:pPr>
@@ -13437,7 +13627,7 @@
         </w:tc>
         <w:tc>
           <w:tcPr>
-            <w:tcW w:type="dxa" w:w="1157"/>
+            <w:tcW w:type="dxa" w:w="1156"/>
           </w:tcPr>
           <w:p>
             <w:pPr>
@@ -13457,7 +13647,7 @@
         </w:tc>
         <w:tc>
           <w:tcPr>
-            <w:tcW w:type="dxa" w:w="1157"/>
+            <w:tcW w:type="dxa" w:w="1156"/>
           </w:tcPr>
           <w:p>
             <w:pPr>
@@ -13477,7 +13667,7 @@
         </w:tc>
         <w:tc>
           <w:tcPr>
-            <w:tcW w:type="dxa" w:w="1162"/>
+            <w:tcW w:type="dxa" w:w="1161"/>
           </w:tcPr>
           <w:p>
             <w:pPr>
@@ -13497,7 +13687,7 @@
         </w:tc>
         <w:tc>
           <w:tcPr>
-            <w:tcW w:type="dxa" w:w="1157"/>
+            <w:tcW w:type="dxa" w:w="1156"/>
           </w:tcPr>
           <w:p>
             <w:pPr>
@@ -13517,7 +13707,7 @@
         </w:tc>
         <w:tc>
           <w:tcPr>
-            <w:tcW w:type="dxa" w:w="1020"/>
+            <w:tcW w:type="dxa" w:w="1024"/>
           </w:tcPr>
           <w:p>
             <w:pPr>
@@ -13537,7 +13727,7 @@
         </w:tc>
         <w:tc>
           <w:tcPr>
-            <w:tcW w:type="dxa" w:w="1157"/>
+            <w:tcW w:type="dxa" w:w="1156"/>
           </w:tcPr>
           <w:p>
             <w:pPr>
@@ -13572,7 +13762,7 @@
         <w:t xml:space="preserve"> </w:t>
       </w:r>
       <w:r>
-        <w:t xml:space="preserve">IIA 가정과 관련된 민감성을 간접적으로 살피기 위해 공정 단독형을 제외한 표본(N = 763)에서 통합형 대 접합 단독형의 이항 로짓을 추정하였다. 기술범위 OR 1.463, 출원연도 0.987로, 주요 계수의 방향과 상대적 크기는 다항 로짓 통합형 방정식의 값(1.403, 0.993)과 유사했다. 이는 공정 단독형을 제외해도 통합형 관련 결과의 실질적 해석이 크게 달라지지 않음을 보여주는 민감도 분석이며, 정식 IIA 검정(Hausman–McFadden, Small–Hsiao)을 대체하지는 않는다. 본문의 핵심 기술 모형(H3)도 같은 표본을 쓴다.</w:t>
+        <w:t xml:space="preserve">IIA 가정과 관련된 민감성을 간접적으로 살피기 위해 공정 단독형을 제외한 표본(N = 763)에서 통합형 대 접합 단독형의 이항 로짓을 추정하였다. 기술범위의 승산비는 1.463, 출원연도는 0.987로, 주요 계수의 방향과 상대적 크기는 다항 로짓 통합형 방정식의 값(1.403, 0.993)과 유사했다. 이는 공정 단독형을 제외해도 통합형 관련 결과의 실질적 해석이 크게 달라지지 않음을 보여주는 민감도 분석이며, 정식 IIA 검정(Hausman–McFadden, Small–Hsiao)을 대체하지는 않는다. 본문의 핵심 기술 모형(H3)도 같은 표본을 쓴다.</w:t>
       </w:r>
     </w:p>
     <w:bookmarkEnd w:id="57"/>
@@ -13590,7 +13780,7 @@
         <w:pStyle w:val="FirstParagraph"/>
       </w:pPr>
       <w:r>
-        <w:t xml:space="preserve">키워드 필터의</w:t>
+        <w:t xml:space="preserve">키워드 필터의 검색어는 하이브리드 본딩과 무관한 뜻으로도 쓰인다. 대부분은</w:t>
       </w:r>
       <w:r>
         <w:t xml:space="preserve"> </w:t>
@@ -13603,7 +13793,49 @@
         <w:t xml:space="preserve">direct bonding</w:t>
       </w:r>
       <w:r>
-        <w:t xml:space="preserve">은 하이브리드 본딩과 무관한 뜻으로도 쓰인다. 제목에 다음 용어가 들어 있는 출원을 무관한 용법으로 판정하였다: 세라믹·DBC(direct bonded copper)·알루미나·지르코니아·질화알루미늄 기판, 구리 합금, 다이아몬드–몰리브덴 접합, 레이저 전구체, 정전 척, 전력 모듈·전력소자 기판, 히트 스프레더, 직접 접합 금속 기판, 직접 접합 회로 조립체, sp3–sp2 하이브리드 결합(화학 결합의 뜻). 해당 출원은 68건이며 표 B1에 분포를 보인다. 2010년 이전 출원 가운데 무관 용법을 뺀 뒤 남는 출원의 상당수는 실리콘 웨이퍼 직접 접합(SOI 웨이퍼 제조 등) 출원으로, 하이브리드 본딩의 유전체 접합을 이루는 전구 기술이므로 표본에 남겼다. 68건의 제목 목록은 저자에게 요청하면 제공한다.</w:t>
+        <w:t xml:space="preserve">이 다른 뜻으로 쓰인 경우이고, 일부는 화학 결합이나 전력 모듈용 접합 시트를 뜻하는</w:t>
+      </w:r>
+      <w:r>
+        <w:t xml:space="preserve"> </w:t>
+      </w:r>
+      <w:r>
+        <w:rPr>
+          <w:i/>
+          <w:iCs/>
+        </w:rPr>
+        <w:t xml:space="preserve">hybrid bonding</w:t>
+      </w:r>
+      <w:r>
+        <w:t xml:space="preserve">이다. 제목에 다음 용어가 들어 있는 출원을 무관한 용법으로 판정하였다: 세라믹·DBC(direct bonded copper)·알루미나·지르코니아·질화알루미늄 기판, 구리 합금, 다이아몬드–몰리브덴 접합, 레이저 전구체, 정전 척, 전력 모듈·전력소자 기판, 히트 스프레더, 직접 접합 금속 기판, 직접 접합 회로 조립체, sp3–sp2 하이브리드 결합(화학 결합의 뜻). 해당 출원은 68건(</w:t>
+      </w:r>
+      <w:r>
+        <w:rPr>
+          <w:i/>
+          <w:iCs/>
+        </w:rPr>
+        <w:t xml:space="preserve">direct bonding</w:t>
+      </w:r>
+      <w:r>
+        <w:t xml:space="preserve"> </w:t>
+      </w:r>
+      <w:r>
+        <w:t xml:space="preserve">63건,</w:t>
+      </w:r>
+      <w:r>
+        <w:t xml:space="preserve"> </w:t>
+      </w:r>
+      <w:r>
+        <w:rPr>
+          <w:i/>
+          <w:iCs/>
+        </w:rPr>
+        <w:t xml:space="preserve">hybrid bonding</w:t>
+      </w:r>
+      <w:r>
+        <w:t xml:space="preserve"> </w:t>
+      </w:r>
+      <w:r>
+        <w:t xml:space="preserve">5건)이며 표 B1에 분포를 보인다. 2010년 이전 출원 가운데 무관 용법을 뺀 뒤 남는 출원의 상당수는 실리콘 웨이퍼 직접 접합(SOI 웨이퍼 제조 등) 출원으로, 하이브리드 본딩의 유전체 접합을 이루는 전구 기술이므로 표본에 남겼다. 68건의 제목 목록은 저자에게 요청하면 제공한다.</w:t>
       </w:r>
     </w:p>
     <w:p>

</xml_diff>